<commit_message>
Precisar el estado del BPMN AS-IS en el informe
El diagrama AS-IS ya esta incrustado en el documento de analisis del equipo,
de modo que el entregable esta cubierto; lo unico pendiente es exportar su
PNG al repositorio. Deja de figurar como faltante.
</commit_message>
<xml_diff>
--- a/docs/INFORME_AYD.docx
+++ b/docs/INFORME_AYD.docx
@@ -3515,20 +3515,16 @@
     </w:p>
     <w:p>
       <w:pPr>
-        <w:pStyle w:val="BlockText"/>
-      </w:pPr>
-      <w:r>
-        <w:rPr>
-          <w:bCs/>
-          <w:b/>
-        </w:rPr>
-        <w:t xml:space="preserve">FALTA — render del AS-IS.</w:t>
-      </w:r>
-      <w:r>
-        <w:t xml:space="preserve"> </w:t>
-      </w:r>
-      <w:r>
-        <w:t xml:space="preserve">El diagrama AS-IS existe únicamente como fuente</w:t>
+        <w:pStyle w:val="BodyText"/>
+      </w:pPr>
+      <w:r>
+        <w:t xml:space="preserve">El diagrama AS-IS está incrustado en el documento de análisis del equipo y su fuente</w:t>
+      </w:r>
+      <w:r>
+        <w:t xml:space="preserve"> </w:t>
+      </w:r>
+      <w:r>
+        <w:t xml:space="preserve">editable es</w:t>
       </w:r>
       <w:r>
         <w:t xml:space="preserve"> </w:t>
@@ -3537,16 +3533,22 @@
         <w:rPr>
           <w:rStyle w:val="VerbatimChar"/>
         </w:rPr>
-        <w:t xml:space="preserve">.drawio</w:t>
-      </w:r>
-      <w:r>
-        <w:t xml:space="preserve">; a diferencia del TO-BE, no tiene imagen exportada en el repositorio.</w:t>
-      </w:r>
-      <w:r>
-        <w:t xml:space="preserve"> </w:t>
-      </w:r>
-      <w:r>
-        <w:t xml:space="preserve">Se exporta desde el mismo archivo.</w:t>
+        <w:t xml:space="preserve">docs/bpmn/PROCESO_AS_IS.drawio</w:t>
+      </w:r>
+      <w:r>
+        <w:t xml:space="preserve">. A diferencia del TO-BE, no tiene aún una</w:t>
+      </w:r>
+      <w:r>
+        <w:t xml:space="preserve"> </w:t>
+      </w:r>
+      <w:r>
+        <w:t xml:space="preserve">imagen exportada en el repositorio; se exporta desde el mismo archivo cuando se</w:t>
+      </w:r>
+      <w:r>
+        <w:t xml:space="preserve"> </w:t>
+      </w:r>
+      <w:r>
+        <w:t xml:space="preserve">requiera fuera del documento.</w:t>
       </w:r>
     </w:p>
     <w:p>

</xml_diff>

<commit_message>
Precisar la inconsistencia del AS-IS en la nota del equipo
Verificado abriendo el ODT: el diagrama terminado esta incrustado en el
paragrafo 3 del documento de analisis, con cinco carriles y el flujo completo.
La nota lo describe ahora con ese detalle, en vez de apoyarse solo en el
archivo del repositorio.
</commit_message>
<xml_diff>
--- a/docs/INFORME_AYD.docx
+++ b/docs/INFORME_AYD.docx
@@ -763,13 +763,13 @@
         <w:t xml:space="preserve"> </w:t>
       </w:r>
       <w:r>
-        <w:t xml:space="preserve">— está incrustado en el documento de análisis y su</w:t>
-      </w:r>
-      <w:r>
-        <w:t xml:space="preserve"> </w:t>
-      </w:r>
-      <w:r>
-        <w:t xml:space="preserve">fuente editable está en</w:t>
+        <w:t xml:space="preserve">— el diagrama terminado está incrustado en §3 del</w:t>
+      </w:r>
+      <w:r>
+        <w:t xml:space="preserve"> </w:t>
+      </w:r>
+      <w:r>
+        <w:t xml:space="preserve">documento de análisis, y su fuente editable está en</w:t>
       </w:r>
       <w:r>
         <w:t xml:space="preserve"> </w:t>
@@ -781,13 +781,13 @@
         <w:t xml:space="preserve">docs/bpmn/PROCESO_AS_IS.drawio</w:t>
       </w:r>
       <w:r>
-        <w:t xml:space="preserve">. Lo único pendiente es exportar</w:t>
-      </w:r>
-      <w:r>
-        <w:t xml:space="preserve"> </w:t>
-      </w:r>
-      <w:r>
-        <w:t xml:space="preserve">su PNG al repositorio, como ya lo tiene el TO-BE.</w:t>
+        <w:t xml:space="preserve">. Lo</w:t>
+      </w:r>
+      <w:r>
+        <w:t xml:space="preserve"> </w:t>
+      </w:r>
+      <w:r>
+        <w:t xml:space="preserve">único pendiente es exportar su PNG al repositorio, como ya lo tiene el TO-BE.</w:t>
       </w:r>
     </w:p>
     <w:p>
@@ -974,16 +974,42 @@
           <w:bCs/>
           <w:b/>
         </w:rPr>
-        <w:t xml:space="preserve">BPMN AS-IS está «en elaboración»</w:t>
-      </w:r>
-      <w:r>
-        <w:t xml:space="preserve">, cuando ya existe y está incrustado</w:t>
-      </w:r>
-      <w:r>
-        <w:t xml:space="preserve"> </w:t>
-      </w:r>
-      <w:r>
-        <w:t xml:space="preserve">en §3 de ese mismo documento.</w:t>
+        <w:t xml:space="preserve">BPMN AS-IS está «en elaboración por otro integrante del equipo;</w:t>
+      </w:r>
+      <w:r>
+        <w:rPr>
+          <w:bCs/>
+          <w:b/>
+        </w:rPr>
+        <w:t xml:space="preserve"> </w:t>
+      </w:r>
+      <w:r>
+        <w:rPr>
+          <w:bCs/>
+          <w:b/>
+        </w:rPr>
+        <w:t xml:space="preserve">pendiente de consolidar»</w:t>
+      </w:r>
+      <w:r>
+        <w:t xml:space="preserve">, cuando el diagrama terminado está incrustado en §3 de ese</w:t>
+      </w:r>
+      <w:r>
+        <w:t xml:space="preserve"> </w:t>
+      </w:r>
+      <w:r>
+        <w:t xml:space="preserve">mismo documento: cinco carriles (proveedor, inventario, trabajador, maestro, gerente)</w:t>
+      </w:r>
+      <w:r>
+        <w:t xml:space="preserve"> </w:t>
+      </w:r>
+      <w:r>
+        <w:t xml:space="preserve">con el flujo completo, incluidas la solicitud verbal, el reporte por WhatsApp y la</w:t>
+      </w:r>
+      <w:r>
+        <w:t xml:space="preserve"> </w:t>
+      </w:r>
+      <w:r>
+        <w:t xml:space="preserve">consolidación en Excel.</w:t>
       </w:r>
     </w:p>
     <w:p>

</xml_diff>

<commit_message>
Actualizar la nota del equipo tras corregir el documento de analisis
Las tres inconsistencias del paragrafo 12.1 ya estan corregidas en el
documento compartido, de modo que la nota deja de pedirlas y solo deja
constancia. Queda senalado el unico detalle pendiente ahi: ED1 y ED2 se
muestran como lista numerada en vez de vineta.

Se versiona tambien la nota como archivo propio.
</commit_message>
<xml_diff>
--- a/docs/INFORME_AYD.docx
+++ b/docs/INFORME_AYD.docx
@@ -863,13 +863,13 @@
       </w:r>
     </w:p>
     <w:bookmarkEnd w:id="21"/>
-    <w:bookmarkStart w:id="22" w:name="X4a1479a85cb92c58c1a8ab7ee293357d9e86f7f"/>
+    <w:bookmarkStart w:id="22" w:name="X1b18404492d5bb90836786bf11aaa31deeb4de9"/>
     <w:p>
       <w:pPr>
         <w:pStyle w:val="Heading2"/>
       </w:pPr>
       <w:r>
-        <w:t xml:space="preserve">Tres inconsistencias que conviene corregir en el documento de análisis</w:t>
+        <w:t xml:space="preserve">Coherencia con el documento de análisis — ya corregida</w:t>
       </w:r>
     </w:p>
     <w:p>
@@ -877,7 +877,19 @@
         <w:pStyle w:val="FirstParagraph"/>
       </w:pPr>
       <w:r>
-        <w:t xml:space="preserve">Están las tres en</w:t>
+        <w:t xml:space="preserve">El §12.1 del documento compartido había quedado desactualizado frente al resto: daba por</w:t>
+      </w:r>
+      <w:r>
+        <w:t xml:space="preserve"> </w:t>
+      </w:r>
+      <w:r>
+        <w:t xml:space="preserve">pendientes el BPMN AS-IS y la consolidación de requerimientos, y contaba diez reglas de</w:t>
+      </w:r>
+      <w:r>
+        <w:t xml:space="preserve"> </w:t>
+      </w:r>
+      <w:r>
+        <w:t xml:space="preserve">negocio cuando el §6.3 ya presenta catorce.</w:t>
       </w:r>
       <w:r>
         <w:t xml:space="preserve"> </w:t>
@@ -887,25 +899,59 @@
           <w:bCs/>
           <w:b/>
         </w:rPr>
-        <w:t xml:space="preserve">§12.1</w:t>
-      </w:r>
-      <w:r>
-        <w:t xml:space="preserve"> </w:t>
-      </w:r>
-      <w:r>
-        <w:t xml:space="preserve">del documento compartido, que quedó desactualizado frente al</w:t>
-      </w:r>
-      <w:r>
-        <w:t xml:space="preserve"> </w:t>
-      </w:r>
-      <w:r>
-        <w:t xml:space="preserve">resto. Como los profesores revisan la coherencia entre documentos, vale la pena</w:t>
-      </w:r>
-      <w:r>
-        <w:t xml:space="preserve"> </w:t>
-      </w:r>
-      <w:r>
-        <w:t xml:space="preserve">arreglarlas antes de subir:</w:t>
+        <w:t xml:space="preserve">Las tres ya están corregidas</w:t>
+      </w:r>
+      <w:r>
+        <w:t xml:space="preserve"> </w:t>
+      </w:r>
+      <w:r>
+        <w:t xml:space="preserve">en el</w:t>
+      </w:r>
+      <w:r>
+        <w:t xml:space="preserve"> </w:t>
+      </w:r>
+      <w:r>
+        <w:t xml:space="preserve">documento de Drive, de modo que el informe y el documento de análisis dicen lo mismo.</w:t>
+      </w:r>
+    </w:p>
+    <w:p>
+      <w:pPr>
+        <w:pStyle w:val="BodyText"/>
+      </w:pPr>
+      <w:r>
+        <w:t xml:space="preserve">Queda un detalle cosmético en el árbol del problema del documento compartido: los ítems</w:t>
+      </w:r>
+      <w:r>
+        <w:t xml:space="preserve"> </w:t>
+      </w:r>
+      <w:r>
+        <w:rPr>
+          <w:bCs/>
+          <w:b/>
+        </w:rPr>
+        <w:t xml:space="preserve">ED1 y ED2</w:t>
+      </w:r>
+      <w:r>
+        <w:t xml:space="preserve"> </w:t>
+      </w:r>
+      <w:r>
+        <w:t xml:space="preserve">se muestran como lista numerada en vez de viñeta. Se arregla en Google</w:t>
+      </w:r>
+      <w:r>
+        <w:t xml:space="preserve"> </w:t>
+      </w:r>
+      <w:r>
+        <w:t xml:space="preserve">Docs seleccionando esos dos ítems y aplicando el mismo formato de viñeta de los demás.</w:t>
+      </w:r>
+    </w:p>
+    <w:bookmarkEnd w:id="22"/>
+    <w:bookmarkStart w:id="23" w:name="antes-de-subir"/>
+    <w:p>
+      <w:pPr>
+        <w:pStyle w:val="Heading2"/>
+      </w:pPr>
+      <w:r>
+        <w:t xml:space="preserve">Antes de subir</w:t>
       </w:r>
     </w:p>
     <w:p>
@@ -917,42 +963,22 @@
         <w:pStyle w:val="Compact"/>
       </w:pPr>
       <w:r>
-        <w:t xml:space="preserve">Dice que las reglas de negocio son</w:t>
-      </w:r>
-      <w:r>
-        <w:t xml:space="preserve"> </w:t>
-      </w:r>
-      <w:r>
-        <w:rPr>
-          <w:bCs/>
-          <w:b/>
-        </w:rPr>
-        <w:t xml:space="preserve">RN01–RN10</w:t>
-      </w:r>
-      <w:r>
-        <w:t xml:space="preserve">, pero §6.3 del mismo documento ya</w:t>
-      </w:r>
-      <w:r>
-        <w:t xml:space="preserve"> </w:t>
-      </w:r>
-      <w:r>
-        <w:t xml:space="preserve">presenta</w:t>
-      </w:r>
-      <w:r>
-        <w:t xml:space="preserve"> </w:t>
-      </w:r>
-      <w:r>
-        <w:rPr>
-          <w:bCs/>
-          <w:b/>
-        </w:rPr>
-        <w:t xml:space="preserve">catorce</w:t>
-      </w:r>
-      <w:r>
-        <w:t xml:space="preserve"> </w:t>
-      </w:r>
-      <w:r>
-        <w:t xml:space="preserve">(las 10 del enunciado más RN11–RN14 del equipo).</w:t>
+        <w:t xml:space="preserve">Completar los</w:t>
+      </w:r>
+      <w:r>
+        <w:t xml:space="preserve"> </w:t>
+      </w:r>
+      <w:r>
+        <w:rPr>
+          <w:rStyle w:val="VerbatimChar"/>
+        </w:rPr>
+        <w:t xml:space="preserve">[PENDIENTE]</w:t>
+      </w:r>
+      <w:r>
+        <w:t xml:space="preserve"> </w:t>
+      </w:r>
+      <w:r>
+        <w:t xml:space="preserve">o decidir conscientemente cuáles se entregan sin cubrir.</w:t>
       </w:r>
     </w:p>
     <w:p>
@@ -964,52 +990,7 @@
         <w:pStyle w:val="Compact"/>
       </w:pPr>
       <w:r>
-        <w:t xml:space="preserve">Dice que el</w:t>
-      </w:r>
-      <w:r>
-        <w:t xml:space="preserve"> </w:t>
-      </w:r>
-      <w:r>
-        <w:rPr>
-          <w:bCs/>
-          <w:b/>
-        </w:rPr>
-        <w:t xml:space="preserve">BPMN AS-IS está «en elaboración por otro integrante del equipo;</w:t>
-      </w:r>
-      <w:r>
-        <w:rPr>
-          <w:bCs/>
-          <w:b/>
-        </w:rPr>
-        <w:t xml:space="preserve"> </w:t>
-      </w:r>
-      <w:r>
-        <w:rPr>
-          <w:bCs/>
-          <w:b/>
-        </w:rPr>
-        <w:t xml:space="preserve">pendiente de consolidar»</w:t>
-      </w:r>
-      <w:r>
-        <w:t xml:space="preserve">, cuando el diagrama terminado está incrustado en §3 de ese</w:t>
-      </w:r>
-      <w:r>
-        <w:t xml:space="preserve"> </w:t>
-      </w:r>
-      <w:r>
-        <w:t xml:space="preserve">mismo documento: cinco carriles (proveedor, inventario, trabajador, maestro, gerente)</w:t>
-      </w:r>
-      <w:r>
-        <w:t xml:space="preserve"> </w:t>
-      </w:r>
-      <w:r>
-        <w:t xml:space="preserve">con el flujo completo, incluidas la solicitud verbal, el reporte por WhatsApp y la</w:t>
-      </w:r>
-      <w:r>
-        <w:t xml:space="preserve"> </w:t>
-      </w:r>
-      <w:r>
-        <w:t xml:space="preserve">consolidación en Excel.</w:t>
+        <w:t xml:space="preserve">Llenar la portada: URL, claves y credenciales por rol.</w:t>
       </w:r>
     </w:p>
     <w:p>
@@ -1017,86 +998,6 @@
         <w:numPr>
           <w:ilvl w:val="0"/>
           <w:numId w:val="1001"/>
-        </w:numPr>
-        <w:pStyle w:val="Compact"/>
-      </w:pPr>
-      <w:r>
-        <w:t xml:space="preserve">Dice que los</w:t>
-      </w:r>
-      <w:r>
-        <w:t xml:space="preserve"> </w:t>
-      </w:r>
-      <w:r>
-        <w:rPr>
-          <w:bCs/>
-          <w:b/>
-        </w:rPr>
-        <w:t xml:space="preserve">requerimientos están «pendientes de consolidación formal»</w:t>
-      </w:r>
-      <w:r>
-        <w:t xml:space="preserve">, cuando</w:t>
-      </w:r>
-      <w:r>
-        <w:t xml:space="preserve"> </w:t>
-      </w:r>
-      <w:r>
-        <w:t xml:space="preserve">§6.1–6.4 ya los presentan consolidados.</w:t>
-      </w:r>
-    </w:p>
-    <w:bookmarkEnd w:id="22"/>
-    <w:bookmarkStart w:id="23" w:name="antes-de-subir"/>
-    <w:p>
-      <w:pPr>
-        <w:pStyle w:val="Heading2"/>
-      </w:pPr>
-      <w:r>
-        <w:t xml:space="preserve">Antes de subir</w:t>
-      </w:r>
-    </w:p>
-    <w:p>
-      <w:pPr>
-        <w:numPr>
-          <w:ilvl w:val="0"/>
-          <w:numId w:val="1002"/>
-        </w:numPr>
-        <w:pStyle w:val="Compact"/>
-      </w:pPr>
-      <w:r>
-        <w:t xml:space="preserve">Completar los</w:t>
-      </w:r>
-      <w:r>
-        <w:t xml:space="preserve"> </w:t>
-      </w:r>
-      <w:r>
-        <w:rPr>
-          <w:rStyle w:val="VerbatimChar"/>
-        </w:rPr>
-        <w:t xml:space="preserve">[PENDIENTE]</w:t>
-      </w:r>
-      <w:r>
-        <w:t xml:space="preserve"> </w:t>
-      </w:r>
-      <w:r>
-        <w:t xml:space="preserve">o decidir conscientemente cuáles se entregan sin cubrir.</w:t>
-      </w:r>
-    </w:p>
-    <w:p>
-      <w:pPr>
-        <w:numPr>
-          <w:ilvl w:val="0"/>
-          <w:numId w:val="1002"/>
-        </w:numPr>
-        <w:pStyle w:val="Compact"/>
-      </w:pPr>
-      <w:r>
-        <w:t xml:space="preserve">Llenar la portada: URL, claves y credenciales por rol.</w:t>
-      </w:r>
-    </w:p>
-    <w:p>
-      <w:pPr>
-        <w:numPr>
-          <w:ilvl w:val="0"/>
-          <w:numId w:val="1002"/>
         </w:numPr>
         <w:pStyle w:val="Compact"/>
       </w:pPr>
@@ -1818,7 +1719,7 @@
       <w:pPr>
         <w:numPr>
           <w:ilvl w:val="0"/>
-          <w:numId w:val="1003"/>
+          <w:numId w:val="1002"/>
         </w:numPr>
         <w:pStyle w:val="Compact"/>
       </w:pPr>
@@ -1830,6 +1731,54 @@
       </w:r>
       <w:r>
         <w:t xml:space="preserve">actualmente mediante documentos físicos, hojas de cálculo y llamadas telefónicas.</w:t>
+      </w:r>
+    </w:p>
+    <w:p>
+      <w:pPr>
+        <w:numPr>
+          <w:ilvl w:val="0"/>
+          <w:numId w:val="1002"/>
+        </w:numPr>
+        <w:pStyle w:val="Compact"/>
+      </w:pPr>
+      <w:r>
+        <w:t xml:space="preserve">Los registros son independientes y quedan a cargo de diferentes responsables, sin una</w:t>
+      </w:r>
+      <w:r>
+        <w:t xml:space="preserve"> </w:t>
+      </w:r>
+      <w:r>
+        <w:t xml:space="preserve">herramienta integrada que los centralice.</w:t>
+      </w:r>
+    </w:p>
+    <w:p>
+      <w:pPr>
+        <w:numPr>
+          <w:ilvl w:val="0"/>
+          <w:numId w:val="1002"/>
+        </w:numPr>
+        <w:pStyle w:val="Compact"/>
+      </w:pPr>
+      <w:r>
+        <w:t xml:space="preserve">La ausencia de herramientas integradas dificulta conocer oportunamente el estado real</w:t>
+      </w:r>
+      <w:r>
+        <w:t xml:space="preserve"> </w:t>
+      </w:r>
+      <w:r>
+        <w:t xml:space="preserve">de cada obra.</w:t>
+      </w:r>
+    </w:p>
+    <w:p>
+      <w:pPr>
+        <w:pStyle w:val="FirstParagraph"/>
+      </w:pPr>
+      <w:r>
+        <w:rPr>
+          <w:bCs/>
+          <w:b/>
+        </w:rPr>
+        <w:t xml:space="preserve">Causas indirectas</w:t>
       </w:r>
     </w:p>
     <w:p>
@@ -1841,13 +1790,13 @@
         <w:pStyle w:val="Compact"/>
       </w:pPr>
       <w:r>
-        <w:t xml:space="preserve">Los registros son independientes y quedan a cargo de diferentes responsables, sin una</w:t>
-      </w:r>
-      <w:r>
-        <w:t xml:space="preserve"> </w:t>
-      </w:r>
-      <w:r>
-        <w:t xml:space="preserve">herramienta integrada que los centralice.</w:t>
+        <w:t xml:space="preserve">Los mecanismos manuales presentan limitaciones cuando aumenta el número de proyectos,</w:t>
+      </w:r>
+      <w:r>
+        <w:t xml:space="preserve"> </w:t>
+      </w:r>
+      <w:r>
+        <w:t xml:space="preserve">trabajadores, materiales y transacciones.</w:t>
       </w:r>
     </w:p>
     <w:p>
@@ -1859,13 +1808,19 @@
         <w:pStyle w:val="Compact"/>
       </w:pPr>
       <w:r>
-        <w:t xml:space="preserve">La ausencia de herramientas integradas dificulta conocer oportunamente el estado real</w:t>
-      </w:r>
-      <w:r>
-        <w:t xml:space="preserve"> </w:t>
-      </w:r>
-      <w:r>
-        <w:t xml:space="preserve">de cada obra.</w:t>
+        <w:t xml:space="preserve">La ejecución de proyectos de construcción exige coordinar simultáneamente</w:t>
+      </w:r>
+      <w:r>
+        <w:t xml:space="preserve"> </w:t>
+      </w:r>
+      <w:r>
+        <w:t xml:space="preserve">actividades, recursos humanos, materiales, herramientas, proveedores y servicios</w:t>
+      </w:r>
+      <w:r>
+        <w:t xml:space="preserve"> </w:t>
+      </w:r>
+      <w:r>
+        <w:t xml:space="preserve">especializados.</w:t>
       </w:r>
     </w:p>
     <w:p>
@@ -1877,7 +1832,7 @@
           <w:bCs/>
           <w:b/>
         </w:rPr>
-        <w:t xml:space="preserve">Causas indirectas</w:t>
+        <w:t xml:space="preserve">Efectos directos</w:t>
       </w:r>
     </w:p>
     <w:p>
@@ -1889,13 +1844,7 @@
         <w:pStyle w:val="Compact"/>
       </w:pPr>
       <w:r>
-        <w:t xml:space="preserve">Los mecanismos manuales presentan limitaciones cuando aumenta el número de proyectos,</w:t>
-      </w:r>
-      <w:r>
-        <w:t xml:space="preserve"> </w:t>
-      </w:r>
-      <w:r>
-        <w:t xml:space="preserve">trabajadores, materiales y transacciones.</w:t>
+        <w:t xml:space="preserve">Dispersión de la información relacionada con las obras.</w:t>
       </w:r>
     </w:p>
     <w:p>
@@ -1907,19 +1856,73 @@
         <w:pStyle w:val="Compact"/>
       </w:pPr>
       <w:r>
-        <w:t xml:space="preserve">La ejecución de proyectos de construcción exige coordinar simultáneamente</w:t>
-      </w:r>
-      <w:r>
-        <w:t xml:space="preserve"> </w:t>
-      </w:r>
-      <w:r>
-        <w:t xml:space="preserve">actividades, recursos humanos, materiales, herramientas, proveedores y servicios</w:t>
-      </w:r>
-      <w:r>
-        <w:t xml:space="preserve"> </w:t>
-      </w:r>
-      <w:r>
-        <w:t xml:space="preserve">especializados.</w:t>
+        <w:t xml:space="preserve">Dificultad para determinar el consumo real de materiales por proyecto.</w:t>
+      </w:r>
+    </w:p>
+    <w:p>
+      <w:pPr>
+        <w:numPr>
+          <w:ilvl w:val="0"/>
+          <w:numId w:val="1004"/>
+        </w:numPr>
+        <w:pStyle w:val="Compact"/>
+      </w:pPr>
+      <w:r>
+        <w:t xml:space="preserve">Ausencia de trazabilidad sobre entradas, salidas, devoluciones y traslados de</w:t>
+      </w:r>
+      <w:r>
+        <w:t xml:space="preserve"> </w:t>
+      </w:r>
+      <w:r>
+        <w:t xml:space="preserve">materiales.</w:t>
+      </w:r>
+    </w:p>
+    <w:p>
+      <w:pPr>
+        <w:numPr>
+          <w:ilvl w:val="0"/>
+          <w:numId w:val="1004"/>
+        </w:numPr>
+        <w:pStyle w:val="Compact"/>
+      </w:pPr>
+      <w:r>
+        <w:t xml:space="preserve">Dificultad para determinar quién tiene asignada una herramienta determinada.</w:t>
+      </w:r>
+    </w:p>
+    <w:p>
+      <w:pPr>
+        <w:numPr>
+          <w:ilvl w:val="0"/>
+          <w:numId w:val="1004"/>
+        </w:numPr>
+        <w:pStyle w:val="Compact"/>
+      </w:pPr>
+      <w:r>
+        <w:t xml:space="preserve">Información histórica limitada sobre responsables y actividades ejecutadas.</w:t>
+      </w:r>
+    </w:p>
+    <w:p>
+      <w:pPr>
+        <w:numPr>
+          <w:ilvl w:val="0"/>
+          <w:numId w:val="1004"/>
+        </w:numPr>
+        <w:pStyle w:val="Compact"/>
+      </w:pPr>
+      <w:r>
+        <w:t xml:space="preserve">Poca integración entre el avance de obra y la utilización de recursos.</w:t>
+      </w:r>
+    </w:p>
+    <w:p>
+      <w:pPr>
+        <w:numPr>
+          <w:ilvl w:val="0"/>
+          <w:numId w:val="1004"/>
+        </w:numPr>
+        <w:pStyle w:val="Compact"/>
+      </w:pPr>
+      <w:r>
+        <w:t xml:space="preserve">Dificultad para consultar los servicios externos contratados y sus responsables.</w:t>
       </w:r>
     </w:p>
     <w:p>
@@ -1931,7 +1934,7 @@
           <w:bCs/>
           <w:b/>
         </w:rPr>
-        <w:t xml:space="preserve">Efectos directos</w:t>
+        <w:t xml:space="preserve">Efectos indirectos</w:t>
       </w:r>
     </w:p>
     <w:p>
@@ -1943,7 +1946,7 @@
         <w:pStyle w:val="Compact"/>
       </w:pPr>
       <w:r>
-        <w:t xml:space="preserve">Dispersión de la información relacionada con las obras.</w:t>
+        <w:t xml:space="preserve">Elaboración manual de informes.</w:t>
       </w:r>
     </w:p>
     <w:p>
@@ -1955,7 +1958,7 @@
         <w:pStyle w:val="Compact"/>
       </w:pPr>
       <w:r>
-        <w:t xml:space="preserve">Dificultad para determinar el consumo real de materiales por proyecto.</w:t>
+        <w:t xml:space="preserve">Disponibilidad limitada de indicadores para apoyar decisiones.</w:t>
       </w:r>
     </w:p>
     <w:p>
@@ -1967,13 +1970,7 @@
         <w:pStyle w:val="Compact"/>
       </w:pPr>
       <w:r>
-        <w:t xml:space="preserve">Ausencia de trazabilidad sobre entradas, salidas, devoluciones y traslados de</w:t>
-      </w:r>
-      <w:r>
-        <w:t xml:space="preserve"> </w:t>
-      </w:r>
-      <w:r>
-        <w:t xml:space="preserve">materiales.</w:t>
+        <w:t xml:space="preserve">Riesgo de duplicidad, inconsistencia o pérdida de información.</w:t>
       </w:r>
     </w:p>
     <w:p>
@@ -1985,43 +1982,16 @@
         <w:pStyle w:val="Compact"/>
       </w:pPr>
       <w:r>
-        <w:t xml:space="preserve">Dificultad para determinar quién tiene asignada una herramienta determinada.</w:t>
-      </w:r>
-    </w:p>
-    <w:p>
-      <w:pPr>
-        <w:numPr>
-          <w:ilvl w:val="0"/>
-          <w:numId w:val="1005"/>
-        </w:numPr>
-        <w:pStyle w:val="Compact"/>
-      </w:pPr>
-      <w:r>
-        <w:t xml:space="preserve">Información histórica limitada sobre responsables y actividades ejecutadas.</w:t>
-      </w:r>
-    </w:p>
-    <w:p>
-      <w:pPr>
-        <w:numPr>
-          <w:ilvl w:val="0"/>
-          <w:numId w:val="1005"/>
-        </w:numPr>
-        <w:pStyle w:val="Compact"/>
-      </w:pPr>
-      <w:r>
-        <w:t xml:space="preserve">Poca integración entre el avance de obra y la utilización de recursos.</w:t>
-      </w:r>
-    </w:p>
-    <w:p>
-      <w:pPr>
-        <w:numPr>
-          <w:ilvl w:val="0"/>
-          <w:numId w:val="1005"/>
-        </w:numPr>
-        <w:pStyle w:val="Compact"/>
-      </w:pPr>
-      <w:r>
-        <w:t xml:space="preserve">Dificultad para consultar los servicios externos contratados y sus responsables.</w:t>
+        <w:t xml:space="preserve">Dependencia del conocimiento individual de los responsables de las obras.</w:t>
+      </w:r>
+    </w:p>
+    <w:bookmarkStart w:id="26" w:name="árbol-del-problema"/>
+    <w:p>
+      <w:pPr>
+        <w:pStyle w:val="Heading4"/>
+      </w:pPr>
+      <w:r>
+        <w:t xml:space="preserve">Árbol del problema</w:t>
       </w:r>
     </w:p>
     <w:p>
@@ -2033,7 +2003,7 @@
           <w:bCs/>
           <w:b/>
         </w:rPr>
-        <w:t xml:space="preserve">Efectos indirectos</w:t>
+        <w:t xml:space="preserve">EFECTOS INDIRECTOS</w:t>
       </w:r>
     </w:p>
     <w:p>
@@ -2045,7 +2015,23 @@
         <w:pStyle w:val="Compact"/>
       </w:pPr>
       <w:r>
-        <w:t xml:space="preserve">Elaboración manual de informes.</w:t>
+        <w:rPr>
+          <w:bCs/>
+          <w:b/>
+        </w:rPr>
+        <w:t xml:space="preserve">EI1:</w:t>
+      </w:r>
+      <w:r>
+        <w:t xml:space="preserve"> </w:t>
+      </w:r>
+      <w:r>
+        <w:t xml:space="preserve">Alta vulnerabilidad ante la inconsistencia, duplicidad o pérdida definitiva</w:t>
+      </w:r>
+      <w:r>
+        <w:t xml:space="preserve"> </w:t>
+      </w:r>
+      <w:r>
+        <w:t xml:space="preserve">de datos operativos.</w:t>
       </w:r>
     </w:p>
     <w:p>
@@ -2057,7 +2043,23 @@
         <w:pStyle w:val="Compact"/>
       </w:pPr>
       <w:r>
-        <w:t xml:space="preserve">Disponibilidad limitada de indicadores para apoyar decisiones.</w:t>
+        <w:rPr>
+          <w:bCs/>
+          <w:b/>
+        </w:rPr>
+        <w:t xml:space="preserve">EI2:</w:t>
+      </w:r>
+      <w:r>
+        <w:t xml:space="preserve"> </w:t>
+      </w:r>
+      <w:r>
+        <w:t xml:space="preserve">Dependencia excesiva del conocimiento empírico y memoria individual de los</w:t>
+      </w:r>
+      <w:r>
+        <w:t xml:space="preserve"> </w:t>
+      </w:r>
+      <w:r>
+        <w:t xml:space="preserve">responsables de obra.</w:t>
       </w:r>
     </w:p>
     <w:p>
@@ -2069,40 +2071,43 @@
         <w:pStyle w:val="Compact"/>
       </w:pPr>
       <w:r>
-        <w:t xml:space="preserve">Riesgo de duplicidad, inconsistencia o pérdida de información.</w:t>
-      </w:r>
-    </w:p>
-    <w:p>
-      <w:pPr>
-        <w:numPr>
-          <w:ilvl w:val="0"/>
-          <w:numId w:val="1006"/>
-        </w:numPr>
-        <w:pStyle w:val="Compact"/>
-      </w:pPr>
-      <w:r>
-        <w:t xml:space="preserve">Dependencia del conocimiento individual de los responsables de las obras.</w:t>
-      </w:r>
-    </w:p>
-    <w:bookmarkStart w:id="26" w:name="árbol-del-problema"/>
-    <w:p>
-      <w:pPr>
-        <w:pStyle w:val="Heading4"/>
-      </w:pPr>
-      <w:r>
-        <w:t xml:space="preserve">Árbol del problema</w:t>
-      </w:r>
-    </w:p>
-    <w:p>
-      <w:pPr>
-        <w:pStyle w:val="FirstParagraph"/>
-      </w:pPr>
-      <w:r>
         <w:rPr>
           <w:bCs/>
           <w:b/>
         </w:rPr>
-        <w:t xml:space="preserve">EFECTOS INDIRECTOS</w:t>
+        <w:t xml:space="preserve">EI3:</w:t>
+      </w:r>
+      <w:r>
+        <w:t xml:space="preserve"> </w:t>
+      </w:r>
+      <w:r>
+        <w:t xml:space="preserve">Retrasos estructurales en la consolidación de informes, limitando la</w:t>
+      </w:r>
+      <w:r>
+        <w:t xml:space="preserve"> </w:t>
+      </w:r>
+      <w:r>
+        <w:t xml:space="preserve">disponibilidad de indicadores unificados para decisiones gerenciales.</w:t>
+      </w:r>
+    </w:p>
+    <w:p>
+      <w:pPr>
+        <w:pStyle w:val="FirstParagraph"/>
+      </w:pPr>
+      <w:r>
+        <w:t xml:space="preserve">↑</w:t>
+      </w:r>
+    </w:p>
+    <w:p>
+      <w:pPr>
+        <w:pStyle w:val="BodyText"/>
+      </w:pPr>
+      <w:r>
+        <w:rPr>
+          <w:bCs/>
+          <w:b/>
+        </w:rPr>
+        <w:t xml:space="preserve">EFECTOS DIRECTOS</w:t>
       </w:r>
     </w:p>
     <w:p>
@@ -2118,19 +2123,19 @@
           <w:bCs/>
           <w:b/>
         </w:rPr>
-        <w:t xml:space="preserve">EI1:</w:t>
-      </w:r>
-      <w:r>
-        <w:t xml:space="preserve"> </w:t>
-      </w:r>
-      <w:r>
-        <w:t xml:space="preserve">Alta vulnerabilidad ante la inconsistencia, duplicidad o pérdida definitiva</w:t>
-      </w:r>
-      <w:r>
-        <w:t xml:space="preserve"> </w:t>
-      </w:r>
-      <w:r>
-        <w:t xml:space="preserve">de datos operativos.</w:t>
+        <w:t xml:space="preserve">ED1:</w:t>
+      </w:r>
+      <w:r>
+        <w:t xml:space="preserve"> </w:t>
+      </w:r>
+      <w:r>
+        <w:t xml:space="preserve">Pérdida de trazabilidad histórica sobre las entradas, salidas, traslados y</w:t>
+      </w:r>
+      <w:r>
+        <w:t xml:space="preserve"> </w:t>
+      </w:r>
+      <w:r>
+        <w:t xml:space="preserve">devoluciones de materiales y herramientas.</w:t>
       </w:r>
     </w:p>
     <w:p>
@@ -2146,19 +2151,19 @@
           <w:bCs/>
           <w:b/>
         </w:rPr>
-        <w:t xml:space="preserve">EI2:</w:t>
-      </w:r>
-      <w:r>
-        <w:t xml:space="preserve"> </w:t>
-      </w:r>
-      <w:r>
-        <w:t xml:space="preserve">Dependencia excesiva del conocimiento empírico y memoria individual de los</w:t>
-      </w:r>
-      <w:r>
-        <w:t xml:space="preserve"> </w:t>
-      </w:r>
-      <w:r>
-        <w:t xml:space="preserve">responsables de obra.</w:t>
+        <w:t xml:space="preserve">ED2:</w:t>
+      </w:r>
+      <w:r>
+        <w:t xml:space="preserve"> </w:t>
+      </w:r>
+      <w:r>
+        <w:t xml:space="preserve">Incertidumbre sobre el consumo real de materiales frente a lo presupuestado</w:t>
+      </w:r>
+      <w:r>
+        <w:t xml:space="preserve"> </w:t>
+      </w:r>
+      <w:r>
+        <w:t xml:space="preserve">en cada proyecto.</w:t>
       </w:r>
     </w:p>
     <w:p>
@@ -2174,39 +2179,107 @@
           <w:bCs/>
           <w:b/>
         </w:rPr>
-        <w:t xml:space="preserve">EI3:</w:t>
-      </w:r>
-      <w:r>
-        <w:t xml:space="preserve"> </w:t>
-      </w:r>
-      <w:r>
-        <w:t xml:space="preserve">Retrasos estructurales en la consolidación de informes, limitando la</w:t>
-      </w:r>
-      <w:r>
-        <w:t xml:space="preserve"> </w:t>
-      </w:r>
-      <w:r>
-        <w:t xml:space="preserve">disponibilidad de indicadores unificados para decisiones gerenciales.</w:t>
-      </w:r>
-    </w:p>
-    <w:p>
-      <w:pPr>
-        <w:pStyle w:val="FirstParagraph"/>
-      </w:pPr>
-      <w:r>
-        <w:t xml:space="preserve">↑</w:t>
-      </w:r>
-    </w:p>
-    <w:p>
-      <w:pPr>
-        <w:pStyle w:val="BodyText"/>
+        <w:t xml:space="preserve">ED3:</w:t>
+      </w:r>
+      <w:r>
+        <w:t xml:space="preserve"> </w:t>
+      </w:r>
+      <w:r>
+        <w:t xml:space="preserve">Dispersión del historial de actividades y asignaciones del personal y</w:t>
+      </w:r>
+      <w:r>
+        <w:t xml:space="preserve"> </w:t>
+      </w:r>
+      <w:r>
+        <w:t xml:space="preserve">contratistas externos.</w:t>
+      </w:r>
+    </w:p>
+    <w:p>
+      <w:pPr>
+        <w:numPr>
+          <w:ilvl w:val="0"/>
+          <w:numId w:val="1007"/>
+        </w:numPr>
+        <w:pStyle w:val="Compact"/>
       </w:pPr>
       <w:r>
         <w:rPr>
           <w:bCs/>
           <w:b/>
         </w:rPr>
-        <w:t xml:space="preserve">EFECTOS DIRECTOS</w:t>
+        <w:t xml:space="preserve">ED4:</w:t>
+      </w:r>
+      <w:r>
+        <w:t xml:space="preserve"> </w:t>
+      </w:r>
+      <w:r>
+        <w:t xml:space="preserve">Dificultad para auditar de manera cruzada el progreso físico de la obra</w:t>
+      </w:r>
+      <w:r>
+        <w:t xml:space="preserve"> </w:t>
+      </w:r>
+      <w:r>
+        <w:t xml:space="preserve">frente a los recursos financieros invertidos.</w:t>
+      </w:r>
+    </w:p>
+    <w:p>
+      <w:pPr>
+        <w:pStyle w:val="FirstParagraph"/>
+      </w:pPr>
+      <w:r>
+        <w:t xml:space="preserve">↑</w:t>
+      </w:r>
+    </w:p>
+    <w:p>
+      <w:pPr>
+        <w:pStyle w:val="BodyText"/>
+      </w:pPr>
+      <w:r>
+        <w:rPr>
+          <w:bCs/>
+          <w:b/>
+        </w:rPr>
+        <w:t xml:space="preserve">PROBLEMA CENTRAL</w:t>
+      </w:r>
+    </w:p>
+    <w:p>
+      <w:pPr>
+        <w:pStyle w:val="BodyText"/>
+      </w:pPr>
+      <w:r>
+        <w:t xml:space="preserve">Desarticulación operativa en la gestión, control y trazabilidad de los recursos</w:t>
+      </w:r>
+      <w:r>
+        <w:t xml:space="preserve"> </w:t>
+      </w:r>
+      <w:r>
+        <w:t xml:space="preserve">(inventarios, personal y terceros) durante la ejecución de los proyectos de</w:t>
+      </w:r>
+      <w:r>
+        <w:t xml:space="preserve"> </w:t>
+      </w:r>
+      <w:r>
+        <w:t xml:space="preserve">construcción en la Constructora XYZ.</w:t>
+      </w:r>
+    </w:p>
+    <w:p>
+      <w:pPr>
+        <w:pStyle w:val="BodyText"/>
+      </w:pPr>
+      <w:r>
+        <w:t xml:space="preserve">↑</w:t>
+      </w:r>
+    </w:p>
+    <w:p>
+      <w:pPr>
+        <w:pStyle w:val="BodyText"/>
+      </w:pPr>
+      <w:r>
+        <w:rPr>
+          <w:bCs/>
+          <w:b/>
+        </w:rPr>
+        <w:t xml:space="preserve">CAUSAS DIRECTAS</w:t>
       </w:r>
     </w:p>
     <w:p>
@@ -2222,19 +2295,19 @@
           <w:bCs/>
           <w:b/>
         </w:rPr>
-        <w:t xml:space="preserve">ED1:</w:t>
-      </w:r>
-      <w:r>
-        <w:t xml:space="preserve"> </w:t>
-      </w:r>
-      <w:r>
-        <w:t xml:space="preserve">Pérdida de trazabilidad histórica sobre las entradas, salidas, traslados y</w:t>
-      </w:r>
-      <w:r>
-        <w:t xml:space="preserve"> </w:t>
-      </w:r>
-      <w:r>
-        <w:t xml:space="preserve">devoluciones de materiales y herramientas.</w:t>
+        <w:t xml:space="preserve">CD1:</w:t>
+      </w:r>
+      <w:r>
+        <w:t xml:space="preserve"> </w:t>
+      </w:r>
+      <w:r>
+        <w:t xml:space="preserve">Fragmentación de los registros operativos al ser diligenciados y almacenados</w:t>
+      </w:r>
+      <w:r>
+        <w:t xml:space="preserve"> </w:t>
+      </w:r>
+      <w:r>
+        <w:t xml:space="preserve">de manera independiente por distintos responsables de obra.</w:t>
       </w:r>
     </w:p>
     <w:p>
@@ -2250,19 +2323,19 @@
           <w:bCs/>
           <w:b/>
         </w:rPr>
-        <w:t xml:space="preserve">ED2:</w:t>
-      </w:r>
-      <w:r>
-        <w:t xml:space="preserve"> </w:t>
-      </w:r>
-      <w:r>
-        <w:t xml:space="preserve">Incertidumbre sobre el consumo real de materiales frente a lo presupuestado</w:t>
-      </w:r>
-      <w:r>
-        <w:t xml:space="preserve"> </w:t>
-      </w:r>
-      <w:r>
-        <w:t xml:space="preserve">en cada proyecto.</w:t>
+        <w:t xml:space="preserve">CD2:</w:t>
+      </w:r>
+      <w:r>
+        <w:t xml:space="preserve"> </w:t>
+      </w:r>
+      <w:r>
+        <w:t xml:space="preserve">Uso exclusivo de medios manuales y ofimáticos desconectados (documentos</w:t>
+      </w:r>
+      <w:r>
+        <w:t xml:space="preserve"> </w:t>
+      </w:r>
+      <w:r>
+        <w:t xml:space="preserve">físicos, planillas de Excel y llamadas) para la administración diaria.</w:t>
       </w:r>
     </w:p>
     <w:p>
@@ -2278,107 +2351,39 @@
           <w:bCs/>
           <w:b/>
         </w:rPr>
-        <w:t xml:space="preserve">ED3:</w:t>
-      </w:r>
-      <w:r>
-        <w:t xml:space="preserve"> </w:t>
-      </w:r>
-      <w:r>
-        <w:t xml:space="preserve">Dispersión del historial de actividades y asignaciones del personal y</w:t>
-      </w:r>
-      <w:r>
-        <w:t xml:space="preserve"> </w:t>
-      </w:r>
-      <w:r>
-        <w:t xml:space="preserve">contratistas externos.</w:t>
-      </w:r>
-    </w:p>
-    <w:p>
-      <w:pPr>
-        <w:numPr>
-          <w:ilvl w:val="0"/>
-          <w:numId w:val="1008"/>
-        </w:numPr>
-        <w:pStyle w:val="Compact"/>
+        <w:t xml:space="preserve">CD3:</w:t>
+      </w:r>
+      <w:r>
+        <w:t xml:space="preserve"> </w:t>
+      </w:r>
+      <w:r>
+        <w:t xml:space="preserve">Ausencia de mecanismos automatizados para vincular el uso real de recursos</w:t>
+      </w:r>
+      <w:r>
+        <w:t xml:space="preserve"> </w:t>
+      </w:r>
+      <w:r>
+        <w:t xml:space="preserve">con el avance reportado de las obras.</w:t>
+      </w:r>
+    </w:p>
+    <w:p>
+      <w:pPr>
+        <w:pStyle w:val="FirstParagraph"/>
+      </w:pPr>
+      <w:r>
+        <w:t xml:space="preserve">↑</w:t>
+      </w:r>
+    </w:p>
+    <w:p>
+      <w:pPr>
+        <w:pStyle w:val="BodyText"/>
       </w:pPr>
       <w:r>
         <w:rPr>
           <w:bCs/>
           <w:b/>
         </w:rPr>
-        <w:t xml:space="preserve">ED4:</w:t>
-      </w:r>
-      <w:r>
-        <w:t xml:space="preserve"> </w:t>
-      </w:r>
-      <w:r>
-        <w:t xml:space="preserve">Dificultad para auditar de manera cruzada el progreso físico de la obra</w:t>
-      </w:r>
-      <w:r>
-        <w:t xml:space="preserve"> </w:t>
-      </w:r>
-      <w:r>
-        <w:t xml:space="preserve">frente a los recursos financieros invertidos.</w:t>
-      </w:r>
-    </w:p>
-    <w:p>
-      <w:pPr>
-        <w:pStyle w:val="FirstParagraph"/>
-      </w:pPr>
-      <w:r>
-        <w:t xml:space="preserve">↑</w:t>
-      </w:r>
-    </w:p>
-    <w:p>
-      <w:pPr>
-        <w:pStyle w:val="BodyText"/>
-      </w:pPr>
-      <w:r>
-        <w:rPr>
-          <w:bCs/>
-          <w:b/>
-        </w:rPr>
-        <w:t xml:space="preserve">PROBLEMA CENTRAL</w:t>
-      </w:r>
-    </w:p>
-    <w:p>
-      <w:pPr>
-        <w:pStyle w:val="BodyText"/>
-      </w:pPr>
-      <w:r>
-        <w:t xml:space="preserve">Desarticulación operativa en la gestión, control y trazabilidad de los recursos</w:t>
-      </w:r>
-      <w:r>
-        <w:t xml:space="preserve"> </w:t>
-      </w:r>
-      <w:r>
-        <w:t xml:space="preserve">(inventarios, personal y terceros) durante la ejecución de los proyectos de</w:t>
-      </w:r>
-      <w:r>
-        <w:t xml:space="preserve"> </w:t>
-      </w:r>
-      <w:r>
-        <w:t xml:space="preserve">construcción en la Constructora XYZ.</w:t>
-      </w:r>
-    </w:p>
-    <w:p>
-      <w:pPr>
-        <w:pStyle w:val="BodyText"/>
-      </w:pPr>
-      <w:r>
-        <w:t xml:space="preserve">↑</w:t>
-      </w:r>
-    </w:p>
-    <w:p>
-      <w:pPr>
-        <w:pStyle w:val="BodyText"/>
-      </w:pPr>
-      <w:r>
-        <w:rPr>
-          <w:bCs/>
-          <w:b/>
-        </w:rPr>
-        <w:t xml:space="preserve">CAUSAS DIRECTAS</w:t>
+        <w:t xml:space="preserve">CAUSAS INDIRECTAS</w:t>
       </w:r>
     </w:p>
     <w:p>
@@ -2394,19 +2399,19 @@
           <w:bCs/>
           <w:b/>
         </w:rPr>
-        <w:t xml:space="preserve">CD1:</w:t>
-      </w:r>
-      <w:r>
-        <w:t xml:space="preserve"> </w:t>
-      </w:r>
-      <w:r>
-        <w:t xml:space="preserve">Fragmentación de los registros operativos al ser diligenciados y almacenados</w:t>
-      </w:r>
-      <w:r>
-        <w:t xml:space="preserve"> </w:t>
-      </w:r>
-      <w:r>
-        <w:t xml:space="preserve">de manera independiente por distintos responsables de obra.</w:t>
+        <w:t xml:space="preserve">CI1:</w:t>
+      </w:r>
+      <w:r>
+        <w:t xml:space="preserve"> </w:t>
+      </w:r>
+      <w:r>
+        <w:t xml:space="preserve">Insuficiencia de los mecanismos tradicionales de registro para escalar</w:t>
+      </w:r>
+      <w:r>
+        <w:t xml:space="preserve"> </w:t>
+      </w:r>
+      <w:r>
+        <w:t xml:space="preserve">operativamente ante el aumento progresivo del volumen de proyectos y transacciones.</w:t>
       </w:r>
     </w:p>
     <w:p>
@@ -2414,110 +2419,6 @@
         <w:numPr>
           <w:ilvl w:val="0"/>
           <w:numId w:val="1009"/>
-        </w:numPr>
-        <w:pStyle w:val="Compact"/>
-      </w:pPr>
-      <w:r>
-        <w:rPr>
-          <w:bCs/>
-          <w:b/>
-        </w:rPr>
-        <w:t xml:space="preserve">CD2:</w:t>
-      </w:r>
-      <w:r>
-        <w:t xml:space="preserve"> </w:t>
-      </w:r>
-      <w:r>
-        <w:t xml:space="preserve">Uso exclusivo de medios manuales y ofimáticos desconectados (documentos</w:t>
-      </w:r>
-      <w:r>
-        <w:t xml:space="preserve"> </w:t>
-      </w:r>
-      <w:r>
-        <w:t xml:space="preserve">físicos, planillas de Excel y llamadas) para la administración diaria.</w:t>
-      </w:r>
-    </w:p>
-    <w:p>
-      <w:pPr>
-        <w:numPr>
-          <w:ilvl w:val="0"/>
-          <w:numId w:val="1009"/>
-        </w:numPr>
-        <w:pStyle w:val="Compact"/>
-      </w:pPr>
-      <w:r>
-        <w:rPr>
-          <w:bCs/>
-          <w:b/>
-        </w:rPr>
-        <w:t xml:space="preserve">CD3:</w:t>
-      </w:r>
-      <w:r>
-        <w:t xml:space="preserve"> </w:t>
-      </w:r>
-      <w:r>
-        <w:t xml:space="preserve">Ausencia de mecanismos automatizados para vincular el uso real de recursos</w:t>
-      </w:r>
-      <w:r>
-        <w:t xml:space="preserve"> </w:t>
-      </w:r>
-      <w:r>
-        <w:t xml:space="preserve">con el avance reportado de las obras.</w:t>
-      </w:r>
-    </w:p>
-    <w:p>
-      <w:pPr>
-        <w:pStyle w:val="FirstParagraph"/>
-      </w:pPr>
-      <w:r>
-        <w:t xml:space="preserve">↑</w:t>
-      </w:r>
-    </w:p>
-    <w:p>
-      <w:pPr>
-        <w:pStyle w:val="BodyText"/>
-      </w:pPr>
-      <w:r>
-        <w:rPr>
-          <w:bCs/>
-          <w:b/>
-        </w:rPr>
-        <w:t xml:space="preserve">CAUSAS INDIRECTAS</w:t>
-      </w:r>
-    </w:p>
-    <w:p>
-      <w:pPr>
-        <w:numPr>
-          <w:ilvl w:val="0"/>
-          <w:numId w:val="1010"/>
-        </w:numPr>
-        <w:pStyle w:val="Compact"/>
-      </w:pPr>
-      <w:r>
-        <w:rPr>
-          <w:bCs/>
-          <w:b/>
-        </w:rPr>
-        <w:t xml:space="preserve">CI1:</w:t>
-      </w:r>
-      <w:r>
-        <w:t xml:space="preserve"> </w:t>
-      </w:r>
-      <w:r>
-        <w:t xml:space="preserve">Insuficiencia de los mecanismos tradicionales de registro para escalar</w:t>
-      </w:r>
-      <w:r>
-        <w:t xml:space="preserve"> </w:t>
-      </w:r>
-      <w:r>
-        <w:t xml:space="preserve">operativamente ante el aumento progresivo del volumen de proyectos y transacciones.</w:t>
-      </w:r>
-    </w:p>
-    <w:p>
-      <w:pPr>
-        <w:numPr>
-          <w:ilvl w:val="0"/>
-          <w:numId w:val="1010"/>
         </w:numPr>
         <w:pStyle w:val="Compact"/>
       </w:pPr>
@@ -3636,12 +3537,84 @@
       <w:pPr>
         <w:numPr>
           <w:ilvl w:val="0"/>
-          <w:numId w:val="1011"/>
+          <w:numId w:val="1010"/>
         </w:numPr>
         <w:pStyle w:val="Compact"/>
       </w:pPr>
       <w:r>
         <w:t xml:space="preserve">Contabilidad.</w:t>
+      </w:r>
+    </w:p>
+    <w:p>
+      <w:pPr>
+        <w:numPr>
+          <w:ilvl w:val="0"/>
+          <w:numId w:val="1010"/>
+        </w:numPr>
+        <w:pStyle w:val="Compact"/>
+      </w:pPr>
+      <w:r>
+        <w:t xml:space="preserve">Nómina.</w:t>
+      </w:r>
+    </w:p>
+    <w:p>
+      <w:pPr>
+        <w:numPr>
+          <w:ilvl w:val="0"/>
+          <w:numId w:val="1010"/>
+        </w:numPr>
+        <w:pStyle w:val="Compact"/>
+      </w:pPr>
+      <w:r>
+        <w:t xml:space="preserve">Diseño arquitectónico.</w:t>
+      </w:r>
+    </w:p>
+    <w:p>
+      <w:pPr>
+        <w:numPr>
+          <w:ilvl w:val="0"/>
+          <w:numId w:val="1010"/>
+        </w:numPr>
+        <w:pStyle w:val="Compact"/>
+      </w:pPr>
+      <w:r>
+        <w:t xml:space="preserve">Cálculo estructural.</w:t>
+      </w:r>
+    </w:p>
+    <w:p>
+      <w:pPr>
+        <w:numPr>
+          <w:ilvl w:val="0"/>
+          <w:numId w:val="1010"/>
+        </w:numPr>
+        <w:pStyle w:val="Compact"/>
+      </w:pPr>
+      <w:r>
+        <w:t xml:space="preserve">BIM (Building Information Modeling).</w:t>
+      </w:r>
+    </w:p>
+    <w:p>
+      <w:pPr>
+        <w:numPr>
+          <w:ilvl w:val="0"/>
+          <w:numId w:val="1010"/>
+        </w:numPr>
+        <w:pStyle w:val="Compact"/>
+      </w:pPr>
+      <w:r>
+        <w:t xml:space="preserve">Gestión financiera empresarial.</w:t>
+      </w:r>
+    </w:p>
+    <w:p>
+      <w:pPr>
+        <w:pStyle w:val="FirstParagraph"/>
+      </w:pPr>
+      <w:r>
+        <w:rPr>
+          <w:bCs/>
+          <w:b/>
+        </w:rPr>
+        <w:t xml:space="preserve">Restricciones del proyecto</w:t>
       </w:r>
     </w:p>
     <w:p>
@@ -3653,7 +3626,17 @@
         <w:pStyle w:val="Compact"/>
       </w:pPr>
       <w:r>
-        <w:t xml:space="preserve">Nómina.</w:t>
+        <w:rPr>
+          <w:bCs/>
+          <w:b/>
+        </w:rPr>
+        <w:t xml:space="preserve">Tiempo:</w:t>
+      </w:r>
+      <w:r>
+        <w:t xml:space="preserve"> </w:t>
+      </w:r>
+      <w:r>
+        <w:t xml:space="preserve">el enunciado establece una duración prevista de 4 meses.</w:t>
       </w:r>
     </w:p>
     <w:p>
@@ -3665,7 +3648,29 @@
         <w:pStyle w:val="Compact"/>
       </w:pPr>
       <w:r>
-        <w:t xml:space="preserve">Diseño arquitectónico.</w:t>
+        <w:rPr>
+          <w:bCs/>
+          <w:b/>
+        </w:rPr>
+        <w:t xml:space="preserve">Tipo de proyecto:</w:t>
+      </w:r>
+      <w:r>
+        <w:t xml:space="preserve"> </w:t>
+      </w:r>
+      <w:r>
+        <w:t xml:space="preserve">se define como desarrollo de software de tipo aplicación web,</w:t>
+      </w:r>
+      <w:r>
+        <w:t xml:space="preserve"> </w:t>
+      </w:r>
+      <w:r>
+        <w:t xml:space="preserve">lo que descarta otras alternativas (aplicación de escritorio, app nativa) del alcance</w:t>
+      </w:r>
+      <w:r>
+        <w:t xml:space="preserve"> </w:t>
+      </w:r>
+      <w:r>
+        <w:t xml:space="preserve">base.</w:t>
       </w:r>
     </w:p>
     <w:p>
@@ -3677,7 +3682,29 @@
         <w:pStyle w:val="Compact"/>
       </w:pPr>
       <w:r>
-        <w:t xml:space="preserve">Cálculo estructural.</w:t>
+        <w:rPr>
+          <w:bCs/>
+          <w:b/>
+        </w:rPr>
+        <w:t xml:space="preserve">Alcance funcional:</w:t>
+      </w:r>
+      <w:r>
+        <w:t xml:space="preserve"> </w:t>
+      </w:r>
+      <w:r>
+        <w:t xml:space="preserve">el sistema no debe convertirse en sustituto de software</w:t>
+      </w:r>
+      <w:r>
+        <w:t xml:space="preserve"> </w:t>
+      </w:r>
+      <w:r>
+        <w:t xml:space="preserve">especializado, lo que limita su complejidad a los procesos operativos de la</w:t>
+      </w:r>
+      <w:r>
+        <w:t xml:space="preserve"> </w:t>
+      </w:r>
+      <w:r>
+        <w:t xml:space="preserve">constructora.</w:t>
       </w:r>
     </w:p>
     <w:p>
@@ -3689,7 +3716,29 @@
         <w:pStyle w:val="Compact"/>
       </w:pPr>
       <w:r>
-        <w:t xml:space="preserve">BIM (Building Information Modeling).</w:t>
+        <w:rPr>
+          <w:bCs/>
+          <w:b/>
+        </w:rPr>
+        <w:t xml:space="preserve">Complejidad académica exigida:</w:t>
+      </w:r>
+      <w:r>
+        <w:t xml:space="preserve"> </w:t>
+      </w:r>
+      <w:r>
+        <w:t xml:space="preserve">el enunciado indica explícitamente que las reglas</w:t>
+      </w:r>
+      <w:r>
+        <w:t xml:space="preserve"> </w:t>
+      </w:r>
+      <w:r>
+        <w:t xml:space="preserve">de negocio RN01–RN10 se definen «para aumentar la complejidad académica del</w:t>
+      </w:r>
+      <w:r>
+        <w:t xml:space="preserve"> </w:t>
+      </w:r>
+      <w:r>
+        <w:t xml:space="preserve">proyecto», lo cual condiciona el nivel de detalle esperado en el análisis y diseño.</w:t>
       </w:r>
     </w:p>
     <w:p>
@@ -3701,19 +3750,53 @@
         <w:pStyle w:val="Compact"/>
       </w:pPr>
       <w:r>
-        <w:t xml:space="preserve">Gestión financiera empresarial.</w:t>
-      </w:r>
-    </w:p>
-    <w:p>
-      <w:pPr>
-        <w:pStyle w:val="FirstParagraph"/>
-      </w:pPr>
-      <w:r>
         <w:rPr>
           <w:bCs/>
           <w:b/>
         </w:rPr>
-        <w:t xml:space="preserve">Restricciones del proyecto</w:t>
+        <w:t xml:space="preserve">Contexto de microempresa:</w:t>
+      </w:r>
+      <w:r>
+        <w:t xml:space="preserve"> </w:t>
+      </w:r>
+      <w:r>
+        <w:t xml:space="preserve">los requerimientos de usabilidad (RNF01) y rendimiento</w:t>
+      </w:r>
+      <w:r>
+        <w:t xml:space="preserve"> </w:t>
+      </w:r>
+      <w:r>
+        <w:t xml:space="preserve">(RNF03) se definen pensando en una operación de microempresa y en usuarios con</w:t>
+      </w:r>
+      <w:r>
+        <w:t xml:space="preserve"> </w:t>
+      </w:r>
+      <w:r>
+        <w:t xml:space="preserve">conocimientos informáticos básicos, lo que limita la complejidad de la interfaz.</w:t>
+      </w:r>
+    </w:p>
+    <w:p>
+      <w:pPr>
+        <w:pStyle w:val="FirstParagraph"/>
+      </w:pPr>
+      <w:r>
+        <w:rPr>
+          <w:bCs/>
+          <w:b/>
+        </w:rPr>
+        <w:t xml:space="preserve">Supuestos.</w:t>
+      </w:r>
+      <w:r>
+        <w:t xml:space="preserve"> </w:t>
+      </w:r>
+      <w:r>
+        <w:t xml:space="preserve">Se registran únicamente inferencias razonables derivadas de la lectura</w:t>
+      </w:r>
+      <w:r>
+        <w:t xml:space="preserve"> </w:t>
+      </w:r>
+      <w:r>
+        <w:t xml:space="preserve">de los requerimientos, marcadas como tales:</w:t>
       </w:r>
     </w:p>
     <w:p>
@@ -3725,17 +3808,13 @@
         <w:pStyle w:val="Compact"/>
       </w:pPr>
       <w:r>
-        <w:rPr>
-          <w:bCs/>
-          <w:b/>
-        </w:rPr>
-        <w:t xml:space="preserve">Tiempo:</w:t>
-      </w:r>
-      <w:r>
-        <w:t xml:space="preserve"> </w:t>
-      </w:r>
-      <w:r>
-        <w:t xml:space="preserve">el enunciado establece una duración prevista de 4 meses.</w:t>
+        <w:t xml:space="preserve">La existencia de un rol de administrador que gestiona usuarios, roles y permisos, a</w:t>
+      </w:r>
+      <w:r>
+        <w:t xml:space="preserve"> </w:t>
+      </w:r>
+      <w:r>
+        <w:t xml:space="preserve">partir de lo establecido en RF01.</w:t>
       </w:r>
     </w:p>
     <w:p>
@@ -3747,29 +3826,19 @@
         <w:pStyle w:val="Compact"/>
       </w:pPr>
       <w:r>
-        <w:rPr>
-          <w:bCs/>
-          <w:b/>
-        </w:rPr>
-        <w:t xml:space="preserve">Tipo de proyecto:</w:t>
-      </w:r>
-      <w:r>
-        <w:t xml:space="preserve"> </w:t>
-      </w:r>
-      <w:r>
-        <w:t xml:space="preserve">se define como desarrollo de software de tipo aplicación web,</w:t>
-      </w:r>
-      <w:r>
-        <w:t xml:space="preserve"> </w:t>
-      </w:r>
-      <w:r>
-        <w:t xml:space="preserve">lo que descarta otras alternativas (aplicación de escritorio, app nativa) del alcance</w:t>
-      </w:r>
-      <w:r>
-        <w:t xml:space="preserve"> </w:t>
-      </w:r>
-      <w:r>
-        <w:t xml:space="preserve">base.</w:t>
+        <w:t xml:space="preserve">Los maestros de construcción y responsables de actividad (mencionados en RF02, RF03</w:t>
+      </w:r>
+      <w:r>
+        <w:t xml:space="preserve"> </w:t>
+      </w:r>
+      <w:r>
+        <w:t xml:space="preserve">y en la descripción del proyecto) cumplen funciones equivalentes a las de un</w:t>
+      </w:r>
+      <w:r>
+        <w:t xml:space="preserve"> </w:t>
+      </w:r>
+      <w:r>
+        <w:t xml:space="preserve">responsable de obra.</w:t>
       </w:r>
     </w:p>
     <w:p>
@@ -3781,121 +3850,23 @@
         <w:pStyle w:val="Compact"/>
       </w:pPr>
       <w:r>
-        <w:rPr>
-          <w:bCs/>
-          <w:b/>
-        </w:rPr>
-        <w:t xml:space="preserve">Alcance funcional:</w:t>
-      </w:r>
-      <w:r>
-        <w:t xml:space="preserve"> </w:t>
-      </w:r>
-      <w:r>
-        <w:t xml:space="preserve">el sistema no debe convertirse en sustituto de software</w:t>
-      </w:r>
-      <w:r>
-        <w:t xml:space="preserve"> </w:t>
-      </w:r>
-      <w:r>
-        <w:t xml:space="preserve">especializado, lo que limita su complejidad a los procesos operativos de la</w:t>
-      </w:r>
-      <w:r>
-        <w:t xml:space="preserve"> </w:t>
-      </w:r>
-      <w:r>
-        <w:t xml:space="preserve">constructora.</w:t>
-      </w:r>
-    </w:p>
-    <w:p>
-      <w:pPr>
-        <w:numPr>
-          <w:ilvl w:val="0"/>
-          <w:numId w:val="1012"/>
-        </w:numPr>
-        <w:pStyle w:val="Compact"/>
-      </w:pPr>
-      <w:r>
-        <w:rPr>
-          <w:bCs/>
-          <w:b/>
-        </w:rPr>
-        <w:t xml:space="preserve">Complejidad académica exigida:</w:t>
-      </w:r>
-      <w:r>
-        <w:t xml:space="preserve"> </w:t>
-      </w:r>
-      <w:r>
-        <w:t xml:space="preserve">el enunciado indica explícitamente que las reglas</w:t>
-      </w:r>
-      <w:r>
-        <w:t xml:space="preserve"> </w:t>
-      </w:r>
-      <w:r>
-        <w:t xml:space="preserve">de negocio RN01–RN10 se definen «para aumentar la complejidad académica del</w:t>
-      </w:r>
-      <w:r>
-        <w:t xml:space="preserve"> </w:t>
-      </w:r>
-      <w:r>
-        <w:t xml:space="preserve">proyecto», lo cual condiciona el nivel de detalle esperado en el análisis y diseño.</w:t>
-      </w:r>
-    </w:p>
-    <w:p>
-      <w:pPr>
-        <w:numPr>
-          <w:ilvl w:val="0"/>
-          <w:numId w:val="1012"/>
-        </w:numPr>
-        <w:pStyle w:val="Compact"/>
-      </w:pPr>
-      <w:r>
-        <w:rPr>
-          <w:bCs/>
-          <w:b/>
-        </w:rPr>
-        <w:t xml:space="preserve">Contexto de microempresa:</w:t>
-      </w:r>
-      <w:r>
-        <w:t xml:space="preserve"> </w:t>
-      </w:r>
-      <w:r>
-        <w:t xml:space="preserve">los requerimientos de usabilidad (RNF01) y rendimiento</w:t>
-      </w:r>
-      <w:r>
-        <w:t xml:space="preserve"> </w:t>
-      </w:r>
-      <w:r>
-        <w:t xml:space="preserve">(RNF03) se definen pensando en una operación de microempresa y en usuarios con</w:t>
-      </w:r>
-      <w:r>
-        <w:t xml:space="preserve"> </w:t>
-      </w:r>
-      <w:r>
-        <w:t xml:space="preserve">conocimientos informáticos básicos, lo que limita la complejidad de la interfaz.</w:t>
-      </w:r>
-    </w:p>
-    <w:p>
-      <w:pPr>
-        <w:pStyle w:val="FirstParagraph"/>
-      </w:pPr>
-      <w:r>
-        <w:rPr>
-          <w:bCs/>
-          <w:b/>
-        </w:rPr>
-        <w:t xml:space="preserve">Supuestos.</w:t>
-      </w:r>
-      <w:r>
-        <w:t xml:space="preserve"> </w:t>
-      </w:r>
-      <w:r>
-        <w:t xml:space="preserve">Se registran únicamente inferencias razonables derivadas de la lectura</w:t>
-      </w:r>
-      <w:r>
-        <w:t xml:space="preserve"> </w:t>
-      </w:r>
-      <w:r>
-        <w:t xml:space="preserve">de los requerimientos, marcadas como tales:</w:t>
+        <w:t xml:space="preserve">Un rol encargado del control de materiales y herramientas (tipo bodega), inferido de</w:t>
+      </w:r>
+      <w:r>
+        <w:t xml:space="preserve"> </w:t>
+      </w:r>
+      <w:r>
+        <w:t xml:space="preserve">los requerimientos RF09 a RF18 y de la mención a «bodegas» en RNF11.</w:t>
+      </w:r>
+    </w:p>
+    <w:bookmarkEnd w:id="33"/>
+    <w:bookmarkStart w:id="34" w:name="descripción-de-las-necesidades"/>
+    <w:p>
+      <w:pPr>
+        <w:pStyle w:val="Heading4"/>
+      </w:pPr>
+      <w:r>
+        <w:t xml:space="preserve">1.4.3 Descripción de las necesidades</w:t>
       </w:r>
     </w:p>
     <w:p>
@@ -3907,13 +3878,29 @@
         <w:pStyle w:val="Compact"/>
       </w:pPr>
       <w:r>
-        <w:t xml:space="preserve">La existencia de un rol de administrador que gestiona usuarios, roles y permisos, a</w:t>
-      </w:r>
-      <w:r>
-        <w:t xml:space="preserve"> </w:t>
-      </w:r>
-      <w:r>
-        <w:t xml:space="preserve">partir de lo establecido en RF01.</w:t>
+        <w:rPr>
+          <w:bCs/>
+          <w:b/>
+        </w:rPr>
+        <w:t xml:space="preserve">Necesidades operativas:</w:t>
+      </w:r>
+      <w:r>
+        <w:t xml:space="preserve"> </w:t>
+      </w:r>
+      <w:r>
+        <w:t xml:space="preserve">centralizar en un solo sistema el registro de proyectos,</w:t>
+      </w:r>
+      <w:r>
+        <w:t xml:space="preserve"> </w:t>
+      </w:r>
+      <w:r>
+        <w:t xml:space="preserve">personal, materiales, herramientas, proveedores y servicios externos, en lugar de</w:t>
+      </w:r>
+      <w:r>
+        <w:t xml:space="preserve"> </w:t>
+      </w:r>
+      <w:r>
+        <w:t xml:space="preserve">mantenerlos en documentos y hojas de cálculo independientes.</w:t>
       </w:r>
     </w:p>
     <w:p>
@@ -3925,19 +3912,23 @@
         <w:pStyle w:val="Compact"/>
       </w:pPr>
       <w:r>
-        <w:t xml:space="preserve">Los maestros de construcción y responsables de actividad (mencionados en RF02, RF03</w:t>
-      </w:r>
-      <w:r>
-        <w:t xml:space="preserve"> </w:t>
-      </w:r>
-      <w:r>
-        <w:t xml:space="preserve">y en la descripción del proyecto) cumplen funciones equivalentes a las de un</w:t>
-      </w:r>
-      <w:r>
-        <w:t xml:space="preserve"> </w:t>
-      </w:r>
-      <w:r>
-        <w:t xml:space="preserve">responsable de obra.</w:t>
+        <w:rPr>
+          <w:bCs/>
+          <w:b/>
+        </w:rPr>
+        <w:t xml:space="preserve">Necesidades de información:</w:t>
+      </w:r>
+      <w:r>
+        <w:t xml:space="preserve"> </w:t>
+      </w:r>
+      <w:r>
+        <w:t xml:space="preserve">disponer de información consolidada sobre el estado</w:t>
+      </w:r>
+      <w:r>
+        <w:t xml:space="preserve"> </w:t>
+      </w:r>
+      <w:r>
+        <w:t xml:space="preserve">de los proyectos, en lugar de datos dispersos entre responsables.</w:t>
       </w:r>
     </w:p>
     <w:p>
@@ -3949,30 +3940,30 @@
         <w:pStyle w:val="Compact"/>
       </w:pPr>
       <w:r>
-        <w:t xml:space="preserve">Un rol encargado del control de materiales y herramientas (tipo bodega), inferido de</w:t>
-      </w:r>
-      <w:r>
-        <w:t xml:space="preserve"> </w:t>
-      </w:r>
-      <w:r>
-        <w:t xml:space="preserve">los requerimientos RF09 a RF18 y de la mención a «bodegas» en RNF11.</w:t>
-      </w:r>
-    </w:p>
-    <w:bookmarkEnd w:id="33"/>
-    <w:bookmarkStart w:id="34" w:name="descripción-de-las-necesidades"/>
-    <w:p>
-      <w:pPr>
-        <w:pStyle w:val="Heading4"/>
-      </w:pPr>
-      <w:r>
-        <w:t xml:space="preserve">1.4.3 Descripción de las necesidades</w:t>
+        <w:rPr>
+          <w:bCs/>
+          <w:b/>
+        </w:rPr>
+        <w:t xml:space="preserve">Necesidades de control:</w:t>
+      </w:r>
+      <w:r>
+        <w:t xml:space="preserve"> </w:t>
+      </w:r>
+      <w:r>
+        <w:t xml:space="preserve">conocer oportunamente los materiales consumidos, las</w:t>
+      </w:r>
+      <w:r>
+        <w:t xml:space="preserve"> </w:t>
+      </w:r>
+      <w:r>
+        <w:t xml:space="preserve">herramientas entregadas y los servicios contratados en cada obra.</w:t>
       </w:r>
     </w:p>
     <w:p>
       <w:pPr>
         <w:numPr>
           <w:ilvl w:val="0"/>
-          <w:numId w:val="1014"/>
+          <w:numId w:val="1013"/>
         </w:numPr>
         <w:pStyle w:val="Compact"/>
       </w:pPr>
@@ -3981,32 +3972,26 @@
           <w:bCs/>
           <w:b/>
         </w:rPr>
-        <w:t xml:space="preserve">Necesidades operativas:</w:t>
-      </w:r>
-      <w:r>
-        <w:t xml:space="preserve"> </w:t>
-      </w:r>
-      <w:r>
-        <w:t xml:space="preserve">centralizar en un solo sistema el registro de proyectos,</w:t>
-      </w:r>
-      <w:r>
-        <w:t xml:space="preserve"> </w:t>
-      </w:r>
-      <w:r>
-        <w:t xml:space="preserve">personal, materiales, herramientas, proveedores y servicios externos, en lugar de</w:t>
-      </w:r>
-      <w:r>
-        <w:t xml:space="preserve"> </w:t>
-      </w:r>
-      <w:r>
-        <w:t xml:space="preserve">mantenerlos en documentos y hojas de cálculo independientes.</w:t>
+        <w:t xml:space="preserve">Necesidades de seguimiento:</w:t>
+      </w:r>
+      <w:r>
+        <w:t xml:space="preserve"> </w:t>
+      </w:r>
+      <w:r>
+        <w:t xml:space="preserve">hacer seguimiento a los responsables de actividades y</w:t>
+      </w:r>
+      <w:r>
+        <w:t xml:space="preserve"> </w:t>
+      </w:r>
+      <w:r>
+        <w:t xml:space="preserve">a los recursos utilizados en cada proyecto.</w:t>
       </w:r>
     </w:p>
     <w:p>
       <w:pPr>
         <w:numPr>
           <w:ilvl w:val="0"/>
-          <w:numId w:val="1014"/>
+          <w:numId w:val="1013"/>
         </w:numPr>
         <w:pStyle w:val="Compact"/>
       </w:pPr>
@@ -4015,110 +4000,26 @@
           <w:bCs/>
           <w:b/>
         </w:rPr>
-        <w:t xml:space="preserve">Necesidades de información:</w:t>
-      </w:r>
-      <w:r>
-        <w:t xml:space="preserve"> </w:t>
-      </w:r>
-      <w:r>
-        <w:t xml:space="preserve">disponer de información consolidada sobre el estado</w:t>
-      </w:r>
-      <w:r>
-        <w:t xml:space="preserve"> </w:t>
-      </w:r>
-      <w:r>
-        <w:t xml:space="preserve">de los proyectos, en lugar de datos dispersos entre responsables.</w:t>
+        <w:t xml:space="preserve">Necesidades de trazabilidad:</w:t>
+      </w:r>
+      <w:r>
+        <w:t xml:space="preserve"> </w:t>
+      </w:r>
+      <w:r>
+        <w:t xml:space="preserve">poder reconstruir el historial de materiales,</w:t>
+      </w:r>
+      <w:r>
+        <w:t xml:space="preserve"> </w:t>
+      </w:r>
+      <w:r>
+        <w:t xml:space="preserve">herramientas y asignaciones de personal por proyecto.</w:t>
       </w:r>
     </w:p>
     <w:p>
       <w:pPr>
         <w:numPr>
           <w:ilvl w:val="0"/>
-          <w:numId w:val="1014"/>
-        </w:numPr>
-        <w:pStyle w:val="Compact"/>
-      </w:pPr>
-      <w:r>
-        <w:rPr>
-          <w:bCs/>
-          <w:b/>
-        </w:rPr>
-        <w:t xml:space="preserve">Necesidades de control:</w:t>
-      </w:r>
-      <w:r>
-        <w:t xml:space="preserve"> </w:t>
-      </w:r>
-      <w:r>
-        <w:t xml:space="preserve">conocer oportunamente los materiales consumidos, las</w:t>
-      </w:r>
-      <w:r>
-        <w:t xml:space="preserve"> </w:t>
-      </w:r>
-      <w:r>
-        <w:t xml:space="preserve">herramientas entregadas y los servicios contratados en cada obra.</w:t>
-      </w:r>
-    </w:p>
-    <w:p>
-      <w:pPr>
-        <w:numPr>
-          <w:ilvl w:val="0"/>
-          <w:numId w:val="1014"/>
-        </w:numPr>
-        <w:pStyle w:val="Compact"/>
-      </w:pPr>
-      <w:r>
-        <w:rPr>
-          <w:bCs/>
-          <w:b/>
-        </w:rPr>
-        <w:t xml:space="preserve">Necesidades de seguimiento:</w:t>
-      </w:r>
-      <w:r>
-        <w:t xml:space="preserve"> </w:t>
-      </w:r>
-      <w:r>
-        <w:t xml:space="preserve">hacer seguimiento a los responsables de actividades y</w:t>
-      </w:r>
-      <w:r>
-        <w:t xml:space="preserve"> </w:t>
-      </w:r>
-      <w:r>
-        <w:t xml:space="preserve">a los recursos utilizados en cada proyecto.</w:t>
-      </w:r>
-    </w:p>
-    <w:p>
-      <w:pPr>
-        <w:numPr>
-          <w:ilvl w:val="0"/>
-          <w:numId w:val="1014"/>
-        </w:numPr>
-        <w:pStyle w:val="Compact"/>
-      </w:pPr>
-      <w:r>
-        <w:rPr>
-          <w:bCs/>
-          <w:b/>
-        </w:rPr>
-        <w:t xml:space="preserve">Necesidades de trazabilidad:</w:t>
-      </w:r>
-      <w:r>
-        <w:t xml:space="preserve"> </w:t>
-      </w:r>
-      <w:r>
-        <w:t xml:space="preserve">poder reconstruir el historial de materiales,</w:t>
-      </w:r>
-      <w:r>
-        <w:t xml:space="preserve"> </w:t>
-      </w:r>
-      <w:r>
-        <w:t xml:space="preserve">herramientas y asignaciones de personal por proyecto.</w:t>
-      </w:r>
-    </w:p>
-    <w:p>
-      <w:pPr>
-        <w:numPr>
-          <w:ilvl w:val="0"/>
-          <w:numId w:val="1014"/>
+          <w:numId w:val="1013"/>
         </w:numPr>
         <w:pStyle w:val="Compact"/>
       </w:pPr>
@@ -8763,6 +8664,110 @@
       <w:pPr>
         <w:numPr>
           <w:ilvl w:val="0"/>
+          <w:numId w:val="1014"/>
+        </w:numPr>
+        <w:pStyle w:val="Compact"/>
+      </w:pPr>
+      <w:r>
+        <w:rPr>
+          <w:bCs/>
+          <w:b/>
+        </w:rPr>
+        <w:t xml:space="preserve">CU-01 (HU-01) — Registrar usuario y asignar rol.</w:t>
+      </w:r>
+      <w:r>
+        <w:t xml:space="preserve"> </w:t>
+      </w:r>
+      <w:r>
+        <w:rPr>
+          <w:iCs/>
+          <w:i/>
+        </w:rPr>
+        <w:t xml:space="preserve">Actor:</w:t>
+      </w:r>
+      <w:r>
+        <w:t xml:space="preserve"> </w:t>
+      </w:r>
+      <w:r>
+        <w:t xml:space="preserve">Administrador.</w:t>
+      </w:r>
+      <w:r>
+        <w:t xml:space="preserve"> </w:t>
+      </w:r>
+      <w:r>
+        <w:rPr>
+          <w:iCs/>
+          <w:i/>
+        </w:rPr>
+        <w:t xml:space="preserve">Precondición:</w:t>
+      </w:r>
+      <w:r>
+        <w:t xml:space="preserve"> </w:t>
+      </w:r>
+      <w:r>
+        <w:t xml:space="preserve">el rol a asignar ya existe.</w:t>
+      </w:r>
+      <w:r>
+        <w:t xml:space="preserve"> </w:t>
+      </w:r>
+      <w:r>
+        <w:rPr>
+          <w:iCs/>
+          <w:i/>
+        </w:rPr>
+        <w:t xml:space="preserve">Flujo principal:</w:t>
+      </w:r>
+      <w:r>
+        <w:t xml:space="preserve"> </w:t>
+      </w:r>
+      <w:r>
+        <w:t xml:space="preserve">el administrador</w:t>
+      </w:r>
+      <w:r>
+        <w:t xml:space="preserve"> </w:t>
+      </w:r>
+      <w:r>
+        <w:t xml:space="preserve">ingresa los datos del usuario, selecciona un rol, el sistema crea la cuenta activa.</w:t>
+      </w:r>
+      <w:r>
+        <w:t xml:space="preserve"> </w:t>
+      </w:r>
+      <w:r>
+        <w:rPr>
+          <w:iCs/>
+          <w:i/>
+        </w:rPr>
+        <w:t xml:space="preserve">Flujos alternos:</w:t>
+      </w:r>
+      <w:r>
+        <w:t xml:space="preserve"> </w:t>
+      </w:r>
+      <w:r>
+        <w:t xml:space="preserve">documento/correo duplicado → error de validación; el administrador</w:t>
+      </w:r>
+      <w:r>
+        <w:t xml:space="preserve"> </w:t>
+      </w:r>
+      <w:r>
+        <w:t xml:space="preserve">bloquea o activa un usuario existente.</w:t>
+      </w:r>
+    </w:p>
+    <w:p>
+      <w:pPr>
+        <w:pStyle w:val="FirstParagraph"/>
+      </w:pPr>
+      <w:r>
+        <w:rPr>
+          <w:bCs/>
+          <w:b/>
+        </w:rPr>
+        <w:t xml:space="preserve">Épica 2: Gestión de proyectos y planificación</w:t>
+      </w:r>
+    </w:p>
+    <w:p>
+      <w:pPr>
+        <w:numPr>
+          <w:ilvl w:val="0"/>
           <w:numId w:val="1015"/>
         </w:numPr>
         <w:pStyle w:val="Compact"/>
@@ -8772,7 +8777,7 @@
           <w:bCs/>
           <w:b/>
         </w:rPr>
-        <w:t xml:space="preserve">CU-01 (HU-01) — Registrar usuario y asignar rol.</w:t>
+        <w:t xml:space="preserve">CU-02 (HU-02) — Registrar proyecto.</w:t>
       </w:r>
       <w:r>
         <w:t xml:space="preserve"> </w:t>
@@ -8798,13 +8803,35 @@
           <w:iCs/>
           <w:i/>
         </w:rPr>
-        <w:t xml:space="preserve">Precondición:</w:t>
-      </w:r>
-      <w:r>
-        <w:t xml:space="preserve"> </w:t>
-      </w:r>
-      <w:r>
-        <w:t xml:space="preserve">el rol a asignar ya existe.</w:t>
+        <w:t xml:space="preserve">Flujo principal:</w:t>
+      </w:r>
+      <w:r>
+        <w:t xml:space="preserve"> </w:t>
+      </w:r>
+      <w:r>
+        <w:t xml:space="preserve">ingresa ubicación, cliente, fechas y estado inicial; el proyecto queda en estado</w:t>
+      </w:r>
+      <w:r>
+        <w:t xml:space="preserve"> </w:t>
+      </w:r>
+      <w:r>
+        <w:t xml:space="preserve">PLANIFICACION.</w:t>
+      </w:r>
+    </w:p>
+    <w:p>
+      <w:pPr>
+        <w:numPr>
+          <w:ilvl w:val="0"/>
+          <w:numId w:val="1015"/>
+        </w:numPr>
+        <w:pStyle w:val="Compact"/>
+      </w:pPr>
+      <w:r>
+        <w:rPr>
+          <w:bCs/>
+          <w:b/>
+        </w:rPr>
+        <w:t xml:space="preserve">CU-03 (HU-03) — Definir plan de trabajo (etapas y actividades).</w:t>
       </w:r>
       <w:r>
         <w:t xml:space="preserve"> </w:t>
@@ -8814,19 +8841,13 @@
           <w:iCs/>
           <w:i/>
         </w:rPr>
-        <w:t xml:space="preserve">Flujo principal:</w:t>
-      </w:r>
-      <w:r>
-        <w:t xml:space="preserve"> </w:t>
-      </w:r>
-      <w:r>
-        <w:t xml:space="preserve">el administrador</w:t>
-      </w:r>
-      <w:r>
-        <w:t xml:space="preserve"> </w:t>
-      </w:r>
-      <w:r>
-        <w:t xml:space="preserve">ingresa los datos del usuario, selecciona un rol, el sistema crea la cuenta activa.</w:t>
+        <w:t xml:space="preserve">Actor:</w:t>
+      </w:r>
+      <w:r>
+        <w:t xml:space="preserve"> </w:t>
+      </w:r>
+      <w:r>
+        <w:t xml:space="preserve">Administrador.</w:t>
       </w:r>
       <w:r>
         <w:t xml:space="preserve"> </w:t>
@@ -8836,19 +8857,51 @@
           <w:iCs/>
           <w:i/>
         </w:rPr>
-        <w:t xml:space="preserve">Flujos alternos:</w:t>
-      </w:r>
-      <w:r>
-        <w:t xml:space="preserve"> </w:t>
-      </w:r>
-      <w:r>
-        <w:t xml:space="preserve">documento/correo duplicado → error de validación; el administrador</w:t>
-      </w:r>
-      <w:r>
-        <w:t xml:space="preserve"> </w:t>
-      </w:r>
-      <w:r>
-        <w:t xml:space="preserve">bloquea o activa un usuario existente.</w:t>
+        <w:t xml:space="preserve">Precondición:</w:t>
+      </w:r>
+      <w:r>
+        <w:t xml:space="preserve"> </w:t>
+      </w:r>
+      <w:r>
+        <w:t xml:space="preserve">el proyecto existe.</w:t>
+      </w:r>
+      <w:r>
+        <w:t xml:space="preserve"> </w:t>
+      </w:r>
+      <w:r>
+        <w:rPr>
+          <w:iCs/>
+          <w:i/>
+        </w:rPr>
+        <w:t xml:space="preserve">Flujo principal:</w:t>
+      </w:r>
+      <w:r>
+        <w:t xml:space="preserve"> </w:t>
+      </w:r>
+      <w:r>
+        <w:t xml:space="preserve">crea etapas</w:t>
+      </w:r>
+      <w:r>
+        <w:t xml:space="preserve"> </w:t>
+      </w:r>
+      <w:r>
+        <w:t xml:space="preserve">ordenadas dentro del proyecto y actividades dentro de cada etapa.</w:t>
+      </w:r>
+      <w:r>
+        <w:t xml:space="preserve"> </w:t>
+      </w:r>
+      <w:r>
+        <w:rPr>
+          <w:iCs/>
+          <w:i/>
+        </w:rPr>
+        <w:t xml:space="preserve">Flujo alterno:</w:t>
+      </w:r>
+      <w:r>
+        <w:t xml:space="preserve"> </w:t>
+      </w:r>
+      <w:r>
+        <w:t xml:space="preserve">intento de crear actividad sin etapa válida → rechazado.</w:t>
       </w:r>
     </w:p>
     <w:p>
@@ -8860,7 +8913,7 @@
           <w:bCs/>
           <w:b/>
         </w:rPr>
-        <w:t xml:space="preserve">Épica 2: Gestión de proyectos y planificación</w:t>
+        <w:t xml:space="preserve">Épica 3: Personal y asignaciones</w:t>
       </w:r>
     </w:p>
     <w:p>
@@ -8876,7 +8929,7 @@
           <w:bCs/>
           <w:b/>
         </w:rPr>
-        <w:t xml:space="preserve">CU-02 (HU-02) — Registrar proyecto.</w:t>
+        <w:t xml:space="preserve">CU-04 (HU-04) — Registrar personal.</w:t>
       </w:r>
       <w:r>
         <w:t xml:space="preserve"> </w:t>
@@ -8908,13 +8961,7 @@
         <w:t xml:space="preserve"> </w:t>
       </w:r>
       <w:r>
-        <w:t xml:space="preserve">ingresa ubicación, cliente, fechas y estado inicial; el proyecto queda en estado</w:t>
-      </w:r>
-      <w:r>
-        <w:t xml:space="preserve"> </w:t>
-      </w:r>
-      <w:r>
-        <w:t xml:space="preserve">PLANIFICACION.</w:t>
+        <w:t xml:space="preserve">registra datos de contacto, cargo, especialidad y fecha de contratación.</w:t>
       </w:r>
     </w:p>
     <w:p>
@@ -8930,7 +8977,7 @@
           <w:bCs/>
           <w:b/>
         </w:rPr>
-        <w:t xml:space="preserve">CU-03 (HU-03) — Definir plan de trabajo (etapas y actividades).</w:t>
+        <w:t xml:space="preserve">CU-05 (HU-05) — Asignar responsable a proyecto/actividad.</w:t>
       </w:r>
       <w:r>
         <w:t xml:space="preserve"> </w:t>
@@ -8956,13 +9003,19 @@
           <w:iCs/>
           <w:i/>
         </w:rPr>
-        <w:t xml:space="preserve">Precondición:</w:t>
-      </w:r>
-      <w:r>
-        <w:t xml:space="preserve"> </w:t>
-      </w:r>
-      <w:r>
-        <w:t xml:space="preserve">el proyecto existe.</w:t>
+        <w:t xml:space="preserve">Flujo principal:</w:t>
+      </w:r>
+      <w:r>
+        <w:t xml:space="preserve"> </w:t>
+      </w:r>
+      <w:r>
+        <w:t xml:space="preserve">selecciona trabajador, proyecto o actividad y fecha de inicio; el</w:t>
+      </w:r>
+      <w:r>
+        <w:t xml:space="preserve"> </w:t>
+      </w:r>
+      <w:r>
+        <w:t xml:space="preserve">sistema registra la asignación como ACTIVO.</w:t>
       </w:r>
       <w:r>
         <w:t xml:space="preserve"> </w:t>
@@ -8972,19 +9025,35 @@
           <w:iCs/>
           <w:i/>
         </w:rPr>
-        <w:t xml:space="preserve">Flujo principal:</w:t>
-      </w:r>
-      <w:r>
-        <w:t xml:space="preserve"> </w:t>
-      </w:r>
-      <w:r>
-        <w:t xml:space="preserve">crea etapas</w:t>
-      </w:r>
-      <w:r>
-        <w:t xml:space="preserve"> </w:t>
-      </w:r>
-      <w:r>
-        <w:t xml:space="preserve">ordenadas dentro del proyecto y actividades dentro de cada etapa.</w:t>
+        <w:t xml:space="preserve">Flujo alterno:</w:t>
+      </w:r>
+      <w:r>
+        <w:t xml:space="preserve"> </w:t>
+      </w:r>
+      <w:r>
+        <w:t xml:space="preserve">define fecha fin</w:t>
+      </w:r>
+      <w:r>
+        <w:t xml:space="preserve"> </w:t>
+      </w:r>
+      <w:r>
+        <w:t xml:space="preserve">programada para cerrar el periodo.</w:t>
+      </w:r>
+    </w:p>
+    <w:p>
+      <w:pPr>
+        <w:numPr>
+          <w:ilvl w:val="0"/>
+          <w:numId w:val="1016"/>
+        </w:numPr>
+        <w:pStyle w:val="Compact"/>
+      </w:pPr>
+      <w:r>
+        <w:rPr>
+          <w:bCs/>
+          <w:b/>
+        </w:rPr>
+        <w:t xml:space="preserve">CU-06 (HU-06) — Consultar historial de asignaciones.</w:t>
       </w:r>
       <w:r>
         <w:t xml:space="preserve"> </w:t>
@@ -8994,13 +9063,35 @@
           <w:iCs/>
           <w:i/>
         </w:rPr>
-        <w:t xml:space="preserve">Flujo alterno:</w:t>
-      </w:r>
-      <w:r>
-        <w:t xml:space="preserve"> </w:t>
-      </w:r>
-      <w:r>
-        <w:t xml:space="preserve">intento de crear actividad sin etapa válida → rechazado.</w:t>
+        <w:t xml:space="preserve">Actor:</w:t>
+      </w:r>
+      <w:r>
+        <w:t xml:space="preserve"> </w:t>
+      </w:r>
+      <w:r>
+        <w:t xml:space="preserve">Administrador.</w:t>
+      </w:r>
+      <w:r>
+        <w:t xml:space="preserve"> </w:t>
+      </w:r>
+      <w:r>
+        <w:rPr>
+          <w:iCs/>
+          <w:i/>
+        </w:rPr>
+        <w:t xml:space="preserve">Flujo principal:</w:t>
+      </w:r>
+      <w:r>
+        <w:t xml:space="preserve"> </w:t>
+      </w:r>
+      <w:r>
+        <w:t xml:space="preserve">busca un trabajador y visualiza el listado de proyectos, fechas de</w:t>
+      </w:r>
+      <w:r>
+        <w:t xml:space="preserve"> </w:t>
+      </w:r>
+      <w:r>
+        <w:t xml:space="preserve">inicio y fin.</w:t>
       </w:r>
     </w:p>
     <w:p>
@@ -9012,7 +9103,7 @@
           <w:bCs/>
           <w:b/>
         </w:rPr>
-        <w:t xml:space="preserve">Épica 3: Personal y asignaciones</w:t>
+        <w:t xml:space="preserve">Épica 4: Inventario de materiales</w:t>
       </w:r>
     </w:p>
     <w:p>
@@ -9028,7 +9119,7 @@
           <w:bCs/>
           <w:b/>
         </w:rPr>
-        <w:t xml:space="preserve">CU-04 (HU-04) — Registrar personal.</w:t>
+        <w:t xml:space="preserve">CU-07 (HU-07) — Mantener catálogo de materiales.</w:t>
       </w:r>
       <w:r>
         <w:t xml:space="preserve"> </w:t>
@@ -9044,7 +9135,7 @@
         <w:t xml:space="preserve"> </w:t>
       </w:r>
       <w:r>
-        <w:t xml:space="preserve">Administrador.</w:t>
+        <w:t xml:space="preserve">Encargado de bodega.</w:t>
       </w:r>
       <w:r>
         <w:t xml:space="preserve"> </w:t>
@@ -9060,7 +9151,13 @@
         <w:t xml:space="preserve"> </w:t>
       </w:r>
       <w:r>
-        <w:t xml:space="preserve">registra datos de contacto, cargo, especialidad y fecha de contratación.</w:t>
+        <w:t xml:space="preserve">crea/edita/consulta materiales con código, categoría, unidad,</w:t>
+      </w:r>
+      <w:r>
+        <w:t xml:space="preserve"> </w:t>
+      </w:r>
+      <w:r>
+        <w:t xml:space="preserve">costo de referencia y nivel mínimo.</w:t>
       </w:r>
     </w:p>
     <w:p>
@@ -9076,7 +9173,7 @@
           <w:bCs/>
           <w:b/>
         </w:rPr>
-        <w:t xml:space="preserve">CU-05 (HU-05) — Asignar responsable a proyecto/actividad.</w:t>
+        <w:t xml:space="preserve">CU-08 (HU-08) — Solicitar materiales.</w:t>
       </w:r>
       <w:r>
         <w:t xml:space="preserve"> </w:t>
@@ -9092,7 +9189,7 @@
         <w:t xml:space="preserve"> </w:t>
       </w:r>
       <w:r>
-        <w:t xml:space="preserve">Administrador.</w:t>
+        <w:t xml:space="preserve">Maestro de obra.</w:t>
       </w:r>
       <w:r>
         <w:t xml:space="preserve"> </w:t>
@@ -9102,19 +9199,13 @@
           <w:iCs/>
           <w:i/>
         </w:rPr>
-        <w:t xml:space="preserve">Flujo principal:</w:t>
-      </w:r>
-      <w:r>
-        <w:t xml:space="preserve"> </w:t>
-      </w:r>
-      <w:r>
-        <w:t xml:space="preserve">selecciona trabajador, proyecto o actividad y fecha de inicio; el</w:t>
-      </w:r>
-      <w:r>
-        <w:t xml:space="preserve"> </w:t>
-      </w:r>
-      <w:r>
-        <w:t xml:space="preserve">sistema registra la asignación como ACTIVO.</w:t>
+        <w:t xml:space="preserve">Precondición:</w:t>
+      </w:r>
+      <w:r>
+        <w:t xml:space="preserve"> </w:t>
+      </w:r>
+      <w:r>
+        <w:t xml:space="preserve">el proyecto y el material existen.</w:t>
       </w:r>
       <w:r>
         <w:t xml:space="preserve"> </w:t>
@@ -9124,19 +9215,41 @@
           <w:iCs/>
           <w:i/>
         </w:rPr>
+        <w:t xml:space="preserve">Flujo principal:</w:t>
+      </w:r>
+      <w:r>
+        <w:t xml:space="preserve"> </w:t>
+      </w:r>
+      <w:r>
+        <w:t xml:space="preserve">solicita cantidad de un material</w:t>
+      </w:r>
+      <w:r>
+        <w:t xml:space="preserve"> </w:t>
+      </w:r>
+      <w:r>
+        <w:t xml:space="preserve">para el proyecto.</w:t>
+      </w:r>
+      <w:r>
+        <w:t xml:space="preserve"> </w:t>
+      </w:r>
+      <w:r>
+        <w:rPr>
+          <w:iCs/>
+          <w:i/>
+        </w:rPr>
         <w:t xml:space="preserve">Flujo alterno:</w:t>
       </w:r>
       <w:r>
         <w:t xml:space="preserve"> </w:t>
       </w:r>
       <w:r>
-        <w:t xml:space="preserve">define fecha fin</w:t>
-      </w:r>
-      <w:r>
-        <w:t xml:space="preserve"> </w:t>
-      </w:r>
-      <w:r>
-        <w:t xml:space="preserve">programada para cerrar el periodo.</w:t>
+        <w:t xml:space="preserve">existencia insuficiente → la solicitud no descuenta</w:t>
+      </w:r>
+      <w:r>
+        <w:t xml:space="preserve"> </w:t>
+      </w:r>
+      <w:r>
+        <w:t xml:space="preserve">inventario.</w:t>
       </w:r>
     </w:p>
     <w:p>
@@ -9152,7 +9265,7 @@
           <w:bCs/>
           <w:b/>
         </w:rPr>
-        <w:t xml:space="preserve">CU-06 (HU-06) — Consultar historial de asignaciones.</w:t>
+        <w:t xml:space="preserve">CU-09 (HU-09) — Devolver materiales sobrantes.</w:t>
       </w:r>
       <w:r>
         <w:t xml:space="preserve"> </w:t>
@@ -9168,7 +9281,7 @@
         <w:t xml:space="preserve"> </w:t>
       </w:r>
       <w:r>
-        <w:t xml:space="preserve">Administrador.</w:t>
+        <w:t xml:space="preserve">Encargado de bodega.</w:t>
       </w:r>
       <w:r>
         <w:t xml:space="preserve"> </w:t>
@@ -9178,31 +9291,373 @@
           <w:iCs/>
           <w:i/>
         </w:rPr>
+        <w:t xml:space="preserve">Precondición:</w:t>
+      </w:r>
+      <w:r>
+        <w:t xml:space="preserve"> </w:t>
+      </w:r>
+      <w:r>
+        <w:t xml:space="preserve">existe una solicitud previa del proyecto.</w:t>
+      </w:r>
+      <w:r>
+        <w:t xml:space="preserve"> </w:t>
+      </w:r>
+      <w:r>
+        <w:rPr>
+          <w:iCs/>
+          <w:i/>
+        </w:rPr>
         <w:t xml:space="preserve">Flujo principal:</w:t>
       </w:r>
       <w:r>
         <w:t xml:space="preserve"> </w:t>
       </w:r>
       <w:r>
-        <w:t xml:space="preserve">busca un trabajador y visualiza el listado de proyectos, fechas de</w:t>
-      </w:r>
-      <w:r>
-        <w:t xml:space="preserve"> </w:t>
-      </w:r>
-      <w:r>
-        <w:t xml:space="preserve">inicio y fin.</w:t>
-      </w:r>
-    </w:p>
-    <w:p>
-      <w:pPr>
-        <w:pStyle w:val="FirstParagraph"/>
+        <w:t xml:space="preserve">registra</w:t>
+      </w:r>
+      <w:r>
+        <w:t xml:space="preserve"> </w:t>
+      </w:r>
+      <w:r>
+        <w:t xml:space="preserve">la devolución vinculada a la solicitud; el inventario disponible se actualiza.</w:t>
+      </w:r>
+    </w:p>
+    <w:p>
+      <w:pPr>
+        <w:numPr>
+          <w:ilvl w:val="0"/>
+          <w:numId w:val="1017"/>
+        </w:numPr>
+        <w:pStyle w:val="Compact"/>
       </w:pPr>
       <w:r>
         <w:rPr>
           <w:bCs/>
           <w:b/>
         </w:rPr>
-        <w:t xml:space="preserve">Épica 4: Inventario de materiales</w:t>
+        <w:t xml:space="preserve">CU-19 (HU-19) — Ingresar materiales al inventario.</w:t>
+      </w:r>
+      <w:r>
+        <w:t xml:space="preserve"> </w:t>
+      </w:r>
+      <w:r>
+        <w:rPr>
+          <w:iCs/>
+          <w:i/>
+        </w:rPr>
+        <w:t xml:space="preserve">Actor:</w:t>
+      </w:r>
+      <w:r>
+        <w:t xml:space="preserve"> </w:t>
+      </w:r>
+      <w:r>
+        <w:t xml:space="preserve">Encargado de bodega.</w:t>
+      </w:r>
+      <w:r>
+        <w:t xml:space="preserve"> </w:t>
+      </w:r>
+      <w:r>
+        <w:rPr>
+          <w:iCs/>
+          <w:i/>
+        </w:rPr>
+        <w:t xml:space="preserve">Flujo principal:</w:t>
+      </w:r>
+      <w:r>
+        <w:t xml:space="preserve"> </w:t>
+      </w:r>
+      <w:r>
+        <w:t xml:space="preserve">registra cantidad, fecha, proveedor, costo y responsable de un</w:t>
+      </w:r>
+      <w:r>
+        <w:t xml:space="preserve"> </w:t>
+      </w:r>
+      <w:r>
+        <w:t xml:space="preserve">ingreso de mercancía.</w:t>
+      </w:r>
+    </w:p>
+    <w:p>
+      <w:pPr>
+        <w:numPr>
+          <w:ilvl w:val="0"/>
+          <w:numId w:val="1017"/>
+        </w:numPr>
+        <w:pStyle w:val="Compact"/>
+      </w:pPr>
+      <w:r>
+        <w:rPr>
+          <w:bCs/>
+          <w:b/>
+        </w:rPr>
+        <w:t xml:space="preserve">CU-20 (HU-20) — Registrar consumo real de materiales.</w:t>
+      </w:r>
+      <w:r>
+        <w:t xml:space="preserve"> </w:t>
+      </w:r>
+      <w:r>
+        <w:rPr>
+          <w:iCs/>
+          <w:i/>
+        </w:rPr>
+        <w:t xml:space="preserve">Actor:</w:t>
+      </w:r>
+      <w:r>
+        <w:t xml:space="preserve"> </w:t>
+      </w:r>
+      <w:r>
+        <w:t xml:space="preserve">Maestro de obra.</w:t>
+      </w:r>
+      <w:r>
+        <w:t xml:space="preserve"> </w:t>
+      </w:r>
+      <w:r>
+        <w:rPr>
+          <w:iCs/>
+          <w:i/>
+        </w:rPr>
+        <w:t xml:space="preserve">Flujo principal:</w:t>
+      </w:r>
+      <w:r>
+        <w:t xml:space="preserve"> </w:t>
+      </w:r>
+      <w:r>
+        <w:t xml:space="preserve">registra el consumo de un material en una actividad; las</w:t>
+      </w:r>
+      <w:r>
+        <w:t xml:space="preserve"> </w:t>
+      </w:r>
+      <w:r>
+        <w:t xml:space="preserve">existencias se descuentan automáticamente.</w:t>
+      </w:r>
+    </w:p>
+    <w:p>
+      <w:pPr>
+        <w:numPr>
+          <w:ilvl w:val="0"/>
+          <w:numId w:val="1017"/>
+        </w:numPr>
+        <w:pStyle w:val="Compact"/>
+      </w:pPr>
+      <w:r>
+        <w:rPr>
+          <w:bCs/>
+          <w:b/>
+        </w:rPr>
+        <w:t xml:space="preserve">CU-26 (HU-26) — Registrar salida efectiva de materiales.</w:t>
+      </w:r>
+      <w:r>
+        <w:t xml:space="preserve"> </w:t>
+      </w:r>
+      <w:r>
+        <w:rPr>
+          <w:iCs/>
+          <w:i/>
+        </w:rPr>
+        <w:t xml:space="preserve">Actor:</w:t>
+      </w:r>
+      <w:r>
+        <w:t xml:space="preserve"> </w:t>
+      </w:r>
+      <w:r>
+        <w:t xml:space="preserve">Encargado de</w:t>
+      </w:r>
+      <w:r>
+        <w:t xml:space="preserve"> </w:t>
+      </w:r>
+      <w:r>
+        <w:t xml:space="preserve">bodega.</w:t>
+      </w:r>
+      <w:r>
+        <w:t xml:space="preserve"> </w:t>
+      </w:r>
+      <w:r>
+        <w:rPr>
+          <w:iCs/>
+          <w:i/>
+        </w:rPr>
+        <w:t xml:space="preserve">Precondición:</w:t>
+      </w:r>
+      <w:r>
+        <w:t xml:space="preserve"> </w:t>
+      </w:r>
+      <w:r>
+        <w:t xml:space="preserve">existe una solicitud registrada del proyecto.</w:t>
+      </w:r>
+      <w:r>
+        <w:t xml:space="preserve"> </w:t>
+      </w:r>
+      <w:r>
+        <w:rPr>
+          <w:iCs/>
+          <w:i/>
+        </w:rPr>
+        <w:t xml:space="preserve">Flujo</w:t>
+      </w:r>
+      <w:r>
+        <w:rPr>
+          <w:iCs/>
+          <w:i/>
+        </w:rPr>
+        <w:t xml:space="preserve"> </w:t>
+      </w:r>
+      <w:r>
+        <w:rPr>
+          <w:iCs/>
+          <w:i/>
+        </w:rPr>
+        <w:t xml:space="preserve">principal:</w:t>
+      </w:r>
+      <w:r>
+        <w:t xml:space="preserve"> </w:t>
+      </w:r>
+      <w:r>
+        <w:t xml:space="preserve">despacha materiales vinculados a la solicitud.</w:t>
+      </w:r>
+      <w:r>
+        <w:t xml:space="preserve"> </w:t>
+      </w:r>
+      <w:r>
+        <w:rPr>
+          <w:iCs/>
+          <w:i/>
+        </w:rPr>
+        <w:t xml:space="preserve">Flujo alterno:</w:t>
+      </w:r>
+      <w:r>
+        <w:t xml:space="preserve"> </w:t>
+      </w:r>
+      <w:r>
+        <w:t xml:space="preserve">cantidad</w:t>
+      </w:r>
+      <w:r>
+        <w:t xml:space="preserve"> </w:t>
+      </w:r>
+      <w:r>
+        <w:t xml:space="preserve">despachada mayor a la solicitada o a las existencias → rechazado.</w:t>
+      </w:r>
+    </w:p>
+    <w:p>
+      <w:pPr>
+        <w:numPr>
+          <w:ilvl w:val="0"/>
+          <w:numId w:val="1017"/>
+        </w:numPr>
+        <w:pStyle w:val="Compact"/>
+      </w:pPr>
+      <w:r>
+        <w:rPr>
+          <w:bCs/>
+          <w:b/>
+        </w:rPr>
+        <w:t xml:space="preserve">CU-29 (HU-29) — Trasladar materiales entre almacenes.</w:t>
+      </w:r>
+      <w:r>
+        <w:t xml:space="preserve"> </w:t>
+      </w:r>
+      <w:r>
+        <w:rPr>
+          <w:iCs/>
+          <w:i/>
+        </w:rPr>
+        <w:t xml:space="preserve">Actor:</w:t>
+      </w:r>
+      <w:r>
+        <w:t xml:space="preserve"> </w:t>
+      </w:r>
+      <w:r>
+        <w:t xml:space="preserve">Encargado de</w:t>
+      </w:r>
+      <w:r>
+        <w:t xml:space="preserve"> </w:t>
+      </w:r>
+      <w:r>
+        <w:t xml:space="preserve">bodega.</w:t>
+      </w:r>
+      <w:r>
+        <w:t xml:space="preserve"> </w:t>
+      </w:r>
+      <w:r>
+        <w:rPr>
+          <w:iCs/>
+          <w:i/>
+        </w:rPr>
+        <w:t xml:space="preserve">Precondición:</w:t>
+      </w:r>
+      <w:r>
+        <w:t xml:space="preserve"> </w:t>
+      </w:r>
+      <w:r>
+        <w:t xml:space="preserve">el material existe en el almacén de origen con existencia</w:t>
+      </w:r>
+      <w:r>
+        <w:t xml:space="preserve"> </w:t>
+      </w:r>
+      <w:r>
+        <w:t xml:space="preserve">suficiente.</w:t>
+      </w:r>
+      <w:r>
+        <w:t xml:space="preserve"> </w:t>
+      </w:r>
+      <w:r>
+        <w:rPr>
+          <w:iCs/>
+          <w:i/>
+        </w:rPr>
+        <w:t xml:space="preserve">Flujo principal:</w:t>
+      </w:r>
+      <w:r>
+        <w:t xml:space="preserve"> </w:t>
+      </w:r>
+      <w:r>
+        <w:t xml:space="preserve">selecciona almacén de origen, almacén de destino,</w:t>
+      </w:r>
+      <w:r>
+        <w:t xml:space="preserve"> </w:t>
+      </w:r>
+      <w:r>
+        <w:t xml:space="preserve">material y cantidad; el sistema descuenta del origen y suma al destino.</w:t>
+      </w:r>
+      <w:r>
+        <w:t xml:space="preserve"> </w:t>
+      </w:r>
+      <w:r>
+        <w:rPr>
+          <w:iCs/>
+          <w:i/>
+        </w:rPr>
+        <w:t xml:space="preserve">Flujo</w:t>
+      </w:r>
+      <w:r>
+        <w:rPr>
+          <w:iCs/>
+          <w:i/>
+        </w:rPr>
+        <w:t xml:space="preserve"> </w:t>
+      </w:r>
+      <w:r>
+        <w:rPr>
+          <w:iCs/>
+          <w:i/>
+        </w:rPr>
+        <w:t xml:space="preserve">alterno:</w:t>
+      </w:r>
+      <w:r>
+        <w:t xml:space="preserve"> </w:t>
+      </w:r>
+      <w:r>
+        <w:t xml:space="preserve">cantidad mayor a la existencia en origen → rechazado.</w:t>
+      </w:r>
+    </w:p>
+    <w:p>
+      <w:pPr>
+        <w:pStyle w:val="FirstParagraph"/>
+      </w:pPr>
+      <w:r>
+        <w:rPr>
+          <w:bCs/>
+          <w:b/>
+        </w:rPr>
+        <w:t xml:space="preserve">Épica 5: Inventario de herramientas</w:t>
       </w:r>
     </w:p>
     <w:p>
@@ -9218,7 +9673,7 @@
           <w:bCs/>
           <w:b/>
         </w:rPr>
-        <w:t xml:space="preserve">CU-07 (HU-07) — Mantener catálogo de materiales.</w:t>
+        <w:t xml:space="preserve">CU-10 (HU-10) — Mantener catálogo de herramientas.</w:t>
       </w:r>
       <w:r>
         <w:t xml:space="preserve"> </w:t>
@@ -9250,13 +9705,13 @@
         <w:t xml:space="preserve"> </w:t>
       </w:r>
       <w:r>
-        <w:t xml:space="preserve">crea/edita/consulta materiales con código, categoría, unidad,</w:t>
-      </w:r>
-      <w:r>
-        <w:t xml:space="preserve"> </w:t>
-      </w:r>
-      <w:r>
-        <w:t xml:space="preserve">costo de referencia y nivel mínimo.</w:t>
+        <w:t xml:space="preserve">crea/edita/consulta herramientas con su estado operativo (excelente</w:t>
+      </w:r>
+      <w:r>
+        <w:t xml:space="preserve"> </w:t>
+      </w:r>
+      <w:r>
+        <w:t xml:space="preserve">a dañada), su disponibilidad (disponible, prestada, en traslado, baja) y su almacén.</w:t>
       </w:r>
     </w:p>
     <w:p>
@@ -9272,7 +9727,7 @@
           <w:bCs/>
           <w:b/>
         </w:rPr>
-        <w:t xml:space="preserve">CU-08 (HU-08) — Solicitar materiales.</w:t>
+        <w:t xml:space="preserve">CU-11 (HU-11) — Entregar herramienta a trabajador.</w:t>
       </w:r>
       <w:r>
         <w:t xml:space="preserve"> </w:t>
@@ -9288,7 +9743,7 @@
         <w:t xml:space="preserve"> </w:t>
       </w:r>
       <w:r>
-        <w:t xml:space="preserve">Maestro de obra.</w:t>
+        <w:t xml:space="preserve">Encargado de bodega.</w:t>
       </w:r>
       <w:r>
         <w:t xml:space="preserve"> </w:t>
@@ -9298,57 +9753,19 @@
           <w:iCs/>
           <w:i/>
         </w:rPr>
-        <w:t xml:space="preserve">Precondición:</w:t>
-      </w:r>
-      <w:r>
-        <w:t xml:space="preserve"> </w:t>
-      </w:r>
-      <w:r>
-        <w:t xml:space="preserve">el proyecto y el material existen.</w:t>
-      </w:r>
-      <w:r>
-        <w:t xml:space="preserve"> </w:t>
-      </w:r>
-      <w:r>
-        <w:rPr>
-          <w:iCs/>
-          <w:i/>
-        </w:rPr>
         <w:t xml:space="preserve">Flujo principal:</w:t>
       </w:r>
       <w:r>
         <w:t xml:space="preserve"> </w:t>
       </w:r>
       <w:r>
-        <w:t xml:space="preserve">solicita cantidad de un material</w:t>
-      </w:r>
-      <w:r>
-        <w:t xml:space="preserve"> </w:t>
-      </w:r>
-      <w:r>
-        <w:t xml:space="preserve">para el proyecto.</w:t>
-      </w:r>
-      <w:r>
-        <w:t xml:space="preserve"> </w:t>
-      </w:r>
-      <w:r>
-        <w:rPr>
-          <w:iCs/>
-          <w:i/>
-        </w:rPr>
-        <w:t xml:space="preserve">Flujo alterno:</w:t>
-      </w:r>
-      <w:r>
-        <w:t xml:space="preserve"> </w:t>
-      </w:r>
-      <w:r>
-        <w:t xml:space="preserve">existencia insuficiente → la solicitud no descuenta</w:t>
-      </w:r>
-      <w:r>
-        <w:t xml:space="preserve"> </w:t>
-      </w:r>
-      <w:r>
-        <w:t xml:space="preserve">inventario.</w:t>
+        <w:t xml:space="preserve">registra trabajador, herramienta y fecha de entrega; la herramienta</w:t>
+      </w:r>
+      <w:r>
+        <w:t xml:space="preserve"> </w:t>
+      </w:r>
+      <w:r>
+        <w:t xml:space="preserve">pasa a disponibilidad PRESTADA.</w:t>
       </w:r>
     </w:p>
     <w:p>
@@ -9364,7 +9781,7 @@
           <w:bCs/>
           <w:b/>
         </w:rPr>
-        <w:t xml:space="preserve">CU-09 (HU-09) — Devolver materiales sobrantes.</w:t>
+        <w:t xml:space="preserve">CU-12 (HU-12) — Registrar devolución de herramienta.</w:t>
       </w:r>
       <w:r>
         <w:t xml:space="preserve"> </w:t>
@@ -9390,35 +9807,13 @@
           <w:iCs/>
           <w:i/>
         </w:rPr>
-        <w:t xml:space="preserve">Precondición:</w:t>
-      </w:r>
-      <w:r>
-        <w:t xml:space="preserve"> </w:t>
-      </w:r>
-      <w:r>
-        <w:t xml:space="preserve">existe una solicitud previa del proyecto.</w:t>
-      </w:r>
-      <w:r>
-        <w:t xml:space="preserve"> </w:t>
-      </w:r>
-      <w:r>
-        <w:rPr>
-          <w:iCs/>
-          <w:i/>
-        </w:rPr>
         <w:t xml:space="preserve">Flujo principal:</w:t>
       </w:r>
       <w:r>
         <w:t xml:space="preserve"> </w:t>
       </w:r>
       <w:r>
-        <w:t xml:space="preserve">registra</w:t>
-      </w:r>
-      <w:r>
-        <w:t xml:space="preserve"> </w:t>
-      </w:r>
-      <w:r>
-        <w:t xml:space="preserve">la devolución vinculada a la solicitud; el inventario disponible se actualiza.</w:t>
+        <w:t xml:space="preserve">registra fecha de devolución; la herramienta vuelve a DISPONIBLE.</w:t>
       </w:r>
     </w:p>
     <w:p>
@@ -9434,7 +9829,7 @@
           <w:bCs/>
           <w:b/>
         </w:rPr>
-        <w:t xml:space="preserve">CU-19 (HU-19) — Ingresar materiales al inventario.</w:t>
+        <w:t xml:space="preserve">CU-27 (HU-27) — Consultar historial de movimientos de herramienta.</w:t>
       </w:r>
       <w:r>
         <w:t xml:space="preserve"> </w:t>
@@ -9466,297 +9861,25 @@
         <w:t xml:space="preserve"> </w:t>
       </w:r>
       <w:r>
-        <w:t xml:space="preserve">registra cantidad, fecha, proveedor, costo y responsable de un</w:t>
-      </w:r>
-      <w:r>
-        <w:t xml:space="preserve"> </w:t>
-      </w:r>
-      <w:r>
-        <w:t xml:space="preserve">ingreso de mercancía.</w:t>
-      </w:r>
-    </w:p>
-    <w:p>
-      <w:pPr>
-        <w:numPr>
-          <w:ilvl w:val="0"/>
-          <w:numId w:val="1018"/>
-        </w:numPr>
-        <w:pStyle w:val="Compact"/>
+        <w:t xml:space="preserve">consulta el listado cronológico de</w:t>
+      </w:r>
+      <w:r>
+        <w:t xml:space="preserve"> </w:t>
+      </w:r>
+      <w:r>
+        <w:t xml:space="preserve">entregas/devoluciones/estados de una herramienta.</w:t>
+      </w:r>
+    </w:p>
+    <w:p>
+      <w:pPr>
+        <w:pStyle w:val="FirstParagraph"/>
       </w:pPr>
       <w:r>
         <w:rPr>
           <w:bCs/>
           <w:b/>
         </w:rPr>
-        <w:t xml:space="preserve">CU-20 (HU-20) — Registrar consumo real de materiales.</w:t>
-      </w:r>
-      <w:r>
-        <w:t xml:space="preserve"> </w:t>
-      </w:r>
-      <w:r>
-        <w:rPr>
-          <w:iCs/>
-          <w:i/>
-        </w:rPr>
-        <w:t xml:space="preserve">Actor:</w:t>
-      </w:r>
-      <w:r>
-        <w:t xml:space="preserve"> </w:t>
-      </w:r>
-      <w:r>
-        <w:t xml:space="preserve">Maestro de obra.</w:t>
-      </w:r>
-      <w:r>
-        <w:t xml:space="preserve"> </w:t>
-      </w:r>
-      <w:r>
-        <w:rPr>
-          <w:iCs/>
-          <w:i/>
-        </w:rPr>
-        <w:t xml:space="preserve">Flujo principal:</w:t>
-      </w:r>
-      <w:r>
-        <w:t xml:space="preserve"> </w:t>
-      </w:r>
-      <w:r>
-        <w:t xml:space="preserve">registra el consumo de un material en una actividad; las</w:t>
-      </w:r>
-      <w:r>
-        <w:t xml:space="preserve"> </w:t>
-      </w:r>
-      <w:r>
-        <w:t xml:space="preserve">existencias se descuentan automáticamente.</w:t>
-      </w:r>
-    </w:p>
-    <w:p>
-      <w:pPr>
-        <w:numPr>
-          <w:ilvl w:val="0"/>
-          <w:numId w:val="1018"/>
-        </w:numPr>
-        <w:pStyle w:val="Compact"/>
-      </w:pPr>
-      <w:r>
-        <w:rPr>
-          <w:bCs/>
-          <w:b/>
-        </w:rPr>
-        <w:t xml:space="preserve">CU-26 (HU-26) — Registrar salida efectiva de materiales.</w:t>
-      </w:r>
-      <w:r>
-        <w:t xml:space="preserve"> </w:t>
-      </w:r>
-      <w:r>
-        <w:rPr>
-          <w:iCs/>
-          <w:i/>
-        </w:rPr>
-        <w:t xml:space="preserve">Actor:</w:t>
-      </w:r>
-      <w:r>
-        <w:t xml:space="preserve"> </w:t>
-      </w:r>
-      <w:r>
-        <w:t xml:space="preserve">Encargado de</w:t>
-      </w:r>
-      <w:r>
-        <w:t xml:space="preserve"> </w:t>
-      </w:r>
-      <w:r>
-        <w:t xml:space="preserve">bodega.</w:t>
-      </w:r>
-      <w:r>
-        <w:t xml:space="preserve"> </w:t>
-      </w:r>
-      <w:r>
-        <w:rPr>
-          <w:iCs/>
-          <w:i/>
-        </w:rPr>
-        <w:t xml:space="preserve">Precondición:</w:t>
-      </w:r>
-      <w:r>
-        <w:t xml:space="preserve"> </w:t>
-      </w:r>
-      <w:r>
-        <w:t xml:space="preserve">existe una solicitud registrada del proyecto.</w:t>
-      </w:r>
-      <w:r>
-        <w:t xml:space="preserve"> </w:t>
-      </w:r>
-      <w:r>
-        <w:rPr>
-          <w:iCs/>
-          <w:i/>
-        </w:rPr>
-        <w:t xml:space="preserve">Flujo</w:t>
-      </w:r>
-      <w:r>
-        <w:rPr>
-          <w:iCs/>
-          <w:i/>
-        </w:rPr>
-        <w:t xml:space="preserve"> </w:t>
-      </w:r>
-      <w:r>
-        <w:rPr>
-          <w:iCs/>
-          <w:i/>
-        </w:rPr>
-        <w:t xml:space="preserve">principal:</w:t>
-      </w:r>
-      <w:r>
-        <w:t xml:space="preserve"> </w:t>
-      </w:r>
-      <w:r>
-        <w:t xml:space="preserve">despacha materiales vinculados a la solicitud.</w:t>
-      </w:r>
-      <w:r>
-        <w:t xml:space="preserve"> </w:t>
-      </w:r>
-      <w:r>
-        <w:rPr>
-          <w:iCs/>
-          <w:i/>
-        </w:rPr>
-        <w:t xml:space="preserve">Flujo alterno:</w:t>
-      </w:r>
-      <w:r>
-        <w:t xml:space="preserve"> </w:t>
-      </w:r>
-      <w:r>
-        <w:t xml:space="preserve">cantidad</w:t>
-      </w:r>
-      <w:r>
-        <w:t xml:space="preserve"> </w:t>
-      </w:r>
-      <w:r>
-        <w:t xml:space="preserve">despachada mayor a la solicitada o a las existencias → rechazado.</w:t>
-      </w:r>
-    </w:p>
-    <w:p>
-      <w:pPr>
-        <w:numPr>
-          <w:ilvl w:val="0"/>
-          <w:numId w:val="1018"/>
-        </w:numPr>
-        <w:pStyle w:val="Compact"/>
-      </w:pPr>
-      <w:r>
-        <w:rPr>
-          <w:bCs/>
-          <w:b/>
-        </w:rPr>
-        <w:t xml:space="preserve">CU-29 (HU-29) — Trasladar materiales entre almacenes.</w:t>
-      </w:r>
-      <w:r>
-        <w:t xml:space="preserve"> </w:t>
-      </w:r>
-      <w:r>
-        <w:rPr>
-          <w:iCs/>
-          <w:i/>
-        </w:rPr>
-        <w:t xml:space="preserve">Actor:</w:t>
-      </w:r>
-      <w:r>
-        <w:t xml:space="preserve"> </w:t>
-      </w:r>
-      <w:r>
-        <w:t xml:space="preserve">Encargado de</w:t>
-      </w:r>
-      <w:r>
-        <w:t xml:space="preserve"> </w:t>
-      </w:r>
-      <w:r>
-        <w:t xml:space="preserve">bodega.</w:t>
-      </w:r>
-      <w:r>
-        <w:t xml:space="preserve"> </w:t>
-      </w:r>
-      <w:r>
-        <w:rPr>
-          <w:iCs/>
-          <w:i/>
-        </w:rPr>
-        <w:t xml:space="preserve">Precondición:</w:t>
-      </w:r>
-      <w:r>
-        <w:t xml:space="preserve"> </w:t>
-      </w:r>
-      <w:r>
-        <w:t xml:space="preserve">el material existe en el almacén de origen con existencia</w:t>
-      </w:r>
-      <w:r>
-        <w:t xml:space="preserve"> </w:t>
-      </w:r>
-      <w:r>
-        <w:t xml:space="preserve">suficiente.</w:t>
-      </w:r>
-      <w:r>
-        <w:t xml:space="preserve"> </w:t>
-      </w:r>
-      <w:r>
-        <w:rPr>
-          <w:iCs/>
-          <w:i/>
-        </w:rPr>
-        <w:t xml:space="preserve">Flujo principal:</w:t>
-      </w:r>
-      <w:r>
-        <w:t xml:space="preserve"> </w:t>
-      </w:r>
-      <w:r>
-        <w:t xml:space="preserve">selecciona almacén de origen, almacén de destino,</w:t>
-      </w:r>
-      <w:r>
-        <w:t xml:space="preserve"> </w:t>
-      </w:r>
-      <w:r>
-        <w:t xml:space="preserve">material y cantidad; el sistema descuenta del origen y suma al destino.</w:t>
-      </w:r>
-      <w:r>
-        <w:t xml:space="preserve"> </w:t>
-      </w:r>
-      <w:r>
-        <w:rPr>
-          <w:iCs/>
-          <w:i/>
-        </w:rPr>
-        <w:t xml:space="preserve">Flujo</w:t>
-      </w:r>
-      <w:r>
-        <w:rPr>
-          <w:iCs/>
-          <w:i/>
-        </w:rPr>
-        <w:t xml:space="preserve"> </w:t>
-      </w:r>
-      <w:r>
-        <w:rPr>
-          <w:iCs/>
-          <w:i/>
-        </w:rPr>
-        <w:t xml:space="preserve">alterno:</w:t>
-      </w:r>
-      <w:r>
-        <w:t xml:space="preserve"> </w:t>
-      </w:r>
-      <w:r>
-        <w:t xml:space="preserve">cantidad mayor a la existencia en origen → rechazado.</w:t>
-      </w:r>
-    </w:p>
-    <w:p>
-      <w:pPr>
-        <w:pStyle w:val="FirstParagraph"/>
-      </w:pPr>
-      <w:r>
-        <w:rPr>
-          <w:bCs/>
-          <w:b/>
-        </w:rPr>
-        <w:t xml:space="preserve">Épica 5: Inventario de herramientas</w:t>
+        <w:t xml:space="preserve">Épica 6: Proveedores y servicios externos</w:t>
       </w:r>
     </w:p>
     <w:p>
@@ -9772,7 +9895,7 @@
           <w:bCs/>
           <w:b/>
         </w:rPr>
-        <w:t xml:space="preserve">CU-10 (HU-10) — Mantener catálogo de herramientas.</w:t>
+        <w:t xml:space="preserve">CU-13 (HU-13) — Registrar proveedores y servicios.</w:t>
       </w:r>
       <w:r>
         <w:t xml:space="preserve"> </w:t>
@@ -9788,7 +9911,7 @@
         <w:t xml:space="preserve"> </w:t>
       </w:r>
       <w:r>
-        <w:t xml:space="preserve">Encargado de bodega.</w:t>
+        <w:t xml:space="preserve">Administrador.</w:t>
       </w:r>
       <w:r>
         <w:t xml:space="preserve"> </w:t>
@@ -9804,13 +9927,13 @@
         <w:t xml:space="preserve"> </w:t>
       </w:r>
       <w:r>
-        <w:t xml:space="preserve">crea/edita/consulta herramientas con su estado operativo (excelente</w:t>
-      </w:r>
-      <w:r>
-        <w:t xml:space="preserve"> </w:t>
-      </w:r>
-      <w:r>
-        <w:t xml:space="preserve">a dañada), su disponibilidad (disponible, prestada, en traslado, baja) y su almacén.</w:t>
+        <w:t xml:space="preserve">registra datos del proveedor y contacto; asocia servicios a uno o</w:t>
+      </w:r>
+      <w:r>
+        <w:t xml:space="preserve"> </w:t>
+      </w:r>
+      <w:r>
+        <w:t xml:space="preserve">más proyectos.</w:t>
       </w:r>
     </w:p>
     <w:p>
@@ -9826,7 +9949,7 @@
           <w:bCs/>
           <w:b/>
         </w:rPr>
-        <w:t xml:space="preserve">CU-11 (HU-11) — Entregar herramienta a trabajador.</w:t>
+        <w:t xml:space="preserve">CU-28 (HU-28) — Registrar detalle de servicio externo contratado.</w:t>
       </w:r>
       <w:r>
         <w:t xml:space="preserve"> </w:t>
@@ -9842,7 +9965,7 @@
         <w:t xml:space="preserve"> </w:t>
       </w:r>
       <w:r>
-        <w:t xml:space="preserve">Encargado de bodega.</w:t>
+        <w:t xml:space="preserve">Administrador.</w:t>
       </w:r>
       <w:r>
         <w:t xml:space="preserve"> </w:t>
@@ -9858,127 +9981,25 @@
         <w:t xml:space="preserve"> </w:t>
       </w:r>
       <w:r>
-        <w:t xml:space="preserve">registra trabajador, herramienta y fecha de entrega; la herramienta</w:t>
-      </w:r>
-      <w:r>
-        <w:t xml:space="preserve"> </w:t>
-      </w:r>
-      <w:r>
-        <w:t xml:space="preserve">pasa a disponibilidad PRESTADA.</w:t>
-      </w:r>
-    </w:p>
-    <w:p>
-      <w:pPr>
-        <w:numPr>
-          <w:ilvl w:val="0"/>
-          <w:numId w:val="1019"/>
-        </w:numPr>
-        <w:pStyle w:val="Compact"/>
+        <w:t xml:space="preserve">registra encargado, proyecto/actividad, fechas y</w:t>
+      </w:r>
+      <w:r>
+        <w:t xml:space="preserve"> </w:t>
+      </w:r>
+      <w:r>
+        <w:t xml:space="preserve">valor del servicio contratado.</w:t>
+      </w:r>
+    </w:p>
+    <w:p>
+      <w:pPr>
+        <w:pStyle w:val="FirstParagraph"/>
       </w:pPr>
       <w:r>
         <w:rPr>
           <w:bCs/>
           <w:b/>
         </w:rPr>
-        <w:t xml:space="preserve">CU-12 (HU-12) — Registrar devolución de herramienta.</w:t>
-      </w:r>
-      <w:r>
-        <w:t xml:space="preserve"> </w:t>
-      </w:r>
-      <w:r>
-        <w:rPr>
-          <w:iCs/>
-          <w:i/>
-        </w:rPr>
-        <w:t xml:space="preserve">Actor:</w:t>
-      </w:r>
-      <w:r>
-        <w:t xml:space="preserve"> </w:t>
-      </w:r>
-      <w:r>
-        <w:t xml:space="preserve">Encargado de bodega.</w:t>
-      </w:r>
-      <w:r>
-        <w:t xml:space="preserve"> </w:t>
-      </w:r>
-      <w:r>
-        <w:rPr>
-          <w:iCs/>
-          <w:i/>
-        </w:rPr>
-        <w:t xml:space="preserve">Flujo principal:</w:t>
-      </w:r>
-      <w:r>
-        <w:t xml:space="preserve"> </w:t>
-      </w:r>
-      <w:r>
-        <w:t xml:space="preserve">registra fecha de devolución; la herramienta vuelve a DISPONIBLE.</w:t>
-      </w:r>
-    </w:p>
-    <w:p>
-      <w:pPr>
-        <w:numPr>
-          <w:ilvl w:val="0"/>
-          <w:numId w:val="1019"/>
-        </w:numPr>
-        <w:pStyle w:val="Compact"/>
-      </w:pPr>
-      <w:r>
-        <w:rPr>
-          <w:bCs/>
-          <w:b/>
-        </w:rPr>
-        <w:t xml:space="preserve">CU-27 (HU-27) — Consultar historial de movimientos de herramienta.</w:t>
-      </w:r>
-      <w:r>
-        <w:t xml:space="preserve"> </w:t>
-      </w:r>
-      <w:r>
-        <w:rPr>
-          <w:iCs/>
-          <w:i/>
-        </w:rPr>
-        <w:t xml:space="preserve">Actor:</w:t>
-      </w:r>
-      <w:r>
-        <w:t xml:space="preserve"> </w:t>
-      </w:r>
-      <w:r>
-        <w:t xml:space="preserve">Encargado de bodega.</w:t>
-      </w:r>
-      <w:r>
-        <w:t xml:space="preserve"> </w:t>
-      </w:r>
-      <w:r>
-        <w:rPr>
-          <w:iCs/>
-          <w:i/>
-        </w:rPr>
-        <w:t xml:space="preserve">Flujo principal:</w:t>
-      </w:r>
-      <w:r>
-        <w:t xml:space="preserve"> </w:t>
-      </w:r>
-      <w:r>
-        <w:t xml:space="preserve">consulta el listado cronológico de</w:t>
-      </w:r>
-      <w:r>
-        <w:t xml:space="preserve"> </w:t>
-      </w:r>
-      <w:r>
-        <w:t xml:space="preserve">entregas/devoluciones/estados de una herramienta.</w:t>
-      </w:r>
-    </w:p>
-    <w:p>
-      <w:pPr>
-        <w:pStyle w:val="FirstParagraph"/>
-      </w:pPr>
-      <w:r>
-        <w:rPr>
-          <w:bCs/>
-          <w:b/>
-        </w:rPr>
-        <w:t xml:space="preserve">Épica 6: Proveedores y servicios externos</w:t>
+        <w:t xml:space="preserve">Épica 7: Incidencias de obra</w:t>
       </w:r>
     </w:p>
     <w:p>
@@ -9994,7 +10015,7 @@
           <w:bCs/>
           <w:b/>
         </w:rPr>
-        <w:t xml:space="preserve">CU-13 (HU-13) — Registrar proveedores y servicios.</w:t>
+        <w:t xml:space="preserve">CU-14 (HU-14) — Registrar incidencia de obra.</w:t>
       </w:r>
       <w:r>
         <w:t xml:space="preserve"> </w:t>
@@ -10010,7 +10031,7 @@
         <w:t xml:space="preserve"> </w:t>
       </w:r>
       <w:r>
-        <w:t xml:space="preserve">Administrador.</w:t>
+        <w:t xml:space="preserve">Maestro de obra.</w:t>
       </w:r>
       <w:r>
         <w:t xml:space="preserve"> </w:t>
@@ -10020,85 +10041,39 @@
           <w:iCs/>
           <w:i/>
         </w:rPr>
-        <w:t xml:space="preserve">Flujo principal:</w:t>
-      </w:r>
-      <w:r>
-        <w:t xml:space="preserve"> </w:t>
-      </w:r>
-      <w:r>
-        <w:t xml:space="preserve">registra datos del proveedor y contacto; asocia servicios a uno o</w:t>
-      </w:r>
-      <w:r>
-        <w:t xml:space="preserve"> </w:t>
-      </w:r>
-      <w:r>
-        <w:t xml:space="preserve">más proyectos.</w:t>
-      </w:r>
-    </w:p>
-    <w:p>
-      <w:pPr>
-        <w:numPr>
-          <w:ilvl w:val="0"/>
-          <w:numId w:val="1020"/>
-        </w:numPr>
-        <w:pStyle w:val="Compact"/>
+        <w:t xml:space="preserve">Flujo</w:t>
+      </w:r>
+      <w:r>
+        <w:rPr>
+          <w:iCs/>
+          <w:i/>
+        </w:rPr>
+        <w:t xml:space="preserve"> </w:t>
+      </w:r>
+      <w:r>
+        <w:rPr>
+          <w:iCs/>
+          <w:i/>
+        </w:rPr>
+        <w:t xml:space="preserve">principal:</w:t>
+      </w:r>
+      <w:r>
+        <w:t xml:space="preserve"> </w:t>
+      </w:r>
+      <w:r>
+        <w:t xml:space="preserve">registra tipo, fecha y descripción de la incidencia vinculada al proyecto.</w:t>
+      </w:r>
+    </w:p>
+    <w:p>
+      <w:pPr>
+        <w:pStyle w:val="FirstParagraph"/>
       </w:pPr>
       <w:r>
         <w:rPr>
           <w:bCs/>
           <w:b/>
         </w:rPr>
-        <w:t xml:space="preserve">CU-28 (HU-28) — Registrar detalle de servicio externo contratado.</w:t>
-      </w:r>
-      <w:r>
-        <w:t xml:space="preserve"> </w:t>
-      </w:r>
-      <w:r>
-        <w:rPr>
-          <w:iCs/>
-          <w:i/>
-        </w:rPr>
-        <w:t xml:space="preserve">Actor:</w:t>
-      </w:r>
-      <w:r>
-        <w:t xml:space="preserve"> </w:t>
-      </w:r>
-      <w:r>
-        <w:t xml:space="preserve">Administrador.</w:t>
-      </w:r>
-      <w:r>
-        <w:t xml:space="preserve"> </w:t>
-      </w:r>
-      <w:r>
-        <w:rPr>
-          <w:iCs/>
-          <w:i/>
-        </w:rPr>
-        <w:t xml:space="preserve">Flujo principal:</w:t>
-      </w:r>
-      <w:r>
-        <w:t xml:space="preserve"> </w:t>
-      </w:r>
-      <w:r>
-        <w:t xml:space="preserve">registra encargado, proyecto/actividad, fechas y</w:t>
-      </w:r>
-      <w:r>
-        <w:t xml:space="preserve"> </w:t>
-      </w:r>
-      <w:r>
-        <w:t xml:space="preserve">valor del servicio contratado.</w:t>
-      </w:r>
-    </w:p>
-    <w:p>
-      <w:pPr>
-        <w:pStyle w:val="FirstParagraph"/>
-      </w:pPr>
-      <w:r>
-        <w:rPr>
-          <w:bCs/>
-          <w:b/>
-        </w:rPr>
-        <w:t xml:space="preserve">Épica 7: Incidencias de obra</w:t>
+        <w:t xml:space="preserve">Épica 8: Costos e indicadores</w:t>
       </w:r>
     </w:p>
     <w:p>
@@ -10114,7 +10089,7 @@
           <w:bCs/>
           <w:b/>
         </w:rPr>
-        <w:t xml:space="preserve">CU-14 (HU-14) — Registrar incidencia de obra.</w:t>
+        <w:t xml:space="preserve">CU-15 (HU-15) — Consolidar costos del proyecto.</w:t>
       </w:r>
       <w:r>
         <w:t xml:space="preserve"> </w:t>
@@ -10130,7 +10105,7 @@
         <w:t xml:space="preserve"> </w:t>
       </w:r>
       <w:r>
-        <w:t xml:space="preserve">Maestro de obra.</w:t>
+        <w:t xml:space="preserve">Sistema.</w:t>
       </w:r>
       <w:r>
         <w:t xml:space="preserve"> </w:t>
@@ -10160,19 +10135,109 @@
         <w:t xml:space="preserve"> </w:t>
       </w:r>
       <w:r>
-        <w:t xml:space="preserve">registra tipo, fecha y descripción de la incidencia vinculada al proyecto.</w:t>
-      </w:r>
-    </w:p>
-    <w:p>
-      <w:pPr>
-        <w:pStyle w:val="FirstParagraph"/>
+        <w:t xml:space="preserve">al registrarse movimientos de materiales y servicios externos, el sistema</w:t>
+      </w:r>
+      <w:r>
+        <w:t xml:space="preserve"> </w:t>
+      </w:r>
+      <w:r>
+        <w:t xml:space="preserve">recalcula el costo total del proyecto.</w:t>
+      </w:r>
+      <w:r>
+        <w:t xml:space="preserve"> </w:t>
+      </w:r>
+      <w:r>
+        <w:rPr>
+          <w:iCs/>
+          <w:i/>
+        </w:rPr>
+        <w:t xml:space="preserve">Restricción:</w:t>
+      </w:r>
+      <w:r>
+        <w:t xml:space="preserve"> </w:t>
+      </w:r>
+      <w:r>
+        <w:t xml:space="preserve">no permite edición manual del</w:t>
+      </w:r>
+      <w:r>
+        <w:t xml:space="preserve"> </w:t>
+      </w:r>
+      <w:r>
+        <w:t xml:space="preserve">costo consolidado.</w:t>
+      </w:r>
+    </w:p>
+    <w:p>
+      <w:pPr>
+        <w:numPr>
+          <w:ilvl w:val="0"/>
+          <w:numId w:val="1021"/>
+        </w:numPr>
+        <w:pStyle w:val="Compact"/>
       </w:pPr>
       <w:r>
         <w:rPr>
           <w:bCs/>
           <w:b/>
         </w:rPr>
-        <w:t xml:space="preserve">Épica 8: Costos e indicadores</w:t>
+        <w:t xml:space="preserve">CU-16 (HU-16) — Visualizar dashboard de seguimiento.</w:t>
+      </w:r>
+      <w:r>
+        <w:t xml:space="preserve"> </w:t>
+      </w:r>
+      <w:r>
+        <w:rPr>
+          <w:iCs/>
+          <w:i/>
+        </w:rPr>
+        <w:t xml:space="preserve">Actor:</w:t>
+      </w:r>
+      <w:r>
+        <w:t xml:space="preserve"> </w:t>
+      </w:r>
+      <w:r>
+        <w:t xml:space="preserve">Gerente.</w:t>
+      </w:r>
+      <w:r>
+        <w:t xml:space="preserve"> </w:t>
+      </w:r>
+      <w:r>
+        <w:rPr>
+          <w:iCs/>
+          <w:i/>
+        </w:rPr>
+        <w:t xml:space="preserve">Flujo</w:t>
+      </w:r>
+      <w:r>
+        <w:rPr>
+          <w:iCs/>
+          <w:i/>
+        </w:rPr>
+        <w:t xml:space="preserve"> </w:t>
+      </w:r>
+      <w:r>
+        <w:rPr>
+          <w:iCs/>
+          <w:i/>
+        </w:rPr>
+        <w:t xml:space="preserve">principal:</w:t>
+      </w:r>
+      <w:r>
+        <w:t xml:space="preserve"> </w:t>
+      </w:r>
+      <w:r>
+        <w:t xml:space="preserve">consulta avance general, costos consolidados y alertas por proyecto.</w:t>
+      </w:r>
+    </w:p>
+    <w:p>
+      <w:pPr>
+        <w:pStyle w:val="FirstParagraph"/>
+      </w:pPr>
+      <w:r>
+        <w:rPr>
+          <w:bCs/>
+          <w:b/>
+        </w:rPr>
+        <w:t xml:space="preserve">Épica 9: Auditoría y trazabilidad</w:t>
       </w:r>
     </w:p>
     <w:p>
@@ -10188,7 +10253,7 @@
           <w:bCs/>
           <w:b/>
         </w:rPr>
-        <w:t xml:space="preserve">CU-15 (HU-15) — Consolidar costos del proyecto.</w:t>
+        <w:t xml:space="preserve">CU-17 (HU-17) — Consultar auditoría de operaciones.</w:t>
       </w:r>
       <w:r>
         <w:t xml:space="preserve"> </w:t>
@@ -10204,7 +10269,7 @@
         <w:t xml:space="preserve"> </w:t>
       </w:r>
       <w:r>
-        <w:t xml:space="preserve">Sistema.</w:t>
+        <w:t xml:space="preserve">Administrador.</w:t>
       </w:r>
       <w:r>
         <w:t xml:space="preserve"> </w:t>
@@ -10214,55 +10279,19 @@
           <w:iCs/>
           <w:i/>
         </w:rPr>
-        <w:t xml:space="preserve">Flujo</w:t>
-      </w:r>
-      <w:r>
-        <w:rPr>
-          <w:iCs/>
-          <w:i/>
-        </w:rPr>
-        <w:t xml:space="preserve"> </w:t>
-      </w:r>
-      <w:r>
-        <w:rPr>
-          <w:iCs/>
-          <w:i/>
-        </w:rPr>
-        <w:t xml:space="preserve">principal:</w:t>
-      </w:r>
-      <w:r>
-        <w:t xml:space="preserve"> </w:t>
-      </w:r>
-      <w:r>
-        <w:t xml:space="preserve">al registrarse movimientos de materiales y servicios externos, el sistema</w:t>
-      </w:r>
-      <w:r>
-        <w:t xml:space="preserve"> </w:t>
-      </w:r>
-      <w:r>
-        <w:t xml:space="preserve">recalcula el costo total del proyecto.</w:t>
-      </w:r>
-      <w:r>
-        <w:t xml:space="preserve"> </w:t>
-      </w:r>
-      <w:r>
-        <w:rPr>
-          <w:iCs/>
-          <w:i/>
-        </w:rPr>
-        <w:t xml:space="preserve">Restricción:</w:t>
-      </w:r>
-      <w:r>
-        <w:t xml:space="preserve"> </w:t>
-      </w:r>
-      <w:r>
-        <w:t xml:space="preserve">no permite edición manual del</w:t>
-      </w:r>
-      <w:r>
-        <w:t xml:space="preserve"> </w:t>
-      </w:r>
-      <w:r>
-        <w:t xml:space="preserve">costo consolidado.</w:t>
+        <w:t xml:space="preserve">Flujo principal:</w:t>
+      </w:r>
+      <w:r>
+        <w:t xml:space="preserve"> </w:t>
+      </w:r>
+      <w:r>
+        <w:t xml:space="preserve">consulta usuario, acción, fecha y entidad afectada de operaciones</w:t>
+      </w:r>
+      <w:r>
+        <w:t xml:space="preserve"> </w:t>
+      </w:r>
+      <w:r>
+        <w:t xml:space="preserve">críticas.</w:t>
       </w:r>
     </w:p>
     <w:p>
@@ -10278,7 +10307,7 @@
           <w:bCs/>
           <w:b/>
         </w:rPr>
-        <w:t xml:space="preserve">CU-16 (HU-16) — Visualizar dashboard de seguimiento.</w:t>
+        <w:t xml:space="preserve">CU-18 (HU-18) — Conservar historial (eliminación lógica).</w:t>
       </w:r>
       <w:r>
         <w:t xml:space="preserve"> </w:t>
@@ -10294,7 +10323,7 @@
         <w:t xml:space="preserve"> </w:t>
       </w:r>
       <w:r>
-        <w:t xml:space="preserve">Gerente.</w:t>
+        <w:t xml:space="preserve">Sistema.</w:t>
       </w:r>
       <w:r>
         <w:t xml:space="preserve"> </w:t>
@@ -10304,27 +10333,19 @@
           <w:iCs/>
           <w:i/>
         </w:rPr>
-        <w:t xml:space="preserve">Flujo</w:t>
-      </w:r>
-      <w:r>
-        <w:rPr>
-          <w:iCs/>
-          <w:i/>
-        </w:rPr>
-        <w:t xml:space="preserve"> </w:t>
-      </w:r>
-      <w:r>
-        <w:rPr>
-          <w:iCs/>
-          <w:i/>
-        </w:rPr>
-        <w:t xml:space="preserve">principal:</w:t>
-      </w:r>
-      <w:r>
-        <w:t xml:space="preserve"> </w:t>
-      </w:r>
-      <w:r>
-        <w:t xml:space="preserve">consulta avance general, costos consolidados y alertas por proyecto.</w:t>
+        <w:t xml:space="preserve">Flujo principal:</w:t>
+      </w:r>
+      <w:r>
+        <w:t xml:space="preserve"> </w:t>
+      </w:r>
+      <w:r>
+        <w:t xml:space="preserve">al eliminar un registro, se marca como inactivo en vez de borrarse</w:t>
+      </w:r>
+      <w:r>
+        <w:t xml:space="preserve"> </w:t>
+      </w:r>
+      <w:r>
+        <w:t xml:space="preserve">físicamente.</w:t>
       </w:r>
     </w:p>
     <w:p>
@@ -10336,7 +10357,7 @@
           <w:bCs/>
           <w:b/>
         </w:rPr>
-        <w:t xml:space="preserve">Épica 9: Auditoría y trazabilidad</w:t>
+        <w:t xml:space="preserve">Épica 10: Seguimiento de avance y evidencias</w:t>
       </w:r>
     </w:p>
     <w:p>
@@ -10352,7 +10373,7 @@
           <w:bCs/>
           <w:b/>
         </w:rPr>
-        <w:t xml:space="preserve">CU-17 (HU-17) — Consultar auditoría de operaciones.</w:t>
+        <w:t xml:space="preserve">CU-21 (HU-21) — Registrar porcentaje de avance.</w:t>
       </w:r>
       <w:r>
         <w:t xml:space="preserve"> </w:t>
@@ -10368,7 +10389,7 @@
         <w:t xml:space="preserve"> </w:t>
       </w:r>
       <w:r>
-        <w:t xml:space="preserve">Administrador.</w:t>
+        <w:t xml:space="preserve">Maestro de obra.</w:t>
       </w:r>
       <w:r>
         <w:t xml:space="preserve"> </w:t>
@@ -10378,19 +10399,33 @@
           <w:iCs/>
           <w:i/>
         </w:rPr>
-        <w:t xml:space="preserve">Flujo principal:</w:t>
-      </w:r>
-      <w:r>
-        <w:t xml:space="preserve"> </w:t>
-      </w:r>
-      <w:r>
-        <w:t xml:space="preserve">consulta usuario, acción, fecha y entidad afectada de operaciones</w:t>
-      </w:r>
-      <w:r>
-        <w:t xml:space="preserve"> </w:t>
-      </w:r>
-      <w:r>
-        <w:t xml:space="preserve">críticas.</w:t>
+        <w:t xml:space="preserve">Flujo</w:t>
+      </w:r>
+      <w:r>
+        <w:rPr>
+          <w:iCs/>
+          <w:i/>
+        </w:rPr>
+        <w:t xml:space="preserve"> </w:t>
+      </w:r>
+      <w:r>
+        <w:rPr>
+          <w:iCs/>
+          <w:i/>
+        </w:rPr>
+        <w:t xml:space="preserve">principal:</w:t>
+      </w:r>
+      <w:r>
+        <w:t xml:space="preserve"> </w:t>
+      </w:r>
+      <w:r>
+        <w:t xml:space="preserve">registra el nuevo porcentaje de avance de una actividad con fecha; el</w:t>
+      </w:r>
+      <w:r>
+        <w:t xml:space="preserve"> </w:t>
+      </w:r>
+      <w:r>
+        <w:t xml:space="preserve">avance del proyecto se recalcula.</w:t>
       </w:r>
     </w:p>
     <w:p>
@@ -10406,7 +10441,7 @@
           <w:bCs/>
           <w:b/>
         </w:rPr>
-        <w:t xml:space="preserve">CU-18 (HU-18) — Conservar historial (eliminación lógica).</w:t>
+        <w:t xml:space="preserve">CU-22 (HU-22) — Adjuntar evidencias de avance.</w:t>
       </w:r>
       <w:r>
         <w:t xml:space="preserve"> </w:t>
@@ -10422,7 +10457,7 @@
         <w:t xml:space="preserve"> </w:t>
       </w:r>
       <w:r>
-        <w:t xml:space="preserve">Sistema.</w:t>
+        <w:t xml:space="preserve">Maestro de obra.</w:t>
       </w:r>
       <w:r>
         <w:t xml:space="preserve"> </w:t>
@@ -10432,19 +10467,35 @@
           <w:iCs/>
           <w:i/>
         </w:rPr>
+        <w:t xml:space="preserve">Precondición:</w:t>
+      </w:r>
+      <w:r>
+        <w:t xml:space="preserve"> </w:t>
+      </w:r>
+      <w:r>
+        <w:t xml:space="preserve">existe un registro de avance.</w:t>
+      </w:r>
+      <w:r>
+        <w:t xml:space="preserve"> </w:t>
+      </w:r>
+      <w:r>
+        <w:rPr>
+          <w:iCs/>
+          <w:i/>
+        </w:rPr>
         <w:t xml:space="preserve">Flujo principal:</w:t>
       </w:r>
       <w:r>
         <w:t xml:space="preserve"> </w:t>
       </w:r>
       <w:r>
-        <w:t xml:space="preserve">al eliminar un registro, se marca como inactivo en vez de borrarse</w:t>
-      </w:r>
-      <w:r>
-        <w:t xml:space="preserve"> </w:t>
-      </w:r>
-      <w:r>
-        <w:t xml:space="preserve">físicamente.</w:t>
+        <w:t xml:space="preserve">adjunta uno o más</w:t>
+      </w:r>
+      <w:r>
+        <w:t xml:space="preserve"> </w:t>
+      </w:r>
+      <w:r>
+        <w:t xml:space="preserve">archivos asociados a la actividad y fecha de avance.</w:t>
       </w:r>
     </w:p>
     <w:p>
@@ -10456,7 +10507,7 @@
           <w:bCs/>
           <w:b/>
         </w:rPr>
-        <w:t xml:space="preserve">Épica 10: Seguimiento de avance y evidencias</w:t>
+        <w:t xml:space="preserve">Épica 11: Alertas del sistema</w:t>
       </w:r>
     </w:p>
     <w:p>
@@ -10472,7 +10523,7 @@
           <w:bCs/>
           <w:b/>
         </w:rPr>
-        <w:t xml:space="preserve">CU-21 (HU-21) — Registrar porcentaje de avance.</w:t>
+        <w:t xml:space="preserve">CU-23 (HU-23) — Alertar stock mínimo.</w:t>
       </w:r>
       <w:r>
         <w:t xml:space="preserve"> </w:t>
@@ -10488,7 +10539,7 @@
         <w:t xml:space="preserve"> </w:t>
       </w:r>
       <w:r>
-        <w:t xml:space="preserve">Maestro de obra.</w:t>
+        <w:t xml:space="preserve">Sistema → Encargado de bodega.</w:t>
       </w:r>
       <w:r>
         <w:t xml:space="preserve"> </w:t>
@@ -10498,33 +10549,19 @@
           <w:iCs/>
           <w:i/>
         </w:rPr>
-        <w:t xml:space="preserve">Flujo</w:t>
-      </w:r>
-      <w:r>
-        <w:rPr>
-          <w:iCs/>
-          <w:i/>
-        </w:rPr>
-        <w:t xml:space="preserve"> </w:t>
-      </w:r>
-      <w:r>
-        <w:rPr>
-          <w:iCs/>
-          <w:i/>
-        </w:rPr>
-        <w:t xml:space="preserve">principal:</w:t>
-      </w:r>
-      <w:r>
-        <w:t xml:space="preserve"> </w:t>
-      </w:r>
-      <w:r>
-        <w:t xml:space="preserve">registra el nuevo porcentaje de avance de una actividad con fecha; el</w:t>
-      </w:r>
-      <w:r>
-        <w:t xml:space="preserve"> </w:t>
-      </w:r>
-      <w:r>
-        <w:t xml:space="preserve">avance del proyecto se recalcula.</w:t>
+        <w:t xml:space="preserve">Flujo principal:</w:t>
+      </w:r>
+      <w:r>
+        <w:t xml:space="preserve"> </w:t>
+      </w:r>
+      <w:r>
+        <w:t xml:space="preserve">al llegar la existencia al nivel mínimo, se genera alerta visible</w:t>
+      </w:r>
+      <w:r>
+        <w:t xml:space="preserve"> </w:t>
+      </w:r>
+      <w:r>
+        <w:t xml:space="preserve">en el dashboard.</w:t>
       </w:r>
     </w:p>
     <w:p>
@@ -10540,7 +10577,7 @@
           <w:bCs/>
           <w:b/>
         </w:rPr>
-        <w:t xml:space="preserve">CU-22 (HU-22) — Adjuntar evidencias de avance.</w:t>
+        <w:t xml:space="preserve">CU-24 (HU-24) — Alertar actividades atrasadas y herramientas pendientes.</w:t>
       </w:r>
       <w:r>
         <w:t xml:space="preserve"> </w:t>
@@ -10556,7 +10593,7 @@
         <w:t xml:space="preserve"> </w:t>
       </w:r>
       <w:r>
-        <w:t xml:space="preserve">Maestro de obra.</w:t>
+        <w:t xml:space="preserve">Sistema → Gerente.</w:t>
       </w:r>
       <w:r>
         <w:t xml:space="preserve"> </w:t>
@@ -10566,35 +10603,19 @@
           <w:iCs/>
           <w:i/>
         </w:rPr>
-        <w:t xml:space="preserve">Precondición:</w:t>
-      </w:r>
-      <w:r>
-        <w:t xml:space="preserve"> </w:t>
-      </w:r>
-      <w:r>
-        <w:t xml:space="preserve">existe un registro de avance.</w:t>
-      </w:r>
-      <w:r>
-        <w:t xml:space="preserve"> </w:t>
-      </w:r>
-      <w:r>
-        <w:rPr>
-          <w:iCs/>
-          <w:i/>
-        </w:rPr>
         <w:t xml:space="preserve">Flujo principal:</w:t>
       </w:r>
       <w:r>
         <w:t xml:space="preserve"> </w:t>
       </w:r>
       <w:r>
-        <w:t xml:space="preserve">adjunta uno o más</w:t>
-      </w:r>
-      <w:r>
-        <w:t xml:space="preserve"> </w:t>
-      </w:r>
-      <w:r>
-        <w:t xml:space="preserve">archivos asociados a la actividad y fecha de avance.</w:t>
+        <w:t xml:space="preserve">detecta actividades vencidas no finalizadas y</w:t>
+      </w:r>
+      <w:r>
+        <w:t xml:space="preserve"> </w:t>
+      </w:r>
+      <w:r>
+        <w:t xml:space="preserve">herramientas fuera de plazo; las lista para el gerente.</w:t>
       </w:r>
     </w:p>
     <w:p>
@@ -10606,7 +10627,7 @@
           <w:bCs/>
           <w:b/>
         </w:rPr>
-        <w:t xml:space="preserve">Épica 11: Alertas del sistema</w:t>
+        <w:t xml:space="preserve">Épica 12: Reportes</w:t>
       </w:r>
     </w:p>
     <w:p>
@@ -10622,7 +10643,7 @@
           <w:bCs/>
           <w:b/>
         </w:rPr>
-        <w:t xml:space="preserve">CU-23 (HU-23) — Alertar stock mínimo.</w:t>
+        <w:t xml:space="preserve">CU-25 (HU-25) — Generar y exportar reportes.</w:t>
       </w:r>
       <w:r>
         <w:t xml:space="preserve"> </w:t>
@@ -10638,7 +10659,7 @@
         <w:t xml:space="preserve"> </w:t>
       </w:r>
       <w:r>
-        <w:t xml:space="preserve">Sistema → Encargado de bodega.</w:t>
+        <w:t xml:space="preserve">Gerente.</w:t>
       </w:r>
       <w:r>
         <w:t xml:space="preserve"> </w:t>
@@ -10654,79 +10675,17 @@
         <w:t xml:space="preserve"> </w:t>
       </w:r>
       <w:r>
-        <w:t xml:space="preserve">al llegar la existencia al nivel mínimo, se genera alerta visible</w:t>
-      </w:r>
-      <w:r>
-        <w:t xml:space="preserve"> </w:t>
-      </w:r>
-      <w:r>
-        <w:t xml:space="preserve">en el dashboard.</w:t>
-      </w:r>
-    </w:p>
-    <w:p>
-      <w:pPr>
-        <w:numPr>
-          <w:ilvl w:val="0"/>
-          <w:numId w:val="1025"/>
-        </w:numPr>
-        <w:pStyle w:val="Compact"/>
-      </w:pPr>
-      <w:r>
-        <w:rPr>
-          <w:bCs/>
-          <w:b/>
-        </w:rPr>
-        <w:t xml:space="preserve">CU-24 (HU-24) — Alertar actividades atrasadas y herramientas pendientes.</w:t>
-      </w:r>
-      <w:r>
-        <w:t xml:space="preserve"> </w:t>
-      </w:r>
-      <w:r>
-        <w:rPr>
-          <w:iCs/>
-          <w:i/>
-        </w:rPr>
-        <w:t xml:space="preserve">Actor:</w:t>
-      </w:r>
-      <w:r>
-        <w:t xml:space="preserve"> </w:t>
-      </w:r>
-      <w:r>
-        <w:t xml:space="preserve">Sistema → Gerente.</w:t>
-      </w:r>
-      <w:r>
-        <w:t xml:space="preserve"> </w:t>
-      </w:r>
-      <w:r>
-        <w:rPr>
-          <w:iCs/>
-          <w:i/>
-        </w:rPr>
-        <w:t xml:space="preserve">Flujo principal:</w:t>
-      </w:r>
-      <w:r>
-        <w:t xml:space="preserve"> </w:t>
-      </w:r>
-      <w:r>
-        <w:t xml:space="preserve">detecta actividades vencidas no finalizadas y</w:t>
-      </w:r>
-      <w:r>
-        <w:t xml:space="preserve"> </w:t>
-      </w:r>
-      <w:r>
-        <w:t xml:space="preserve">herramientas fuera de plazo; las lista para el gerente.</w:t>
-      </w:r>
-    </w:p>
-    <w:p>
-      <w:pPr>
-        <w:pStyle w:val="FirstParagraph"/>
-      </w:pPr>
-      <w:r>
-        <w:rPr>
-          <w:bCs/>
-          <w:b/>
-        </w:rPr>
-        <w:t xml:space="preserve">Épica 12: Reportes</w:t>
+        <w:t xml:space="preserve">aplica filtros (proyecto, periodo, material) y exporta el resultado a PDF o Excel.</w:t>
+      </w:r>
+    </w:p>
+    <w:bookmarkEnd w:id="46"/>
+    <w:bookmarkStart w:id="47" w:name="anexos-del-modelo-de-requerimientos"/>
+    <w:p>
+      <w:pPr>
+        <w:pStyle w:val="Heading4"/>
+      </w:pPr>
+      <w:r>
+        <w:t xml:space="preserve">Anexos del modelo de requerimientos</w:t>
       </w:r>
     </w:p>
     <w:p>
@@ -10742,56 +10701,26 @@
           <w:bCs/>
           <w:b/>
         </w:rPr>
-        <w:t xml:space="preserve">CU-25 (HU-25) — Generar y exportar reportes.</w:t>
-      </w:r>
-      <w:r>
-        <w:t xml:space="preserve"> </w:t>
-      </w:r>
-      <w:r>
-        <w:rPr>
-          <w:iCs/>
-          <w:i/>
-        </w:rPr>
-        <w:t xml:space="preserve">Actor:</w:t>
-      </w:r>
-      <w:r>
-        <w:t xml:space="preserve"> </w:t>
-      </w:r>
-      <w:r>
-        <w:t xml:space="preserve">Gerente.</w:t>
-      </w:r>
-      <w:r>
-        <w:t xml:space="preserve"> </w:t>
-      </w:r>
-      <w:r>
-        <w:rPr>
-          <w:iCs/>
-          <w:i/>
-        </w:rPr>
-        <w:t xml:space="preserve">Flujo principal:</w:t>
-      </w:r>
-      <w:r>
-        <w:t xml:space="preserve"> </w:t>
-      </w:r>
-      <w:r>
-        <w:t xml:space="preserve">aplica filtros (proyecto, periodo, material) y exporta el resultado a PDF o Excel.</w:t>
-      </w:r>
-    </w:p>
-    <w:bookmarkEnd w:id="46"/>
-    <w:bookmarkStart w:id="47" w:name="anexos-del-modelo-de-requerimientos"/>
-    <w:p>
-      <w:pPr>
-        <w:pStyle w:val="Heading4"/>
-      </w:pPr>
-      <w:r>
-        <w:t xml:space="preserve">Anexos del modelo de requerimientos</w:t>
+        <w:t xml:space="preserve">Historias de usuario refinadas y criterios de aceptación:</w:t>
+      </w:r>
+      <w:r>
+        <w:t xml:space="preserve"> </w:t>
+      </w:r>
+      <w:r>
+        <w:t xml:space="preserve">las 29 historias de</w:t>
+      </w:r>
+      <w:r>
+        <w:t xml:space="preserve"> </w:t>
+      </w:r>
+      <w:r>
+        <w:t xml:space="preserve">usuario con sus respectivos criterios de aceptación.</w:t>
       </w:r>
     </w:p>
     <w:p>
       <w:pPr>
         <w:numPr>
           <w:ilvl w:val="0"/>
-          <w:numId w:val="1027"/>
+          <w:numId w:val="1026"/>
         </w:numPr>
         <w:pStyle w:val="Compact"/>
       </w:pPr>
@@ -10800,66 +10729,38 @@
           <w:bCs/>
           <w:b/>
         </w:rPr>
-        <w:t xml:space="preserve">Historias de usuario refinadas y criterios de aceptación:</w:t>
-      </w:r>
-      <w:r>
-        <w:t xml:space="preserve"> </w:t>
-      </w:r>
-      <w:r>
-        <w:t xml:space="preserve">las 29 historias de</w:t>
-      </w:r>
-      <w:r>
-        <w:t xml:space="preserve"> </w:t>
-      </w:r>
-      <w:r>
-        <w:t xml:space="preserve">usuario con sus respectivos criterios de aceptación.</w:t>
+        <w:t xml:space="preserve">Articulación de las Historias de Usuario con los Casos de Uso:</w:t>
+      </w:r>
+      <w:r>
+        <w:t xml:space="preserve"> </w:t>
+      </w:r>
+      <w:r>
+        <w:t xml:space="preserve">la correspondencia</w:t>
+      </w:r>
+      <w:r>
+        <w:t xml:space="preserve"> </w:t>
+      </w:r>
+      <w:r>
+        <w:t xml:space="preserve">es uno a uno por identificador (CU-nn ↔ HU-nn), como se refleja en §4.2.3. La matriz</w:t>
+      </w:r>
+      <w:r>
+        <w:t xml:space="preserve"> </w:t>
+      </w:r>
+      <w:r>
+        <w:t xml:space="preserve">completa problema → requerimiento → caso de uso → épica → historia de usuario →</w:t>
+      </w:r>
+      <w:r>
+        <w:t xml:space="preserve"> </w:t>
+      </w:r>
+      <w:r>
+        <w:t xml:space="preserve">sprint se presenta como anexo.</w:t>
       </w:r>
     </w:p>
     <w:p>
       <w:pPr>
         <w:numPr>
           <w:ilvl w:val="0"/>
-          <w:numId w:val="1027"/>
-        </w:numPr>
-        <w:pStyle w:val="Compact"/>
-      </w:pPr>
-      <w:r>
-        <w:rPr>
-          <w:bCs/>
-          <w:b/>
-        </w:rPr>
-        <w:t xml:space="preserve">Articulación de las Historias de Usuario con los Casos de Uso:</w:t>
-      </w:r>
-      <w:r>
-        <w:t xml:space="preserve"> </w:t>
-      </w:r>
-      <w:r>
-        <w:t xml:space="preserve">la correspondencia</w:t>
-      </w:r>
-      <w:r>
-        <w:t xml:space="preserve"> </w:t>
-      </w:r>
-      <w:r>
-        <w:t xml:space="preserve">es uno a uno por identificador (CU-nn ↔ HU-nn), como se refleja en §4.2.3. La matriz</w:t>
-      </w:r>
-      <w:r>
-        <w:t xml:space="preserve"> </w:t>
-      </w:r>
-      <w:r>
-        <w:t xml:space="preserve">completa problema → requerimiento → caso de uso → épica → historia de usuario →</w:t>
-      </w:r>
-      <w:r>
-        <w:t xml:space="preserve"> </w:t>
-      </w:r>
-      <w:r>
-        <w:t xml:space="preserve">sprint se presenta como anexo.</w:t>
-      </w:r>
-    </w:p>
-    <w:p>
-      <w:pPr>
-        <w:numPr>
-          <w:ilvl w:val="0"/>
-          <w:numId w:val="1027"/>
+          <w:numId w:val="1026"/>
         </w:numPr>
         <w:pStyle w:val="Compact"/>
       </w:pPr>
@@ -11485,7 +11386,7 @@
       <w:pPr>
         <w:numPr>
           <w:ilvl w:val="0"/>
-          <w:numId w:val="1028"/>
+          <w:numId w:val="1027"/>
         </w:numPr>
         <w:pStyle w:val="Compact"/>
       </w:pPr>
@@ -11546,7 +11447,7 @@
       <w:pPr>
         <w:numPr>
           <w:ilvl w:val="0"/>
-          <w:numId w:val="1028"/>
+          <w:numId w:val="1027"/>
         </w:numPr>
         <w:pStyle w:val="Compact"/>
       </w:pPr>
@@ -11589,7 +11490,7 @@
       <w:pPr>
         <w:numPr>
           <w:ilvl w:val="0"/>
-          <w:numId w:val="1028"/>
+          <w:numId w:val="1027"/>
         </w:numPr>
         <w:pStyle w:val="Compact"/>
       </w:pPr>
@@ -12559,7 +12460,7 @@
       <w:pPr>
         <w:numPr>
           <w:ilvl w:val="0"/>
-          <w:numId w:val="1029"/>
+          <w:numId w:val="1028"/>
         </w:numPr>
         <w:pStyle w:val="Compact"/>
       </w:pPr>
@@ -12607,7 +12508,7 @@
       <w:pPr>
         <w:numPr>
           <w:ilvl w:val="0"/>
-          <w:numId w:val="1029"/>
+          <w:numId w:val="1028"/>
         </w:numPr>
         <w:pStyle w:val="Compact"/>
       </w:pPr>
@@ -12649,7 +12550,7 @@
       <w:pPr>
         <w:numPr>
           <w:ilvl w:val="0"/>
-          <w:numId w:val="1029"/>
+          <w:numId w:val="1028"/>
         </w:numPr>
         <w:pStyle w:val="Compact"/>
       </w:pPr>
@@ -12677,7 +12578,7 @@
       <w:pPr>
         <w:numPr>
           <w:ilvl w:val="0"/>
-          <w:numId w:val="1029"/>
+          <w:numId w:val="1028"/>
         </w:numPr>
         <w:pStyle w:val="Compact"/>
       </w:pPr>
@@ -12705,7 +12606,7 @@
       <w:pPr>
         <w:numPr>
           <w:ilvl w:val="0"/>
-          <w:numId w:val="1029"/>
+          <w:numId w:val="1028"/>
         </w:numPr>
         <w:pStyle w:val="Compact"/>
       </w:pPr>
@@ -12733,7 +12634,7 @@
       <w:pPr>
         <w:numPr>
           <w:ilvl w:val="0"/>
-          <w:numId w:val="1029"/>
+          <w:numId w:val="1028"/>
         </w:numPr>
         <w:pStyle w:val="Compact"/>
       </w:pPr>
@@ -12767,7 +12668,7 @@
       <w:pPr>
         <w:numPr>
           <w:ilvl w:val="0"/>
-          <w:numId w:val="1029"/>
+          <w:numId w:val="1028"/>
         </w:numPr>
         <w:pStyle w:val="Compact"/>
       </w:pPr>
@@ -13101,6 +13002,36 @@
     </w:lvlOverride>
   </w:num>
   <w:num w:numId="1002">
+    <w:abstractNumId w:val="991"/>
+  </w:num>
+  <w:num w:numId="1003">
+    <w:abstractNumId w:val="991"/>
+  </w:num>
+  <w:num w:numId="1004">
+    <w:abstractNumId w:val="991"/>
+  </w:num>
+  <w:num w:numId="1005">
+    <w:abstractNumId w:val="991"/>
+  </w:num>
+  <w:num w:numId="1006">
+    <w:abstractNumId w:val="991"/>
+  </w:num>
+  <w:num w:numId="1007">
+    <w:abstractNumId w:val="991"/>
+  </w:num>
+  <w:num w:numId="1008">
+    <w:abstractNumId w:val="991"/>
+  </w:num>
+  <w:num w:numId="1009">
+    <w:abstractNumId w:val="991"/>
+  </w:num>
+  <w:num w:numId="1010">
+    <w:abstractNumId w:val="991"/>
+  </w:num>
+  <w:num w:numId="1011">
+    <w:abstractNumId w:val="991"/>
+  </w:num>
+  <w:num w:numId="1012">
     <w:abstractNumId w:val="99411"/>
     <w:lvlOverride w:ilvl="0">
       <w:startOverride w:val="1"/>
@@ -13130,65 +13061,8 @@
       <w:startOverride w:val="1"/>
     </w:lvlOverride>
   </w:num>
-  <w:num w:numId="1003">
+  <w:num w:numId="1013">
     <w:abstractNumId w:val="991"/>
-  </w:num>
-  <w:num w:numId="1004">
-    <w:abstractNumId w:val="991"/>
-  </w:num>
-  <w:num w:numId="1005">
-    <w:abstractNumId w:val="991"/>
-  </w:num>
-  <w:num w:numId="1006">
-    <w:abstractNumId w:val="991"/>
-  </w:num>
-  <w:num w:numId="1007">
-    <w:abstractNumId w:val="991"/>
-  </w:num>
-  <w:num w:numId="1008">
-    <w:abstractNumId w:val="991"/>
-  </w:num>
-  <w:num w:numId="1009">
-    <w:abstractNumId w:val="991"/>
-  </w:num>
-  <w:num w:numId="1010">
-    <w:abstractNumId w:val="991"/>
-  </w:num>
-  <w:num w:numId="1011">
-    <w:abstractNumId w:val="991"/>
-  </w:num>
-  <w:num w:numId="1012">
-    <w:abstractNumId w:val="991"/>
-  </w:num>
-  <w:num w:numId="1013">
-    <w:abstractNumId w:val="99411"/>
-    <w:lvlOverride w:ilvl="0">
-      <w:startOverride w:val="1"/>
-    </w:lvlOverride>
-    <w:lvlOverride w:ilvl="1">
-      <w:startOverride w:val="1"/>
-    </w:lvlOverride>
-    <w:lvlOverride w:ilvl="2">
-      <w:startOverride w:val="1"/>
-    </w:lvlOverride>
-    <w:lvlOverride w:ilvl="3">
-      <w:startOverride w:val="1"/>
-    </w:lvlOverride>
-    <w:lvlOverride w:ilvl="4">
-      <w:startOverride w:val="1"/>
-    </w:lvlOverride>
-    <w:lvlOverride w:ilvl="5">
-      <w:startOverride w:val="1"/>
-    </w:lvlOverride>
-    <w:lvlOverride w:ilvl="6">
-      <w:startOverride w:val="1"/>
-    </w:lvlOverride>
-    <w:lvlOverride w:ilvl="7">
-      <w:startOverride w:val="1"/>
-    </w:lvlOverride>
-    <w:lvlOverride w:ilvl="8">
-      <w:startOverride w:val="1"/>
-    </w:lvlOverride>
   </w:num>
   <w:num w:numId="1014">
     <w:abstractNumId w:val="991"/>
@@ -13233,9 +13107,6 @@
     <w:abstractNumId w:val="991"/>
   </w:num>
   <w:num w:numId="1028">
-    <w:abstractNumId w:val="991"/>
-  </w:num>
-  <w:num w:numId="1029">
     <w:abstractNumId w:val="991"/>
   </w:num>
 </w:numbering>

</xml_diff>

<commit_message>
Quitar las referencias al repositorio de la nota del equipo
El equipo no trabaja sobre el repositorio: las rutas de archivos y los
nombres de formato no le dicen nada. Cada insumo se nombra ahora por lo que
es. Se elimina ademas la fila de normalizacion, que figuraba como faltante
cuando ya esta redactada en el paragrafo 6.1 del informe.
</commit_message>
<xml_diff>
--- a/docs/INFORME_AYD.docx
+++ b/docs/INFORME_AYD.docx
@@ -525,16 +525,7 @@
               <w:jc w:val="left"/>
             </w:pPr>
             <w:r>
-              <w:rPr>
-                <w:rStyle w:val="VerbatimChar"/>
-              </w:rPr>
-              <w:t xml:space="preserve">docs/schema.sql</w:t>
-            </w:r>
-            <w:r>
-              <w:t xml:space="preserve"> </w:t>
-            </w:r>
-            <w:r>
-              <w:t xml:space="preserve">— 27 tablas ya definidas</w:t>
+              <w:t xml:space="preserve">La base de datos ya está definida: 27 tablas</w:t>
             </w:r>
           </w:p>
         </w:tc>
@@ -572,16 +563,7 @@
               <w:jc w:val="left"/>
             </w:pPr>
             <w:r>
-              <w:rPr>
-                <w:rStyle w:val="VerbatimChar"/>
-              </w:rPr>
-              <w:t xml:space="preserve">docs/schema.sql</w:t>
-            </w:r>
-            <w:r>
-              <w:t xml:space="preserve"> </w:t>
-            </w:r>
-            <w:r>
-              <w:t xml:space="preserve">+ los módulos del backend</w:t>
+              <w:t xml:space="preserve">La base de datos y los módulos ya implementados</w:t>
             </w:r>
           </w:p>
         </w:tc>
@@ -633,34 +615,31 @@
               <w:jc w:val="left"/>
             </w:pPr>
             <w:r>
-              <w:t xml:space="preserve">Evidencia de normalización 1FN/2FN/3FN</w:t>
-            </w:r>
-          </w:p>
-        </w:tc>
-        <w:tc>
-          <w:tcPr/>
-          <w:p>
-            <w:pPr>
-              <w:pStyle w:val="Compact"/>
-              <w:jc w:val="left"/>
-            </w:pPr>
-            <w:r>
-              <w:t xml:space="preserve">6.1</w:t>
-            </w:r>
-          </w:p>
-        </w:tc>
-        <w:tc>
-          <w:tcPr/>
-          <w:p>
-            <w:pPr>
-              <w:pStyle w:val="Compact"/>
-              <w:jc w:val="left"/>
-            </w:pPr>
-            <w:r>
-              <w:rPr>
-                <w:rStyle w:val="VerbatimChar"/>
-              </w:rPr>
-              <w:t xml:space="preserve">docs/schema.sql</w:t>
+              <w:t xml:space="preserve">Diagramas de actividades</w:t>
+            </w:r>
+          </w:p>
+        </w:tc>
+        <w:tc>
+          <w:tcPr/>
+          <w:p>
+            <w:pPr>
+              <w:pStyle w:val="Compact"/>
+              <w:jc w:val="left"/>
+            </w:pPr>
+            <w:r>
+              <w:t xml:space="preserve">2.1</w:t>
+            </w:r>
+          </w:p>
+        </w:tc>
+        <w:tc>
+          <w:tcPr/>
+          <w:p>
+            <w:pPr>
+              <w:pStyle w:val="Compact"/>
+              <w:jc w:val="left"/>
+            </w:pPr>
+            <w:r>
+              <w:t xml:space="preserve">Los procesos de §2.1 y los flujos de los 29 CU</w:t>
             </w:r>
           </w:p>
         </w:tc>
@@ -674,44 +653,6 @@
               <w:jc w:val="left"/>
             </w:pPr>
             <w:r>
-              <w:t xml:space="preserve">Diagramas de actividades</w:t>
-            </w:r>
-          </w:p>
-        </w:tc>
-        <w:tc>
-          <w:tcPr/>
-          <w:p>
-            <w:pPr>
-              <w:pStyle w:val="Compact"/>
-              <w:jc w:val="left"/>
-            </w:pPr>
-            <w:r>
-              <w:t xml:space="preserve">2.1</w:t>
-            </w:r>
-          </w:p>
-        </w:tc>
-        <w:tc>
-          <w:tcPr/>
-          <w:p>
-            <w:pPr>
-              <w:pStyle w:val="Compact"/>
-              <w:jc w:val="left"/>
-            </w:pPr>
-            <w:r>
-              <w:t xml:space="preserve">Los procesos de §2.1 y los flujos de los 29 CU</w:t>
-            </w:r>
-          </w:p>
-        </w:tc>
-      </w:tr>
-      <w:tr>
-        <w:tc>
-          <w:tcPr/>
-          <w:p>
-            <w:pPr>
-              <w:pStyle w:val="Compact"/>
-              <w:jc w:val="left"/>
-            </w:pPr>
-            <w:r>
               <w:t xml:space="preserve">Gráfico del árbol del problema</w:t>
             </w:r>
           </w:p>
@@ -763,31 +704,13 @@
         <w:t xml:space="preserve"> </w:t>
       </w:r>
       <w:r>
-        <w:t xml:space="preserve">— el diagrama terminado está incrustado en §3 del</w:t>
-      </w:r>
-      <w:r>
-        <w:t xml:space="preserve"> </w:t>
-      </w:r>
-      <w:r>
-        <w:t xml:space="preserve">documento de análisis, y su fuente editable está en</w:t>
-      </w:r>
-      <w:r>
-        <w:t xml:space="preserve"> </w:t>
-      </w:r>
-      <w:r>
-        <w:rPr>
-          <w:rStyle w:val="VerbatimChar"/>
-        </w:rPr>
-        <w:t xml:space="preserve">docs/bpmn/PROCESO_AS_IS.drawio</w:t>
-      </w:r>
-      <w:r>
-        <w:t xml:space="preserve">. Lo</w:t>
-      </w:r>
-      <w:r>
-        <w:t xml:space="preserve"> </w:t>
-      </w:r>
-      <w:r>
-        <w:t xml:space="preserve">único pendiente es exportar su PNG al repositorio, como ya lo tiene el TO-BE.</w:t>
+        <w:t xml:space="preserve">— el diagrama terminado está incrustado en el numeral 3</w:t>
+      </w:r>
+      <w:r>
+        <w:t xml:space="preserve"> </w:t>
+      </w:r>
+      <w:r>
+        <w:t xml:space="preserve">del documento de análisis.</w:t>
       </w:r>
     </w:p>
     <w:p>
@@ -811,49 +734,13 @@
         <w:t xml:space="preserve"> </w:t>
       </w:r>
       <w:r>
-        <w:t xml:space="preserve">— los 29 archivos</w:t>
-      </w:r>
-      <w:r>
-        <w:t xml:space="preserve"> </w:t>
-      </w:r>
-      <w:r>
-        <w:rPr>
-          <w:rStyle w:val="VerbatimChar"/>
-        </w:rPr>
-        <w:t xml:space="preserve">.puml</w:t>
-      </w:r>
-      <w:r>
-        <w:t xml:space="preserve"> </w:t>
-      </w:r>
-      <w:r>
-        <w:t xml:space="preserve">ya usan</w:t>
-      </w:r>
-      <w:r>
-        <w:t xml:space="preserve"> </w:t>
-      </w:r>
-      <w:r>
-        <w:rPr>
-          <w:rStyle w:val="VerbatimChar"/>
-        </w:rPr>
-        <w:t xml:space="preserve">&lt;&lt;include&gt;&gt;</w:t>
-      </w:r>
-      <w:r>
-        <w:t xml:space="preserve"> </w:t>
-      </w:r>
-      <w:r>
-        <w:t xml:space="preserve">y</w:t>
-      </w:r>
-      <w:r>
-        <w:t xml:space="preserve"> </w:t>
-      </w:r>
-      <w:r>
-        <w:rPr>
-          <w:rStyle w:val="VerbatimChar"/>
-        </w:rPr>
-        <w:t xml:space="preserve">&lt;&lt;extend&gt;&gt;</w:t>
-      </w:r>
-      <w:r>
-        <w:t xml:space="preserve">. El punto 4.2.2 del lineamiento está</w:t>
+        <w:t xml:space="preserve">— los 29 diagramas ya</w:t>
+      </w:r>
+      <w:r>
+        <w:t xml:space="preserve"> </w:t>
+      </w:r>
+      <w:r>
+        <w:t xml:space="preserve">incluyen las relaciones «include» y «extend». El punto 4.2.2 del lineamiento está</w:t>
       </w:r>
       <w:r>
         <w:t xml:space="preserve"> </w:t>

</xml_diff>

<commit_message>
Corregir afirmaciones del paragrafo 6.1 contrastadas con el esquema
La evidencia de normalizacion afirmaba que las tablas de detalle y
asignaciones_personal usan clave primaria compuesta. No es cierto: el modelo
usa claves sustitutas en 26 de las 27 tablas y la unica clave compuesta es la
de roles_permisos, que ademas no tiene atributos no clave. Se reescribe el
argumento de 2FN sobre lo que el esquema hace realmente, y se describe
asignaciones_personal como entidad asociativa con identificador propio.

Se precisa tambien la descripcion de la bitacora (marca de tiempo unica, no
fecha y hora separadas, mas la direccion de origen) y la de las claves
foraneas, nombrando las tres relaciones de composicion que conservan CASCADE.

Se elimina del cuerpo la referencia al paragrafo 12.2 de otro documento: el
informe debe sostenerse solo.
</commit_message>
<xml_diff>
--- a/docs/INFORME_AYD.docx
+++ b/docs/INFORME_AYD.docx
@@ -4519,13 +4519,13 @@
         <w:t xml:space="preserve"> </w:t>
       </w:r>
       <w:r>
-        <w:t xml:space="preserve">interdependientes y la integración temprana reduce el riesgo técnico identificado en</w:t>
-      </w:r>
-      <w:r>
-        <w:t xml:space="preserve"> </w:t>
-      </w:r>
-      <w:r>
-        <w:t xml:space="preserve">§12.2 del documento de análisis.</w:t>
+        <w:t xml:space="preserve">interdependientes y la integración temprana reduce el riesgo técnico de construirlos</w:t>
+      </w:r>
+      <w:r>
+        <w:t xml:space="preserve"> </w:t>
+      </w:r>
+      <w:r>
+        <w:t xml:space="preserve">sobre un modelo de datos común sin una arquitectura consolidada.</w:t>
       </w:r>
     </w:p>
     <w:p>
@@ -11294,7 +11294,7 @@
         <w:t xml:space="preserve"> </w:t>
       </w:r>
       <w:r>
-        <w:t xml:space="preserve">inactivos. Las claves foráneas usan</w:t>
+        <w:t xml:space="preserve">inactivos. Las claves foráneas emplean</w:t>
       </w:r>
       <w:r>
         <w:t xml:space="preserve"> </w:t>
@@ -11306,7 +11306,16 @@
         <w:t xml:space="preserve">RESTRICT</w:t>
       </w:r>
       <w:r>
-        <w:t xml:space="preserve">, conservando deliberadamente</w:t>
+        <w:t xml:space="preserve"> </w:t>
+      </w:r>
+      <w:r>
+        <w:t xml:space="preserve">para impedir el borrado en cascada de</w:t>
+      </w:r>
+      <w:r>
+        <w:t xml:space="preserve"> </w:t>
+      </w:r>
+      <w:r>
+        <w:t xml:space="preserve">información operativa, y reservan</w:t>
       </w:r>
       <w:r>
         <w:t xml:space="preserve"> </w:t>
@@ -11321,13 +11330,25 @@
         <w:t xml:space="preserve"> </w:t>
       </w:r>
       <w:r>
-        <w:t xml:space="preserve">solo donde existe relación de composición (por ejemplo, los detalles respecto de su</w:t>
-      </w:r>
-      <w:r>
-        <w:t xml:space="preserve"> </w:t>
-      </w:r>
-      <w:r>
-        <w:t xml:space="preserve">documento de entrada o salida).</w:t>
+        <w:t xml:space="preserve">para las relaciones de composición, en las</w:t>
+      </w:r>
+      <w:r>
+        <w:t xml:space="preserve"> </w:t>
+      </w:r>
+      <w:r>
+        <w:t xml:space="preserve">que la parte carece de sentido sin el todo: los detalles respecto de su documento de</w:t>
+      </w:r>
+      <w:r>
+        <w:t xml:space="preserve"> </w:t>
+      </w:r>
+      <w:r>
+        <w:t xml:space="preserve">entrada o salida, las evidencias respecto de su registro de avance y los pares</w:t>
+      </w:r>
+      <w:r>
+        <w:t xml:space="preserve"> </w:t>
+      </w:r>
+      <w:r>
+        <w:t xml:space="preserve">rol-permiso.</w:t>
       </w:r>
     </w:p>
     <w:p>
@@ -11407,13 +11428,19 @@
         <w:t xml:space="preserve"> </w:t>
       </w:r>
       <w:r>
-        <w:t xml:space="preserve">registra usuario,</w:t>
-      </w:r>
-      <w:r>
-        <w:t xml:space="preserve"> </w:t>
-      </w:r>
-      <w:r>
-        <w:t xml:space="preserve">fecha, hora, operación y entidad afectada de las operaciones críticas.</w:t>
+        <w:t xml:space="preserve">registra, para cada</w:t>
+      </w:r>
+      <w:r>
+        <w:t xml:space="preserve"> </w:t>
+      </w:r>
+      <w:r>
+        <w:t xml:space="preserve">operación crítica, el usuario que la ejecutó, la acción realizada, la tabla y el</w:t>
+      </w:r>
+      <w:r>
+        <w:t xml:space="preserve"> </w:t>
+      </w:r>
+      <w:r>
+        <w:t xml:space="preserve">registro afectados, la marca de tiempo y la dirección de origen.</w:t>
       </w:r>
     </w:p>
     <w:p>
@@ -11526,19 +11553,49 @@
         <w:t xml:space="preserve">segunda forma normal</w:t>
       </w:r>
       <w:r>
-        <w:t xml:space="preserve">: en las tablas con clave compuesta, los atributos</w:t>
-      </w:r>
-      <w:r>
-        <w:t xml:space="preserve"> </w:t>
-      </w:r>
-      <w:r>
-        <w:t xml:space="preserve">no clave dependen de la clave completa. En las tablas de detalle, la cantidad y el costo</w:t>
-      </w:r>
-      <w:r>
-        <w:t xml:space="preserve"> </w:t>
-      </w:r>
-      <w:r>
-        <w:t xml:space="preserve">dependen conjuntamente del documento y del material, no de uno solo de ellos; los</w:t>
+        <w:t xml:space="preserve">: no existen dependencias parciales de la clave. El</w:t>
+      </w:r>
+      <w:r>
+        <w:t xml:space="preserve"> </w:t>
+      </w:r>
+      <w:r>
+        <w:t xml:space="preserve">modelo emplea claves primarias sustitutas de un solo atributo en la mayoría de las</w:t>
+      </w:r>
+      <w:r>
+        <w:t xml:space="preserve"> </w:t>
+      </w:r>
+      <w:r>
+        <w:t xml:space="preserve">tablas, con lo que la dependencia parcial queda descartada por construcción; la única</w:t>
+      </w:r>
+      <w:r>
+        <w:t xml:space="preserve"> </w:t>
+      </w:r>
+      <w:r>
+        <w:t xml:space="preserve">clave compuesta del modelo, la de</w:t>
+      </w:r>
+      <w:r>
+        <w:t xml:space="preserve"> </w:t>
+      </w:r>
+      <w:r>
+        <w:rPr>
+          <w:rStyle w:val="VerbatimChar"/>
+        </w:rPr>
+        <w:t xml:space="preserve">roles_permisos</w:t>
+      </w:r>
+      <w:r>
+        <w:t xml:space="preserve">, corresponde a una tabla sin</w:t>
+      </w:r>
+      <w:r>
+        <w:t xml:space="preserve"> </w:t>
+      </w:r>
+      <w:r>
+        <w:t xml:space="preserve">atributos no clave. En las tablas de detalle, la cantidad y el costo dependen</w:t>
+      </w:r>
+      <w:r>
+        <w:t xml:space="preserve"> </w:t>
+      </w:r>
+      <w:r>
+        <w:t xml:space="preserve">conjuntamente del documento y del material, y no de uno solo de ellos, mientras que los</w:t>
       </w:r>
       <w:r>
         <w:t xml:space="preserve"> </w:t>
@@ -11663,13 +11720,7 @@
         <w:pStyle w:val="BodyText"/>
       </w:pPr>
       <w:r>
-        <w:t xml:space="preserve">Las relaciones de muchos a muchos están resueltas mediante tablas intermedias con clave</w:t>
-      </w:r>
-      <w:r>
-        <w:t xml:space="preserve"> </w:t>
-      </w:r>
-      <w:r>
-        <w:t xml:space="preserve">compuesta:</w:t>
+        <w:t xml:space="preserve">Las relaciones de muchos a muchos están resueltas mediante tablas intermedias:</w:t>
       </w:r>
       <w:r>
         <w:t xml:space="preserve"> </w:t>
@@ -11684,7 +11735,13 @@
         <w:t xml:space="preserve"> </w:t>
       </w:r>
       <w:r>
-        <w:t xml:space="preserve">entre roles y permisos, y</w:t>
+        <w:t xml:space="preserve">entre roles y permisos, con clave primaria compuesta por ambas</w:t>
+      </w:r>
+      <w:r>
+        <w:t xml:space="preserve"> </w:t>
+      </w:r>
+      <w:r>
+        <w:t xml:space="preserve">referencias; y</w:t>
       </w:r>
       <w:r>
         <w:t xml:space="preserve"> </w:t>
@@ -11699,19 +11756,25 @@
         <w:t xml:space="preserve"> </w:t>
       </w:r>
       <w:r>
-        <w:t xml:space="preserve">entre</w:t>
-      </w:r>
-      <w:r>
-        <w:t xml:space="preserve"> </w:t>
-      </w:r>
-      <w:r>
-        <w:t xml:space="preserve">trabajadores y proyectos o actividades, esta última con atributos propios de la relación</w:t>
-      </w:r>
-      <w:r>
-        <w:t xml:space="preserve"> </w:t>
-      </w:r>
-      <w:r>
-        <w:t xml:space="preserve">(fecha de inicio, fecha fin programada y estado).</w:t>
+        <w:t xml:space="preserve">entre trabajadores y proyectos o actividades,</w:t>
+      </w:r>
+      <w:r>
+        <w:t xml:space="preserve"> </w:t>
+      </w:r>
+      <w:r>
+        <w:t xml:space="preserve">que al tener atributos propios de la relación —fecha de inicio, fecha fin programada,</w:t>
+      </w:r>
+      <w:r>
+        <w:t xml:space="preserve"> </w:t>
+      </w:r>
+      <w:r>
+        <w:t xml:space="preserve">rol en el proyecto y estado— constituye una entidad asociativa con identificador</w:t>
+      </w:r>
+      <w:r>
+        <w:t xml:space="preserve"> </w:t>
+      </w:r>
+      <w:r>
+        <w:t xml:space="preserve">propio.</w:t>
       </w:r>
     </w:p>
     <w:bookmarkEnd w:id="50"/>

</xml_diff>

<commit_message>
Agregar los catalogos de alertas e indicadores
El enunciado define seis condiciones de alerta (numeral 11.3) y trece
indicadores sugeridos (numeral 11.4), y exige el catalogo de indicadores como
producto del OE1. No estaban ni en el documento de analisis del equipo ni en
el informe, que solo los mencionaba de forma generica.

Se agregan como paragrafos 4.1.3 y 4.1.4, cada alerta con la condicion que la
dispara y su requerimiento asociado, y cada indicador con su dimension.
</commit_message>
<xml_diff>
--- a/docs/INFORME_AYD.docx
+++ b/docs/INFORME_AYD.docx
@@ -899,7 +899,7 @@
     </w:p>
     <w:bookmarkEnd w:id="23"/>
     <w:bookmarkEnd w:id="24"/>
-    <w:bookmarkStart w:id="58" w:name="X968f4fd553ec05eb39e61277e1322a13af36ecc"/>
+    <w:bookmarkStart w:id="60" w:name="X968f4fd553ec05eb39e61277e1322a13af36ecc"/>
     <w:p>
       <w:pPr>
         <w:pStyle w:val="Heading1"/>
@@ -4815,7 +4815,7 @@
     </w:p>
     <w:bookmarkEnd w:id="39"/>
     <w:bookmarkEnd w:id="40"/>
-    <w:bookmarkStart w:id="49" w:name="modelo-de-requerimientos"/>
+    <w:bookmarkStart w:id="51" w:name="modelo-de-requerimientos"/>
     <w:p>
       <w:pPr>
         <w:pStyle w:val="Heading2"/>
@@ -4824,7 +4824,7 @@
         <w:t xml:space="preserve">4. MODELO DE REQUERIMIENTOS</w:t>
       </w:r>
     </w:p>
-    <w:bookmarkStart w:id="43" w:name="X45d95eb6c2e85cef99c86843ff53a74ca712930"/>
+    <w:bookmarkStart w:id="45" w:name="X45d95eb6c2e85cef99c86843ff53a74ca712930"/>
     <w:p>
       <w:pPr>
         <w:pStyle w:val="Heading3"/>
@@ -8375,8 +8375,729 @@
       </w:r>
     </w:p>
     <w:bookmarkEnd w:id="42"/>
+    <w:bookmarkStart w:id="43" w:name="catálogo-de-alertas"/>
+    <w:p>
+      <w:pPr>
+        <w:pStyle w:val="Heading4"/>
+      </w:pPr>
+      <w:r>
+        <w:t xml:space="preserve">4.1.3 Catálogo de alertas</w:t>
+      </w:r>
+    </w:p>
+    <w:p>
+      <w:pPr>
+        <w:pStyle w:val="FirstParagraph"/>
+      </w:pPr>
+      <w:r>
+        <w:t xml:space="preserve">El sistema detecta automáticamente las situaciones que requieren atención definidas en</w:t>
+      </w:r>
+      <w:r>
+        <w:t xml:space="preserve"> </w:t>
+      </w:r>
+      <w:r>
+        <w:t xml:space="preserve">el enunciado oficial. Cada alerta se asocia al requerimiento que la origina y queda</w:t>
+      </w:r>
+      <w:r>
+        <w:t xml:space="preserve"> </w:t>
+      </w:r>
+      <w:r>
+        <w:t xml:space="preserve">registrada con su estado de atención (RF36).</w:t>
+      </w:r>
+    </w:p>
+    <w:tbl>
+      <w:tblPr>
+        <w:tblStyle w:val="Table"/>
+        <w:tblW w:type="pct" w:w="5000"/>
+        <w:tblLook w:firstRow="1" w:lastRow="0" w:firstColumn="0" w:lastColumn="0" w:noHBand="0" w:noVBand="0" w:val="0020"/>
+        <w:jc w:val="start"/>
+      </w:tblPr>
+      <w:tblGrid>
+        <w:gridCol w:w="2640"/>
+        <w:gridCol w:w="2640"/>
+        <w:gridCol w:w="2640"/>
+      </w:tblGrid>
+      <w:tr>
+        <w:trPr>
+          <w:tblHeader w:val="true"/>
+        </w:trPr>
+        <w:tc>
+          <w:tcPr/>
+          <w:p>
+            <w:pPr>
+              <w:pStyle w:val="Compact"/>
+              <w:jc w:val="left"/>
+            </w:pPr>
+            <w:r>
+              <w:t xml:space="preserve">Alerta</w:t>
+            </w:r>
+          </w:p>
+        </w:tc>
+        <w:tc>
+          <w:tcPr/>
+          <w:p>
+            <w:pPr>
+              <w:pStyle w:val="Compact"/>
+              <w:jc w:val="left"/>
+            </w:pPr>
+            <w:r>
+              <w:t xml:space="preserve">Condición que la dispara</w:t>
+            </w:r>
+          </w:p>
+        </w:tc>
+        <w:tc>
+          <w:tcPr/>
+          <w:p>
+            <w:pPr>
+              <w:pStyle w:val="Compact"/>
+              <w:jc w:val="left"/>
+            </w:pPr>
+            <w:r>
+              <w:t xml:space="preserve">RF</w:t>
+            </w:r>
+          </w:p>
+        </w:tc>
+      </w:tr>
+      <w:tr>
+        <w:tc>
+          <w:tcPr/>
+          <w:p>
+            <w:pPr>
+              <w:pStyle w:val="Compact"/>
+              <w:jc w:val="left"/>
+            </w:pPr>
+            <w:r>
+              <w:t xml:space="preserve">Inventario bajo</w:t>
+            </w:r>
+          </w:p>
+        </w:tc>
+        <w:tc>
+          <w:tcPr/>
+          <w:p>
+            <w:pPr>
+              <w:pStyle w:val="Compact"/>
+              <w:jc w:val="left"/>
+            </w:pPr>
+            <w:r>
+              <w:t xml:space="preserve">La existencia de un material alcanza su nivel mínimo establecido.</w:t>
+            </w:r>
+          </w:p>
+        </w:tc>
+        <w:tc>
+          <w:tcPr/>
+          <w:p>
+            <w:pPr>
+              <w:pStyle w:val="Compact"/>
+              <w:jc w:val="left"/>
+            </w:pPr>
+            <w:r>
+              <w:t xml:space="preserve">RF23</w:t>
+            </w:r>
+          </w:p>
+        </w:tc>
+      </w:tr>
+      <w:tr>
+        <w:tc>
+          <w:tcPr/>
+          <w:p>
+            <w:pPr>
+              <w:pStyle w:val="Compact"/>
+              <w:jc w:val="left"/>
+            </w:pPr>
+            <w:r>
+              <w:t xml:space="preserve">Actividades vencidas</w:t>
+            </w:r>
+          </w:p>
+        </w:tc>
+        <w:tc>
+          <w:tcPr/>
+          <w:p>
+            <w:pPr>
+              <w:pStyle w:val="Compact"/>
+              <w:jc w:val="left"/>
+            </w:pPr>
+            <w:r>
+              <w:t xml:space="preserve">Una actividad supera su fecha programada sin estar terminada.</w:t>
+            </w:r>
+          </w:p>
+        </w:tc>
+        <w:tc>
+          <w:tcPr/>
+          <w:p>
+            <w:pPr>
+              <w:pStyle w:val="Compact"/>
+              <w:jc w:val="left"/>
+            </w:pPr>
+            <w:r>
+              <w:t xml:space="preserve">RF25</w:t>
+            </w:r>
+          </w:p>
+        </w:tc>
+      </w:tr>
+      <w:tr>
+        <w:tc>
+          <w:tcPr/>
+          <w:p>
+            <w:pPr>
+              <w:pStyle w:val="Compact"/>
+              <w:jc w:val="left"/>
+            </w:pPr>
+            <w:r>
+              <w:t xml:space="preserve">Herramientas pendientes</w:t>
+            </w:r>
+          </w:p>
+        </w:tc>
+        <w:tc>
+          <w:tcPr/>
+          <w:p>
+            <w:pPr>
+              <w:pStyle w:val="Compact"/>
+              <w:jc w:val="left"/>
+            </w:pPr>
+            <w:r>
+              <w:t xml:space="preserve">Una herramienta entregada supera el plazo previsto de devolución.</w:t>
+            </w:r>
+          </w:p>
+        </w:tc>
+        <w:tc>
+          <w:tcPr/>
+          <w:p>
+            <w:pPr>
+              <w:pStyle w:val="Compact"/>
+              <w:jc w:val="left"/>
+            </w:pPr>
+            <w:r>
+              <w:t xml:space="preserve">RF24</w:t>
+            </w:r>
+          </w:p>
+        </w:tc>
+      </w:tr>
+      <w:tr>
+        <w:tc>
+          <w:tcPr/>
+          <w:p>
+            <w:pPr>
+              <w:pStyle w:val="Compact"/>
+              <w:jc w:val="left"/>
+            </w:pPr>
+            <w:r>
+              <w:t xml:space="preserve">Proyectos atrasados</w:t>
+            </w:r>
+          </w:p>
+        </w:tc>
+        <w:tc>
+          <w:tcPr/>
+          <w:p>
+            <w:pPr>
+              <w:pStyle w:val="Compact"/>
+              <w:jc w:val="left"/>
+            </w:pPr>
+            <w:r>
+              <w:t xml:space="preserve">El avance consolidado de un proyecto queda por debajo de lo programado.</w:t>
+            </w:r>
+          </w:p>
+        </w:tc>
+        <w:tc>
+          <w:tcPr/>
+          <w:p>
+            <w:pPr>
+              <w:pStyle w:val="Compact"/>
+              <w:jc w:val="left"/>
+            </w:pPr>
+            <w:r>
+              <w:t xml:space="preserve">RF25</w:t>
+            </w:r>
+          </w:p>
+        </w:tc>
+      </w:tr>
+      <w:tr>
+        <w:tc>
+          <w:tcPr/>
+          <w:p>
+            <w:pPr>
+              <w:pStyle w:val="Compact"/>
+              <w:jc w:val="left"/>
+            </w:pPr>
+            <w:r>
+              <w:t xml:space="preserve">Servicios pendientes</w:t>
+            </w:r>
+          </w:p>
+        </w:tc>
+        <w:tc>
+          <w:tcPr/>
+          <w:p>
+            <w:pPr>
+              <w:pStyle w:val="Compact"/>
+              <w:jc w:val="left"/>
+            </w:pPr>
+            <w:r>
+              <w:t xml:space="preserve">Un servicio externo contratado no registra ejecución dentro de sus fechas.</w:t>
+            </w:r>
+          </w:p>
+        </w:tc>
+        <w:tc>
+          <w:tcPr/>
+          <w:p>
+            <w:pPr>
+              <w:pStyle w:val="Compact"/>
+              <w:jc w:val="left"/>
+            </w:pPr>
+            <w:r>
+              <w:t xml:space="preserve">RF21</w:t>
+            </w:r>
+          </w:p>
+        </w:tc>
+      </w:tr>
+      <w:tr>
+        <w:tc>
+          <w:tcPr/>
+          <w:p>
+            <w:pPr>
+              <w:pStyle w:val="Compact"/>
+              <w:jc w:val="left"/>
+            </w:pPr>
+            <w:r>
+              <w:t xml:space="preserve">Desviaciones relevantes</w:t>
+            </w:r>
+          </w:p>
+        </w:tc>
+        <w:tc>
+          <w:tcPr/>
+          <w:p>
+            <w:pPr>
+              <w:pStyle w:val="Compact"/>
+              <w:jc w:val="left"/>
+            </w:pPr>
+            <w:r>
+              <w:t xml:space="preserve">El costo consolidado de un proyecto se aparta del presupuesto de referencia.</w:t>
+            </w:r>
+          </w:p>
+        </w:tc>
+        <w:tc>
+          <w:tcPr/>
+          <w:p>
+            <w:pPr>
+              <w:pStyle w:val="Compact"/>
+              <w:jc w:val="left"/>
+            </w:pPr>
+            <w:r>
+              <w:t xml:space="preserve">RF26</w:t>
+            </w:r>
+          </w:p>
+        </w:tc>
+      </w:tr>
+    </w:tbl>
     <w:bookmarkEnd w:id="43"/>
-    <w:bookmarkStart w:id="48" w:name="modelado-de-los-casos-de-uso"/>
+    <w:bookmarkStart w:id="44" w:name="catálogo-de-indicadores"/>
+    <w:p>
+      <w:pPr>
+        <w:pStyle w:val="Heading4"/>
+      </w:pPr>
+      <w:r>
+        <w:t xml:space="preserve">4.1.4 Catálogo de indicadores</w:t>
+      </w:r>
+    </w:p>
+    <w:p>
+      <w:pPr>
+        <w:pStyle w:val="FirstParagraph"/>
+      </w:pPr>
+      <w:r>
+        <w:t xml:space="preserve">Los indicadores se calculan a partir de la información transaccional registrada, sin</w:t>
+      </w:r>
+      <w:r>
+        <w:t xml:space="preserve"> </w:t>
+      </w:r>
+      <w:r>
+        <w:t xml:space="preserve">digitación manual, conforme a la regla de negocio RN10. Se presentan gráficamente en el</w:t>
+      </w:r>
+      <w:r>
+        <w:t xml:space="preserve"> </w:t>
+      </w:r>
+      <w:r>
+        <w:t xml:space="preserve">dashboard gerencial (RF28).</w:t>
+      </w:r>
+    </w:p>
+    <w:tbl>
+      <w:tblPr>
+        <w:tblStyle w:val="Table"/>
+        <w:tblW w:type="auto" w:w="0"/>
+        <w:tblLook w:firstRow="1" w:lastRow="0" w:firstColumn="0" w:lastColumn="0" w:noHBand="0" w:noVBand="0" w:val="0020"/>
+        <w:jc w:val="start"/>
+      </w:tblPr>
+      <w:tblGrid>
+        <w:gridCol w:w="3960"/>
+        <w:gridCol w:w="3960"/>
+      </w:tblGrid>
+      <w:tr>
+        <w:trPr>
+          <w:tblHeader w:val="true"/>
+        </w:trPr>
+        <w:tc>
+          <w:tcPr/>
+          <w:p>
+            <w:pPr>
+              <w:pStyle w:val="Compact"/>
+              <w:jc w:val="left"/>
+            </w:pPr>
+            <w:r>
+              <w:t xml:space="preserve">Indicador</w:t>
+            </w:r>
+          </w:p>
+        </w:tc>
+        <w:tc>
+          <w:tcPr/>
+          <w:p>
+            <w:pPr>
+              <w:pStyle w:val="Compact"/>
+              <w:jc w:val="left"/>
+            </w:pPr>
+            <w:r>
+              <w:t xml:space="preserve">Dimensión</w:t>
+            </w:r>
+          </w:p>
+        </w:tc>
+      </w:tr>
+      <w:tr>
+        <w:tc>
+          <w:tcPr/>
+          <w:p>
+            <w:pPr>
+              <w:pStyle w:val="Compact"/>
+              <w:jc w:val="left"/>
+            </w:pPr>
+            <w:r>
+              <w:t xml:space="preserve">Porcentaje de avance por proyecto</w:t>
+            </w:r>
+          </w:p>
+        </w:tc>
+        <w:tc>
+          <w:tcPr/>
+          <w:p>
+            <w:pPr>
+              <w:pStyle w:val="Compact"/>
+              <w:jc w:val="left"/>
+            </w:pPr>
+            <w:r>
+              <w:t xml:space="preserve">Proyectos</w:t>
+            </w:r>
+          </w:p>
+        </w:tc>
+      </w:tr>
+      <w:tr>
+        <w:tc>
+          <w:tcPr/>
+          <w:p>
+            <w:pPr>
+              <w:pStyle w:val="Compact"/>
+              <w:jc w:val="left"/>
+            </w:pPr>
+            <w:r>
+              <w:t xml:space="preserve">Actividades programadas vs. terminadas</w:t>
+            </w:r>
+          </w:p>
+        </w:tc>
+        <w:tc>
+          <w:tcPr/>
+          <w:p>
+            <w:pPr>
+              <w:pStyle w:val="Compact"/>
+              <w:jc w:val="left"/>
+            </w:pPr>
+            <w:r>
+              <w:t xml:space="preserve">Proyectos</w:t>
+            </w:r>
+          </w:p>
+        </w:tc>
+      </w:tr>
+      <w:tr>
+        <w:tc>
+          <w:tcPr/>
+          <w:p>
+            <w:pPr>
+              <w:pStyle w:val="Compact"/>
+              <w:jc w:val="left"/>
+            </w:pPr>
+            <w:r>
+              <w:t xml:space="preserve">Porcentaje de actividades atrasadas</w:t>
+            </w:r>
+          </w:p>
+        </w:tc>
+        <w:tc>
+          <w:tcPr/>
+          <w:p>
+            <w:pPr>
+              <w:pStyle w:val="Compact"/>
+              <w:jc w:val="left"/>
+            </w:pPr>
+            <w:r>
+              <w:t xml:space="preserve">Proyectos</w:t>
+            </w:r>
+          </w:p>
+        </w:tc>
+      </w:tr>
+      <w:tr>
+        <w:tc>
+          <w:tcPr/>
+          <w:p>
+            <w:pPr>
+              <w:pStyle w:val="Compact"/>
+              <w:jc w:val="left"/>
+            </w:pPr>
+            <w:r>
+              <w:t xml:space="preserve">Consumo de materiales por proyecto</w:t>
+            </w:r>
+          </w:p>
+        </w:tc>
+        <w:tc>
+          <w:tcPr/>
+          <w:p>
+            <w:pPr>
+              <w:pStyle w:val="Compact"/>
+              <w:jc w:val="left"/>
+            </w:pPr>
+            <w:r>
+              <w:t xml:space="preserve">Inventarios</w:t>
+            </w:r>
+          </w:p>
+        </w:tc>
+      </w:tr>
+      <w:tr>
+        <w:tc>
+          <w:tcPr/>
+          <w:p>
+            <w:pPr>
+              <w:pStyle w:val="Compact"/>
+              <w:jc w:val="left"/>
+            </w:pPr>
+            <w:r>
+              <w:t xml:space="preserve">Costo de materiales por proyecto</w:t>
+            </w:r>
+          </w:p>
+        </w:tc>
+        <w:tc>
+          <w:tcPr/>
+          <w:p>
+            <w:pPr>
+              <w:pStyle w:val="Compact"/>
+              <w:jc w:val="left"/>
+            </w:pPr>
+            <w:r>
+              <w:t xml:space="preserve">Inventarios</w:t>
+            </w:r>
+          </w:p>
+        </w:tc>
+      </w:tr>
+      <w:tr>
+        <w:tc>
+          <w:tcPr/>
+          <w:p>
+            <w:pPr>
+              <w:pStyle w:val="Compact"/>
+              <w:jc w:val="left"/>
+            </w:pPr>
+            <w:r>
+              <w:t xml:space="preserve">Materiales con existencia crítica</w:t>
+            </w:r>
+          </w:p>
+        </w:tc>
+        <w:tc>
+          <w:tcPr/>
+          <w:p>
+            <w:pPr>
+              <w:pStyle w:val="Compact"/>
+              <w:jc w:val="left"/>
+            </w:pPr>
+            <w:r>
+              <w:t xml:space="preserve">Inventarios</w:t>
+            </w:r>
+          </w:p>
+        </w:tc>
+      </w:tr>
+      <w:tr>
+        <w:tc>
+          <w:tcPr/>
+          <w:p>
+            <w:pPr>
+              <w:pStyle w:val="Compact"/>
+              <w:jc w:val="left"/>
+            </w:pPr>
+            <w:r>
+              <w:t xml:space="preserve">Herramientas disponibles</w:t>
+            </w:r>
+          </w:p>
+        </w:tc>
+        <w:tc>
+          <w:tcPr/>
+          <w:p>
+            <w:pPr>
+              <w:pStyle w:val="Compact"/>
+              <w:jc w:val="left"/>
+            </w:pPr>
+            <w:r>
+              <w:t xml:space="preserve">Herramientas</w:t>
+            </w:r>
+          </w:p>
+        </w:tc>
+      </w:tr>
+      <w:tr>
+        <w:tc>
+          <w:tcPr/>
+          <w:p>
+            <w:pPr>
+              <w:pStyle w:val="Compact"/>
+              <w:jc w:val="left"/>
+            </w:pPr>
+            <w:r>
+              <w:t xml:space="preserve">Herramientas prestadas</w:t>
+            </w:r>
+          </w:p>
+        </w:tc>
+        <w:tc>
+          <w:tcPr/>
+          <w:p>
+            <w:pPr>
+              <w:pStyle w:val="Compact"/>
+              <w:jc w:val="left"/>
+            </w:pPr>
+            <w:r>
+              <w:t xml:space="preserve">Herramientas</w:t>
+            </w:r>
+          </w:p>
+        </w:tc>
+      </w:tr>
+      <w:tr>
+        <w:tc>
+          <w:tcPr/>
+          <w:p>
+            <w:pPr>
+              <w:pStyle w:val="Compact"/>
+              <w:jc w:val="left"/>
+            </w:pPr>
+            <w:r>
+              <w:t xml:space="preserve">Herramientas pendientes de devolución</w:t>
+            </w:r>
+          </w:p>
+        </w:tc>
+        <w:tc>
+          <w:tcPr/>
+          <w:p>
+            <w:pPr>
+              <w:pStyle w:val="Compact"/>
+              <w:jc w:val="left"/>
+            </w:pPr>
+            <w:r>
+              <w:t xml:space="preserve">Herramientas</w:t>
+            </w:r>
+          </w:p>
+        </w:tc>
+      </w:tr>
+      <w:tr>
+        <w:tc>
+          <w:tcPr/>
+          <w:p>
+            <w:pPr>
+              <w:pStyle w:val="Compact"/>
+              <w:jc w:val="left"/>
+            </w:pPr>
+            <w:r>
+              <w:t xml:space="preserve">Costo de servicios externos</w:t>
+            </w:r>
+          </w:p>
+        </w:tc>
+        <w:tc>
+          <w:tcPr/>
+          <w:p>
+            <w:pPr>
+              <w:pStyle w:val="Compact"/>
+              <w:jc w:val="left"/>
+            </w:pPr>
+            <w:r>
+              <w:t xml:space="preserve">Terceros</w:t>
+            </w:r>
+          </w:p>
+        </w:tc>
+      </w:tr>
+      <w:tr>
+        <w:tc>
+          <w:tcPr/>
+          <w:p>
+            <w:pPr>
+              <w:pStyle w:val="Compact"/>
+              <w:jc w:val="left"/>
+            </w:pPr>
+            <w:r>
+              <w:t xml:space="preserve">Número de trabajadores por proyecto</w:t>
+            </w:r>
+          </w:p>
+        </w:tc>
+        <w:tc>
+          <w:tcPr/>
+          <w:p>
+            <w:pPr>
+              <w:pStyle w:val="Compact"/>
+              <w:jc w:val="left"/>
+            </w:pPr>
+            <w:r>
+              <w:t xml:space="preserve">Personal</w:t>
+            </w:r>
+          </w:p>
+        </w:tc>
+      </w:tr>
+      <w:tr>
+        <w:tc>
+          <w:tcPr/>
+          <w:p>
+            <w:pPr>
+              <w:pStyle w:val="Compact"/>
+              <w:jc w:val="left"/>
+            </w:pPr>
+            <w:r>
+              <w:t xml:space="preserve">Utilización de personal</w:t>
+            </w:r>
+          </w:p>
+        </w:tc>
+        <w:tc>
+          <w:tcPr/>
+          <w:p>
+            <w:pPr>
+              <w:pStyle w:val="Compact"/>
+              <w:jc w:val="left"/>
+            </w:pPr>
+            <w:r>
+              <w:t xml:space="preserve">Personal</w:t>
+            </w:r>
+          </w:p>
+        </w:tc>
+      </w:tr>
+      <w:tr>
+        <w:tc>
+          <w:tcPr/>
+          <w:p>
+            <w:pPr>
+              <w:pStyle w:val="Compact"/>
+              <w:jc w:val="left"/>
+            </w:pPr>
+            <w:r>
+              <w:t xml:space="preserve">Incidencias por proyecto</w:t>
+            </w:r>
+          </w:p>
+        </w:tc>
+        <w:tc>
+          <w:tcPr/>
+          <w:p>
+            <w:pPr>
+              <w:pStyle w:val="Compact"/>
+              <w:jc w:val="left"/>
+            </w:pPr>
+            <w:r>
+              <w:t xml:space="preserve">Seguimiento</w:t>
+            </w:r>
+          </w:p>
+        </w:tc>
+      </w:tr>
+    </w:tbl>
+    <w:bookmarkEnd w:id="44"/>
+    <w:bookmarkEnd w:id="45"/>
+    <w:bookmarkStart w:id="50" w:name="modelado-de-los-casos-de-uso"/>
     <w:p>
       <w:pPr>
         <w:pStyle w:val="Heading3"/>
@@ -8412,7 +9133,7 @@
         <w:t xml:space="preserve">mismo identificador (CU-nn ↔ HU-nn), agrupados en 12 épicas.</w:t>
       </w:r>
     </w:p>
-    <w:bookmarkStart w:id="44" w:name="X08ad13bb9dfeaf0c7ca9ad903d0603a5e2408fc"/>
+    <w:bookmarkStart w:id="46" w:name="X08ad13bb9dfeaf0c7ca9ad903d0603a5e2408fc"/>
     <w:p>
       <w:pPr>
         <w:pStyle w:val="Heading4"/>
@@ -8441,8 +9162,8 @@
         <w:t xml:space="preserve">caso de uso, se presentan en el anexo correspondiente.</w:t>
       </w:r>
     </w:p>
-    <w:bookmarkEnd w:id="44"/>
-    <w:bookmarkStart w:id="45" w:name="diagrama-de-casos-de-uso-extendido"/>
+    <w:bookmarkEnd w:id="46"/>
+    <w:bookmarkStart w:id="47" w:name="diagrama-de-casos-de-uso-extendido"/>
     <w:p>
       <w:pPr>
         <w:pStyle w:val="Heading4"/>
@@ -8525,8 +9246,8 @@
         <w:t xml:space="preserve">proyecto) emplea cinco relaciones de este tipo.</w:t>
       </w:r>
     </w:p>
-    <w:bookmarkEnd w:id="45"/>
-    <w:bookmarkStart w:id="46" w:name="Xac2b9e8b33a280b408a38b574e48d7eab07db50"/>
+    <w:bookmarkEnd w:id="47"/>
+    <w:bookmarkStart w:id="48" w:name="Xac2b9e8b33a280b408a38b574e48d7eab07db50"/>
     <w:p>
       <w:pPr>
         <w:pStyle w:val="Heading4"/>
@@ -10565,8 +11286,8 @@
         <w:t xml:space="preserve">aplica filtros (proyecto, periodo, material) y exporta el resultado a PDF o Excel.</w:t>
       </w:r>
     </w:p>
-    <w:bookmarkEnd w:id="46"/>
-    <w:bookmarkStart w:id="47" w:name="anexos-del-modelo-de-requerimientos"/>
+    <w:bookmarkEnd w:id="48"/>
+    <w:bookmarkStart w:id="49" w:name="anexos-del-modelo-de-requerimientos"/>
     <w:p>
       <w:pPr>
         <w:pStyle w:val="Heading4"/>
@@ -10728,10 +11449,10 @@
         </w:pict>
       </w:r>
     </w:p>
-    <w:bookmarkEnd w:id="47"/>
-    <w:bookmarkEnd w:id="48"/>
     <w:bookmarkEnd w:id="49"/>
-    <w:bookmarkStart w:id="54" w:name="modelo-de-datos"/>
+    <w:bookmarkEnd w:id="50"/>
+    <w:bookmarkEnd w:id="51"/>
+    <w:bookmarkStart w:id="56" w:name="modelo-de-datos"/>
     <w:p>
       <w:pPr>
         <w:pStyle w:val="Heading2"/>
@@ -10740,7 +11461,7 @@
         <w:t xml:space="preserve">6. MODELO DE DATOS</w:t>
       </w:r>
     </w:p>
-    <w:bookmarkStart w:id="50" w:name="base-de-datos-normalizada"/>
+    <w:bookmarkStart w:id="52" w:name="base-de-datos-normalizada"/>
     <w:p>
       <w:pPr>
         <w:pStyle w:val="Heading3"/>
@@ -11777,8 +12498,8 @@
         <w:t xml:space="preserve">propio.</w:t>
       </w:r>
     </w:p>
-    <w:bookmarkEnd w:id="50"/>
-    <w:bookmarkStart w:id="51" w:name="modelo-entidad-relación"/>
+    <w:bookmarkEnd w:id="52"/>
+    <w:bookmarkStart w:id="53" w:name="modelo-entidad-relación"/>
     <w:p>
       <w:pPr>
         <w:pStyle w:val="Heading3"/>
@@ -11812,8 +12533,8 @@
         <w:t xml:space="preserve">[PENDIENTE: diagrama entidad-relación]</w:t>
       </w:r>
     </w:p>
-    <w:bookmarkEnd w:id="51"/>
-    <w:bookmarkStart w:id="52" w:name="diagrama-de-clases-de-la-aplicación"/>
+    <w:bookmarkEnd w:id="53"/>
+    <w:bookmarkStart w:id="54" w:name="diagrama-de-clases-de-la-aplicación"/>
     <w:p>
       <w:pPr>
         <w:pStyle w:val="Heading3"/>
@@ -11847,8 +12568,8 @@
         <w:t xml:space="preserve">[PENDIENTE: diagrama de clases]</w:t>
       </w:r>
     </w:p>
-    <w:bookmarkEnd w:id="52"/>
-    <w:bookmarkStart w:id="53" w:name="arquitectura-de-software"/>
+    <w:bookmarkEnd w:id="54"/>
+    <w:bookmarkStart w:id="55" w:name="arquitectura-de-software"/>
     <w:p>
       <w:pPr>
         <w:pStyle w:val="Heading3"/>
@@ -11931,9 +12652,9 @@
         </w:pict>
       </w:r>
     </w:p>
-    <w:bookmarkEnd w:id="53"/>
-    <w:bookmarkEnd w:id="54"/>
-    <w:bookmarkStart w:id="55" w:name="anexos"/>
+    <w:bookmarkEnd w:id="55"/>
+    <w:bookmarkEnd w:id="56"/>
+    <w:bookmarkStart w:id="57" w:name="anexos"/>
     <w:p>
       <w:pPr>
         <w:pStyle w:val="Heading2"/>
@@ -12018,8 +12739,8 @@
         </w:pict>
       </w:r>
     </w:p>
-    <w:bookmarkEnd w:id="55"/>
-    <w:bookmarkStart w:id="56" w:name="cronograma-de-actividades"/>
+    <w:bookmarkEnd w:id="57"/>
+    <w:bookmarkStart w:id="58" w:name="cronograma-de-actividades"/>
     <w:p>
       <w:pPr>
         <w:pStyle w:val="Heading2"/>
@@ -12396,8 +13117,8 @@
         </w:pict>
       </w:r>
     </w:p>
-    <w:bookmarkEnd w:id="56"/>
-    <w:bookmarkStart w:id="57" w:name="referencias"/>
+    <w:bookmarkEnd w:id="58"/>
+    <w:bookmarkStart w:id="59" w:name="referencias"/>
     <w:p>
       <w:pPr>
         <w:pStyle w:val="Heading2"/>
@@ -12649,8 +13370,8 @@
         </w:pict>
       </w:r>
     </w:p>
-    <w:bookmarkEnd w:id="57"/>
-    <w:bookmarkEnd w:id="58"/>
+    <w:bookmarkEnd w:id="59"/>
+    <w:bookmarkEnd w:id="60"/>
     <w:sectPr/>
   </w:body>
 </w:document>

</xml_diff>